<commit_message>
docs(docx): add native styled Word tables and embedded 300-DPI publication plots
- Implemented scripts/compile_publication_docx.py
- Generates professional native Word tables (custom header background, cell padding, zebra stripes)
- Embeds 4 publication-grade 300-DPI figures directly in docs/research_paper_ieee.docx
- Synchronized updated documents to Windows Desktop
</commit_message>
<xml_diff>
--- a/docs/comparative_literature_study.docx
+++ b/docs/comparative_literature_study.docx
@@ -10,799 +10,1362 @@
         <w:rPr>
           <w:rFonts w:ascii="Times New Roman" w:hAnsi="Times New Roman"/>
           <w:b/>
-          <w:sz w:val="36"/>
+          <w:color w:val="1F497D"/>
+          <w:sz w:val="32"/>
         </w:rPr>
         <w:t>Comparative Literature Study: LLM Decision-Making, Move Legality, and Constrained Generation in Formal Rule-Bound Domains</w:t>
       </w:r>
     </w:p>
     <w:p>
+      <w:pPr>
+        <w:jc w:val="center"/>
+      </w:pPr>
       <w:r>
         <w:rPr>
           <w:rFonts w:ascii="Times New Roman" w:hAnsi="Times New Roman"/>
+          <w:i/>
           <w:sz w:val="20"/>
         </w:rPr>
-        <w:t>**Author:** Arpit Panigrahi</w:t>
+        <w:t>Arpit Panigrahi</w:t>
+        <w:br/>
+        <w:t>School of Computer Science and Engineering</w:t>
+        <w:br/>
+        <w:t>Vellore Institute of Technology (VIT), Chennai, Tamil Nadu, India</w:t>
+        <w:br/>
+        <w:t>Email: arpitpanigrahi06@gmail.com</w:t>
       </w:r>
     </w:p>
     <w:p>
-      <w:r>
-        <w:rPr>
-          <w:rFonts w:ascii="Times New Roman" w:hAnsi="Times New Roman"/>
-          <w:sz w:val="20"/>
-        </w:rPr>
-        <w:t>**Affiliation:** School of Computer Science and Engineering, Vellore Institute of Technology (VIT), Chennai, Tamil Nadu, India</w:t>
-      </w:r>
-    </w:p>
-    <w:p>
-      <w:r>
-        <w:rPr>
-          <w:rFonts w:ascii="Times New Roman" w:hAnsi="Times New Roman"/>
-          <w:sz w:val="20"/>
-        </w:rPr>
-        <w:t>**Target Submission:** IEEE Transactions on Games / IEEE Conference on Games (CoG) / arXiv Repository</w:t>
-      </w:r>
-    </w:p>
-    <w:p>
+      <w:pPr>
+        <w:spacing w:before="280" w:after="80"/>
+      </w:pPr>
       <w:r>
         <w:rPr>
           <w:rFonts w:ascii="Times New Roman" w:hAnsi="Times New Roman"/>
           <w:b/>
+          <w:color w:val="1F497D"/>
           <w:sz w:val="26"/>
         </w:rPr>
         <w:t>Executive Abstract</w:t>
       </w:r>
     </w:p>
     <w:p>
-      <w:r>
-        <w:rPr>
-          <w:rFonts w:ascii="Times New Roman" w:hAnsi="Times New Roman"/>
-          <w:sz w:val="20"/>
-        </w:rPr>
-        <w:t>The application of autoregressive Large Language Models (LLMs) to formal, rule-governed games has emerged as a premier benchmark for evaluating artificial reasoning, state tracking, and hallucination suppression. While classical game-playing systems rely on symbolic alpha-beta tree search or deep reinforcement learning value networks, general-purpose LLMs attempt to predict game transitions via tokenized textual representations.</w:t>
-      </w:r>
-    </w:p>
-    <w:p>
-      <w:r>
-        <w:rPr>
-          <w:rFonts w:ascii="Times New Roman" w:hAnsi="Times New Roman"/>
-          <w:sz w:val="20"/>
-        </w:rPr>
-        <w:t>This comparative study presents a systematic literature survey benchmarking our proposed **Prompt-Level Constrained Decoding &amp; Dynamic Move Compression (DMC)** framework against seminal works in the field, including:</w:t>
-      </w:r>
-    </w:p>
-    <w:p>
-      <w:r>
-        <w:rPr>
-          <w:rFonts w:ascii="Times New Roman" w:hAnsi="Times New Roman"/>
-          <w:sz w:val="20"/>
-        </w:rPr>
-        <w:t>1. **Google DeepMind's Transformer Policy Networks** (*Ruoss et al., 2024 / NeurIPS 2024*),</w:t>
-      </w:r>
-    </w:p>
-    <w:p>
-      <w:r>
-        <w:rPr>
-          <w:rFonts w:ascii="Times New Roman" w:hAnsi="Times New Roman"/>
-          <w:sz w:val="20"/>
-        </w:rPr>
-        <w:t>2. **ChessGPT Domain Pre-Training** (*Feng et al., 2023*),</w:t>
-      </w:r>
-    </w:p>
-    <w:p>
-      <w:r>
-        <w:rPr>
-          <w:rFonts w:ascii="Times New Roman" w:hAnsi="Times New Roman"/>
-          <w:sz w:val="20"/>
-        </w:rPr>
-        <w:t>3. **Emergent World Representation Probing** (*Li et al., ICLR 2023; Toshniwal et al., 2022*),</w:t>
-      </w:r>
-    </w:p>
-    <w:p>
-      <w:r>
-        <w:rPr>
-          <w:rFonts w:ascii="Times New Roman" w:hAnsi="Times New Roman"/>
-          <w:sz w:val="20"/>
-        </w:rPr>
-        <w:t>4. **Agentic LLM Chess Benchmarks** (*Saplin et al., 2024; NeurIPS 2025 FoRLM*),</w:t>
-      </w:r>
-    </w:p>
-    <w:p>
-      <w:r>
-        <w:rPr>
-          <w:rFonts w:ascii="Times New Roman" w:hAnsi="Times New Roman"/>
-          <w:sz w:val="20"/>
-        </w:rPr>
-        <w:t>5. **Constrained-Index Move Selection Protocols** (*Banjade, 2026*),</w:t>
-      </w:r>
-    </w:p>
-    <w:p>
-      <w:r>
-        <w:rPr>
-          <w:rFonts w:ascii="Times New Roman" w:hAnsi="Times New Roman"/>
-          <w:sz w:val="20"/>
-        </w:rPr>
-        <w:t>6. **Grammar-Guided Constrained Decoding Engines** (*SynCode, Ugur et al., 2024; Outlines, Willard &amp; Louf, 2023*).</w:t>
-      </w:r>
-    </w:p>
-    <w:p>
-      <w:r>
-        <w:rPr>
-          <w:rFonts w:ascii="Times New Roman" w:hAnsi="Times New Roman"/>
-          <w:sz w:val="20"/>
-        </w:rPr>
-        <w:t>We analyze empirical discrepancies in **legal move adherence**, **Byte-Pair Encoding (BPE) subword boundary effects**, **Stockfish Centipawn Loss (ACPL)**, and **hardware latency profiles**, positioning our zero-shot prompt-level architecture within the broader academic landscape.</w:t>
-      </w:r>
-    </w:p>
-    <w:p>
-      <w:r>
-        <w:rPr>
-          <w:rFonts w:ascii="Times New Roman" w:hAnsi="Times New Roman"/>
-          <w:b/>
-          <w:sz w:val="26"/>
-        </w:rPr>
-        <w:t>I. Taxonomy of Existing Literature</w:t>
-      </w:r>
-    </w:p>
-    <w:p>
-      <w:r>
-        <w:rPr>
-          <w:rFonts w:ascii="Times New Roman" w:hAnsi="Times New Roman"/>
-          <w:sz w:val="20"/>
-        </w:rPr>
-        <w:t>Research investigating LLMs in chess and formal board games spans three fundamental paradigms:</w:t>
-      </w:r>
-    </w:p>
-    <w:p>
-      <w:r>
-        <w:rPr>
-          <w:rFonts w:ascii="Times New Roman" w:hAnsi="Times New Roman"/>
-          <w:sz w:val="20"/>
-        </w:rPr>
-        <w:t>┌─────────────────────────────────────────────────────────┐</w:t>
-      </w:r>
-    </w:p>
-    <w:p>
-      <w:r>
-        <w:rPr>
-          <w:rFonts w:ascii="Times New Roman" w:hAnsi="Times New Roman"/>
-          <w:sz w:val="20"/>
-        </w:rPr>
-        <w:t>│           LLM REASONING IN FORMAL DOMAINS               │</w:t>
-      </w:r>
-    </w:p>
-    <w:p>
-      <w:r>
-        <w:rPr>
-          <w:rFonts w:ascii="Times New Roman" w:hAnsi="Times New Roman"/>
-          <w:sz w:val="20"/>
-        </w:rPr>
-        <w:t>└────────────────────────────┬────────────────────────────┘</w:t>
-      </w:r>
-    </w:p>
-    <w:p>
-      <w:r>
-        <w:rPr>
-          <w:rFonts w:ascii="Times New Roman" w:hAnsi="Times New Roman"/>
-          <w:sz w:val="20"/>
-        </w:rPr>
-        <w:t>│</w:t>
-      </w:r>
-    </w:p>
-    <w:p>
-      <w:r>
-        <w:rPr>
-          <w:rFonts w:ascii="Times New Roman" w:hAnsi="Times New Roman"/>
-          <w:sz w:val="20"/>
-        </w:rPr>
-        <w:t>┌─────────────────────────────────────────────────────┼─────────────────────────────────────────────────────┐</w:t>
-      </w:r>
-    </w:p>
-    <w:p>
-      <w:r>
-        <w:rPr>
-          <w:rFonts w:ascii="Times New Roman" w:hAnsi="Times New Roman"/>
-          <w:sz w:val="20"/>
-        </w:rPr>
-        <w:t>▼                                                     ▼                                                     ▼</w:t>
-      </w:r>
-    </w:p>
-    <w:p>
-      <w:r>
-        <w:rPr>
-          <w:rFonts w:ascii="Times New Roman" w:hAnsi="Times New Roman"/>
-          <w:sz w:val="20"/>
-        </w:rPr>
-        <w:t>┌───────────────────────────────────┐       ┌───────────────────────────────────┐       ┌───────────────────────────────────┐</w:t>
-      </w:r>
-    </w:p>
-    <w:p>
-      <w:r>
-        <w:rPr>
-          <w:rFonts w:ascii="Times New Roman" w:hAnsi="Times New Roman"/>
-          <w:sz w:val="20"/>
-        </w:rPr>
-        <w:t>│   PARADIGM 1: DOMAIN FINE-TUNING  │       │   PARADIGM 2: UNCONSTRAINED LLMs  │       │   PARADIGM 3: CONSTRAINED DECODING│</w:t>
-      </w:r>
-    </w:p>
-    <w:p>
-      <w:r>
-        <w:rPr>
-          <w:rFonts w:ascii="Times New Roman" w:hAnsi="Times New Roman"/>
-          <w:sz w:val="20"/>
-        </w:rPr>
-        <w:t>├───────────────────────────────────┤       ├───────────────────────────────────┤       ├───────────────────────────────────┤</w:t>
-      </w:r>
-    </w:p>
-    <w:p>
-      <w:r>
-        <w:rPr>
-          <w:rFonts w:ascii="Times New Roman" w:hAnsi="Times New Roman"/>
-          <w:sz w:val="20"/>
-        </w:rPr>
-        <w:t>│ • Ruoss et al. (DeepMind, 2024)   │       │ • Saplin et al. (LLM Chess, 2024) │       │ • Banjade (Constrained-Index,2026)│</w:t>
-      </w:r>
-    </w:p>
-    <w:p>
-      <w:r>
-        <w:rPr>
-          <w:rFonts w:ascii="Times New Roman" w:hAnsi="Times New Roman"/>
-          <w:sz w:val="20"/>
-        </w:rPr>
-        <w:t>│ • Feng et al. (ChessGPT, 2023)    │       │ • Stockl (2021) / Carlini (2023)  │       │ • Outlines / SynCode (2023-2024)  │</w:t>
-      </w:r>
-    </w:p>
-    <w:p>
-      <w:r>
-        <w:rPr>
-          <w:rFonts w:ascii="Times New Roman" w:hAnsi="Times New Roman"/>
-          <w:sz w:val="20"/>
-        </w:rPr>
-        <w:t>│ • Toshniwal et al. (2022)         │       │ • Karvonen / Li et al. (ICLR 2023)│       │ • Proposed Prompt-Level DMC (Ours)│</w:t>
-      </w:r>
-    </w:p>
-    <w:p>
-      <w:r>
-        <w:rPr>
-          <w:rFonts w:ascii="Times New Roman" w:hAnsi="Times New Roman"/>
-          <w:sz w:val="20"/>
-        </w:rPr>
-        <w:t>│ • Policy distillation on PGN data │       │ • Free-form PGN/UCI generation    │       │ • Externalized candidate injection│</w:t>
-      </w:r>
-    </w:p>
-    <w:p>
-      <w:r>
-        <w:rPr>
-          <w:rFonts w:ascii="Times New Roman" w:hAnsi="Times New Roman"/>
-          <w:sz w:val="20"/>
-        </w:rPr>
-        <w:t>│ • 10M+ games required             │       │ • 40%–60% legality ceiling        │       │ • 100% legal, zero fine-tuning    │</w:t>
-      </w:r>
-    </w:p>
-    <w:p>
-      <w:r>
-        <w:rPr>
-          <w:rFonts w:ascii="Times New Roman" w:hAnsi="Times New Roman"/>
-          <w:sz w:val="20"/>
-        </w:rPr>
-        <w:t>└───────────────────────────────────┘       └───────────────────────────────────┘       └───────────────────────────────────┘</w:t>
-      </w:r>
-    </w:p>
-    <w:p>
-      <w:r>
-        <w:rPr>
-          <w:rFonts w:ascii="Times New Roman" w:hAnsi="Times New Roman"/>
-          <w:b/>
-          <w:sz w:val="26"/>
-        </w:rPr>
-        <w:t>II. Comprehensive Comparative Matrix</w:t>
-      </w:r>
-    </w:p>
-    <w:p>
-      <w:r>
-        <w:rPr>
-          <w:rFonts w:ascii="Times New Roman" w:hAnsi="Times New Roman"/>
-          <w:sz w:val="20"/>
-        </w:rPr>
-        <w:t>The following master matrix contrasts our framework against representative state-of-the-art literature across eight core dimensions:</w:t>
-      </w:r>
-    </w:p>
-    <w:p>
-      <w:r>
-        <w:rPr>
-          <w:rFonts w:ascii="Times New Roman" w:hAnsi="Times New Roman"/>
-          <w:sz w:val="20"/>
-        </w:rPr>
-        <w:t>| Dimension / Capability | **DeepMind (Ruoss et al., 2024)** | **ChessGPT (Feng et al., 2023)** | **LLM Chess Benchmark (Saplin, 2024)** | **Constrained-Index (Banjade, 2026)** | **Proposed Architecture (This Work)** |</w:t>
-      </w:r>
-    </w:p>
-    <w:p>
-      <w:r>
-        <w:rPr>
-          <w:rFonts w:ascii="Times New Roman" w:hAnsi="Times New Roman"/>
-          <w:sz w:val="20"/>
-        </w:rPr>
-        <w:t>| :--- | :--- | :--- | :--- | :--- | :--- |</w:t>
-      </w:r>
-    </w:p>
-    <w:p>
-      <w:r>
-        <w:rPr>
-          <w:rFonts w:ascii="Times New Roman" w:hAnsi="Times New Roman"/>
-          <w:sz w:val="20"/>
-        </w:rPr>
-        <w:t>| **Model Category** | Domain-Specific Transformer ($270\text{M}$) | Hybrid Policy-LLM ($3\text{B}\text{–}7\text{B}$) | General LLMs (GPT-4, Claude, Llama 3) | Open Weights ($8\text{B}\text{–}70\text{B}$) | Zero-Shot Llama 3.1 ($8\text{B}$) |</w:t>
-      </w:r>
-    </w:p>
-    <w:p>
-      <w:r>
-        <w:rPr>
-          <w:rFonts w:ascii="Times New Roman" w:hAnsi="Times New Roman"/>
-          <w:sz w:val="20"/>
-        </w:rPr>
-        <w:t>| **Training Requirement** | Supervised on $10\text{M}$ games ($1.5\text{B}$ states) | Domain pre-training on PGN + Text | None (API-based zero-shot) | None (Prompt-based) | **None (Zero Fine-Tuning Required)** |</w:t>
-      </w:r>
-    </w:p>
-    <w:p>
-      <w:r>
-        <w:rPr>
-          <w:rFonts w:ascii="Times New Roman" w:hAnsi="Times New Roman"/>
-          <w:sz w:val="20"/>
-        </w:rPr>
-        <w:t>| **Move Legality Rate** | $&gt;99.9\%$ (Trained Action Space) | $85.0\% \text{–} 92.0\%$ | $49.0\% \text{–} 62.0\%$ (Catastrophic) | $94.1\% \text{–} 98.2\%$ (Fallback rate $5.9\%$) | **$100.00\%$ (Deterministic)** |</w:t>
-      </w:r>
-    </w:p>
-    <w:p>
-      <w:r>
-        <w:rPr>
-          <w:rFonts w:ascii="Times New Roman" w:hAnsi="Times New Roman"/>
-          <w:sz w:val="20"/>
-        </w:rPr>
-        <w:t>| **BPE Subword Isolation** | Custom discrete move tokens | Standard sentence tokenizer | Not addressed (Frequent merges) | Numerical indices ($0\dots N$) | **Quote-Delimited Atomic Attention Barriers** |</w:t>
-      </w:r>
-    </w:p>
-    <w:p>
-      <w:r>
-        <w:rPr>
-          <w:rFonts w:ascii="Times New Roman" w:hAnsi="Times New Roman"/>
-          <w:sz w:val="20"/>
-        </w:rPr>
-        <w:t>| **Strategic Quality** | Grandmaster Elo $2895$ (Lichess Blitz) | Elo $\approx 1500 \text{–} 1800$ | Elo $&lt;1200$ (Frequent aborts) | Relative win-rates reported | **$\text{ACPL} \approx 55.8\text{–}67.0\text{ cp}$ (Club Level)** |</w:t>
-      </w:r>
-    </w:p>
-    <w:p>
-      <w:r>
-        <w:rPr>
-          <w:rFonts w:ascii="Times New Roman" w:hAnsi="Times New Roman"/>
-          <w:sz w:val="20"/>
-        </w:rPr>
-        <w:t>| **Survivorship Bias Audit**| N/A (Games evaluated to end) | Not analyzed | Confounded by early game aborts | Confounded by invalid selections | **Explicitly Diagnosed &amp; Documented** |</w:t>
-      </w:r>
-    </w:p>
-    <w:p>
-      <w:r>
-        <w:rPr>
-          <w:rFonts w:ascii="Times New Roman" w:hAnsi="Times New Roman"/>
-          <w:sz w:val="20"/>
-        </w:rPr>
-        <w:t>| **Inference Hardware** | High-end GPU Clusters | Multi-GPU / TPU Pods | Cloud API Endpoints | Cloud GPU Servers | **Commodity CPU &amp; Edge Hardware** |</w:t>
-      </w:r>
-    </w:p>
-    <w:p>
-      <w:r>
-        <w:rPr>
-          <w:rFonts w:ascii="Times New Roman" w:hAnsi="Times New Roman"/>
-          <w:sz w:val="20"/>
-        </w:rPr>
-        <w:t>| **Latency Profiling** | $O(1)$ Feedforward ($\approx 15\text{ms}$) | Not profiled on CPU | Network round-trip dominated | Not decomposed | **Decomposed: $18\text{s}$ Cold vs $792\text{ms}$ Warm** |</w:t>
-      </w:r>
-    </w:p>
-    <w:p>
-      <w:r>
-        <w:rPr>
-          <w:rFonts w:ascii="Times New Roman" w:hAnsi="Times New Roman"/>
-          <w:b/>
-          <w:sz w:val="26"/>
-        </w:rPr>
-        <w:t>III. Deep-Dive Dimension-by-Dimension Analysis</w:t>
-      </w:r>
-    </w:p>
-    <w:p>
-      <w:r>
-        <w:rPr>
-          <w:rFonts w:ascii="Times New Roman" w:hAnsi="Times New Roman"/>
-          <w:b/>
-          <w:sz w:val="22"/>
-        </w:rPr>
-        <w:t>1. Move Legality &amp; The Hallucination Problem</w:t>
-      </w:r>
-    </w:p>
-    <w:p>
       <w:pPr>
-        <w:pStyle w:val="ListBullet"/>
+        <w:spacing w:after="80" w:line="276" w:lineRule="auto"/>
       </w:pPr>
       <w:r>
         <w:rPr>
           <w:rFonts w:ascii="Times New Roman" w:hAnsi="Times New Roman"/>
           <w:sz w:val="20"/>
         </w:rPr>
-        <w:t>**Literature Consensus:** General-purpose autoregressive models (GPT-3.5, GPT-4, Llama 2, Llama 3) evaluated in free-form generation hit an impenetrable legality ceiling between $49.0\%$ and $62.0\%$ (*Stockl, 2021; Saplin, 2024*). Without external constraints, $100\%$ of unconstrained games abort within 1 to 3 turns due to physical rule violations (e.g. bishops moving through pawns).</w:t>
+        <w:t>This comparative study presents a systematic literature survey benchmarking our proposed Prompt-Level Constrained Decoding &amp; Dynamic Move Compression (DMC) framework against seminal works in the field: Google DeepMind (Ruoss et al., NeurIPS 2024), ChessGPT (Feng et al., 2023), Emergent World Models (Li et al., ICLR 2023), and Constrained-Index protocols (Banjade, 2026).</w:t>
+      </w:r>
+    </w:p>
+    <w:p>
+      <w:pPr>
+        <w:spacing w:before="280" w:after="80"/>
+      </w:pPr>
+      <w:r>
+        <w:rPr>
+          <w:rFonts w:ascii="Times New Roman" w:hAnsi="Times New Roman"/>
+          <w:b/>
+          <w:color w:val="1F497D"/>
+          <w:sz w:val="26"/>
+        </w:rPr>
+        <w:t>Master Comparative Literature Matrix</w:t>
+      </w:r>
+    </w:p>
+    <w:tbl>
+      <w:tblPr>
+        <w:tblW w:type="auto" w:w="0"/>
+        <w:jc w:val="center"/>
+        <w:tblLook w:firstColumn="1" w:firstRow="1" w:lastColumn="0" w:lastRow="0" w:noHBand="0" w:noVBand="1" w:val="04A0"/>
+      </w:tblPr>
+      <w:tblGrid>
+        <w:gridCol w:w="1560"/>
+        <w:gridCol w:w="1560"/>
+        <w:gridCol w:w="1560"/>
+        <w:gridCol w:w="1560"/>
+        <w:gridCol w:w="1560"/>
+        <w:gridCol w:w="1560"/>
+      </w:tblGrid>
+      <w:tr>
+        <w:tc>
+          <w:tcPr>
+            <w:tcW w:type="dxa" w:w="1560"/>
+            <w:vAlign w:val="center"/>
+            <w:shd w:fill="1F497D"/>
+            <w:tcMar>
+              <w:top w:w="140" w:type="dxa"/>
+              <w:bottom w:w="140" w:type="dxa"/>
+              <w:left w:w="180" w:type="dxa"/>
+              <w:right w:w="180" w:type="dxa"/>
+            </w:tcMar>
+          </w:tcPr>
+          <w:p>
+            <w:pPr>
+              <w:jc w:val="center"/>
+            </w:pPr>
+            <w:r>
+              <w:rPr>
+                <w:rFonts w:ascii="Times New Roman" w:hAnsi="Times New Roman"/>
+                <w:b/>
+                <w:color w:val="FFFFFF"/>
+                <w:sz w:val="19"/>
+              </w:rPr>
+              <w:t>Dimension</w:t>
+            </w:r>
+          </w:p>
+        </w:tc>
+        <w:tc>
+          <w:tcPr>
+            <w:tcW w:type="dxa" w:w="1560"/>
+            <w:vAlign w:val="center"/>
+            <w:shd w:fill="1F497D"/>
+            <w:tcMar>
+              <w:top w:w="140" w:type="dxa"/>
+              <w:bottom w:w="140" w:type="dxa"/>
+              <w:left w:w="180" w:type="dxa"/>
+              <w:right w:w="180" w:type="dxa"/>
+            </w:tcMar>
+          </w:tcPr>
+          <w:p>
+            <w:pPr>
+              <w:jc w:val="center"/>
+            </w:pPr>
+            <w:r>
+              <w:rPr>
+                <w:rFonts w:ascii="Times New Roman" w:hAnsi="Times New Roman"/>
+                <w:b/>
+                <w:color w:val="FFFFFF"/>
+                <w:sz w:val="19"/>
+              </w:rPr>
+              <w:t>DeepMind (Ruoss, 2024)</w:t>
+            </w:r>
+          </w:p>
+        </w:tc>
+        <w:tc>
+          <w:tcPr>
+            <w:tcW w:type="dxa" w:w="1560"/>
+            <w:vAlign w:val="center"/>
+            <w:shd w:fill="1F497D"/>
+            <w:tcMar>
+              <w:top w:w="140" w:type="dxa"/>
+              <w:bottom w:w="140" w:type="dxa"/>
+              <w:left w:w="180" w:type="dxa"/>
+              <w:right w:w="180" w:type="dxa"/>
+            </w:tcMar>
+          </w:tcPr>
+          <w:p>
+            <w:pPr>
+              <w:jc w:val="center"/>
+            </w:pPr>
+            <w:r>
+              <w:rPr>
+                <w:rFonts w:ascii="Times New Roman" w:hAnsi="Times New Roman"/>
+                <w:b/>
+                <w:color w:val="FFFFFF"/>
+                <w:sz w:val="19"/>
+              </w:rPr>
+              <w:t>ChessGPT (Feng, 2023)</w:t>
+            </w:r>
+          </w:p>
+        </w:tc>
+        <w:tc>
+          <w:tcPr>
+            <w:tcW w:type="dxa" w:w="1560"/>
+            <w:vAlign w:val="center"/>
+            <w:shd w:fill="1F497D"/>
+            <w:tcMar>
+              <w:top w:w="140" w:type="dxa"/>
+              <w:bottom w:w="140" w:type="dxa"/>
+              <w:left w:w="180" w:type="dxa"/>
+              <w:right w:w="180" w:type="dxa"/>
+            </w:tcMar>
+          </w:tcPr>
+          <w:p>
+            <w:pPr>
+              <w:jc w:val="center"/>
+            </w:pPr>
+            <w:r>
+              <w:rPr>
+                <w:rFonts w:ascii="Times New Roman" w:hAnsi="Times New Roman"/>
+                <w:b/>
+                <w:color w:val="FFFFFF"/>
+                <w:sz w:val="19"/>
+              </w:rPr>
+              <w:t>LLM Chess (Saplin, 2024)</w:t>
+            </w:r>
+          </w:p>
+        </w:tc>
+        <w:tc>
+          <w:tcPr>
+            <w:tcW w:type="dxa" w:w="1560"/>
+            <w:vAlign w:val="center"/>
+            <w:shd w:fill="1F497D"/>
+            <w:tcMar>
+              <w:top w:w="140" w:type="dxa"/>
+              <w:bottom w:w="140" w:type="dxa"/>
+              <w:left w:w="180" w:type="dxa"/>
+              <w:right w:w="180" w:type="dxa"/>
+            </w:tcMar>
+          </w:tcPr>
+          <w:p>
+            <w:pPr>
+              <w:jc w:val="center"/>
+            </w:pPr>
+            <w:r>
+              <w:rPr>
+                <w:rFonts w:ascii="Times New Roman" w:hAnsi="Times New Roman"/>
+                <w:b/>
+                <w:color w:val="FFFFFF"/>
+                <w:sz w:val="19"/>
+              </w:rPr>
+              <w:t>Constrained-Index (Banjade, 2026)</w:t>
+            </w:r>
+          </w:p>
+        </w:tc>
+        <w:tc>
+          <w:tcPr>
+            <w:tcW w:type="dxa" w:w="1560"/>
+            <w:vAlign w:val="center"/>
+            <w:shd w:fill="1F497D"/>
+            <w:tcMar>
+              <w:top w:w="140" w:type="dxa"/>
+              <w:bottom w:w="140" w:type="dxa"/>
+              <w:left w:w="180" w:type="dxa"/>
+              <w:right w:w="180" w:type="dxa"/>
+            </w:tcMar>
+          </w:tcPr>
+          <w:p>
+            <w:pPr>
+              <w:jc w:val="center"/>
+            </w:pPr>
+            <w:r>
+              <w:rPr>
+                <w:rFonts w:ascii="Times New Roman" w:hAnsi="Times New Roman"/>
+                <w:b/>
+                <w:color w:val="FFFFFF"/>
+                <w:sz w:val="19"/>
+              </w:rPr>
+              <w:t>Proposed Architecture (Ours)</w:t>
+            </w:r>
+          </w:p>
+        </w:tc>
+      </w:tr>
+      <w:tr>
+        <w:tc>
+          <w:tcPr>
+            <w:tcW w:type="dxa" w:w="1560"/>
+            <w:vAlign w:val="center"/>
+            <w:tcMar>
+              <w:top w:w="100" w:type="dxa"/>
+              <w:bottom w:w="100" w:type="dxa"/>
+              <w:left w:w="140" w:type="dxa"/>
+              <w:right w:w="140" w:type="dxa"/>
+            </w:tcMar>
+          </w:tcPr>
+          <w:p>
+            <w:r>
+              <w:rPr>
+                <w:rFonts w:ascii="Times New Roman" w:hAnsi="Times New Roman"/>
+                <w:sz w:val="18"/>
+              </w:rPr>
+              <w:t>Model Category</w:t>
+            </w:r>
+          </w:p>
+        </w:tc>
+        <w:tc>
+          <w:tcPr>
+            <w:tcW w:type="dxa" w:w="1560"/>
+            <w:vAlign w:val="center"/>
+            <w:tcMar>
+              <w:top w:w="100" w:type="dxa"/>
+              <w:bottom w:w="100" w:type="dxa"/>
+              <w:left w:w="140" w:type="dxa"/>
+              <w:right w:w="140" w:type="dxa"/>
+            </w:tcMar>
+          </w:tcPr>
+          <w:p>
+            <w:r>
+              <w:rPr>
+                <w:rFonts w:ascii="Times New Roman" w:hAnsi="Times New Roman"/>
+                <w:sz w:val="18"/>
+              </w:rPr>
+              <w:t>Domain-Specific Transformer (270M)</w:t>
+            </w:r>
+          </w:p>
+        </w:tc>
+        <w:tc>
+          <w:tcPr>
+            <w:tcW w:type="dxa" w:w="1560"/>
+            <w:vAlign w:val="center"/>
+            <w:tcMar>
+              <w:top w:w="100" w:type="dxa"/>
+              <w:bottom w:w="100" w:type="dxa"/>
+              <w:left w:w="140" w:type="dxa"/>
+              <w:right w:w="140" w:type="dxa"/>
+            </w:tcMar>
+          </w:tcPr>
+          <w:p>
+            <w:r>
+              <w:rPr>
+                <w:rFonts w:ascii="Times New Roman" w:hAnsi="Times New Roman"/>
+                <w:sz w:val="18"/>
+              </w:rPr>
+              <w:t>Hybrid Policy-LLM (3B–7B)</w:t>
+            </w:r>
+          </w:p>
+        </w:tc>
+        <w:tc>
+          <w:tcPr>
+            <w:tcW w:type="dxa" w:w="1560"/>
+            <w:vAlign w:val="center"/>
+            <w:tcMar>
+              <w:top w:w="100" w:type="dxa"/>
+              <w:bottom w:w="100" w:type="dxa"/>
+              <w:left w:w="140" w:type="dxa"/>
+              <w:right w:w="140" w:type="dxa"/>
+            </w:tcMar>
+          </w:tcPr>
+          <w:p>
+            <w:r>
+              <w:rPr>
+                <w:rFonts w:ascii="Times New Roman" w:hAnsi="Times New Roman"/>
+                <w:sz w:val="18"/>
+              </w:rPr>
+              <w:t>General LLMs (GPT-4, Claude)</w:t>
+            </w:r>
+          </w:p>
+        </w:tc>
+        <w:tc>
+          <w:tcPr>
+            <w:tcW w:type="dxa" w:w="1560"/>
+            <w:vAlign w:val="center"/>
+            <w:tcMar>
+              <w:top w:w="100" w:type="dxa"/>
+              <w:bottom w:w="100" w:type="dxa"/>
+              <w:left w:w="140" w:type="dxa"/>
+              <w:right w:w="140" w:type="dxa"/>
+            </w:tcMar>
+          </w:tcPr>
+          <w:p>
+            <w:r>
+              <w:rPr>
+                <w:rFonts w:ascii="Times New Roman" w:hAnsi="Times New Roman"/>
+                <w:sz w:val="18"/>
+              </w:rPr>
+              <w:t>Open Weights (8B–70B)</w:t>
+            </w:r>
+          </w:p>
+        </w:tc>
+        <w:tc>
+          <w:tcPr>
+            <w:tcW w:type="dxa" w:w="1560"/>
+            <w:vAlign w:val="center"/>
+            <w:tcMar>
+              <w:top w:w="100" w:type="dxa"/>
+              <w:bottom w:w="100" w:type="dxa"/>
+              <w:left w:w="140" w:type="dxa"/>
+              <w:right w:w="140" w:type="dxa"/>
+            </w:tcMar>
+          </w:tcPr>
+          <w:p>
+            <w:r>
+              <w:rPr>
+                <w:rFonts w:ascii="Times New Roman" w:hAnsi="Times New Roman"/>
+                <w:sz w:val="18"/>
+              </w:rPr>
+              <w:t>Zero-Shot Llama 3.1 (8B)</w:t>
+            </w:r>
+          </w:p>
+        </w:tc>
+      </w:tr>
+      <w:tr>
+        <w:tc>
+          <w:tcPr>
+            <w:tcW w:type="dxa" w:w="1560"/>
+            <w:vAlign w:val="center"/>
+            <w:shd w:fill="F2F4F7"/>
+            <w:tcMar>
+              <w:top w:w="100" w:type="dxa"/>
+              <w:bottom w:w="100" w:type="dxa"/>
+              <w:left w:w="140" w:type="dxa"/>
+              <w:right w:w="140" w:type="dxa"/>
+            </w:tcMar>
+          </w:tcPr>
+          <w:p>
+            <w:r>
+              <w:rPr>
+                <w:rFonts w:ascii="Times New Roman" w:hAnsi="Times New Roman"/>
+                <w:sz w:val="18"/>
+              </w:rPr>
+              <w:t>Training Required</w:t>
+            </w:r>
+          </w:p>
+        </w:tc>
+        <w:tc>
+          <w:tcPr>
+            <w:tcW w:type="dxa" w:w="1560"/>
+            <w:vAlign w:val="center"/>
+            <w:shd w:fill="F2F4F7"/>
+            <w:tcMar>
+              <w:top w:w="100" w:type="dxa"/>
+              <w:bottom w:w="100" w:type="dxa"/>
+              <w:left w:w="140" w:type="dxa"/>
+              <w:right w:w="140" w:type="dxa"/>
+            </w:tcMar>
+          </w:tcPr>
+          <w:p>
+            <w:r>
+              <w:rPr>
+                <w:rFonts w:ascii="Times New Roman" w:hAnsi="Times New Roman"/>
+                <w:sz w:val="18"/>
+              </w:rPr>
+              <w:t>10M games (1.5B positions)</w:t>
+            </w:r>
+          </w:p>
+        </w:tc>
+        <w:tc>
+          <w:tcPr>
+            <w:tcW w:type="dxa" w:w="1560"/>
+            <w:vAlign w:val="center"/>
+            <w:shd w:fill="F2F4F7"/>
+            <w:tcMar>
+              <w:top w:w="100" w:type="dxa"/>
+              <w:bottom w:w="100" w:type="dxa"/>
+              <w:left w:w="140" w:type="dxa"/>
+              <w:right w:w="140" w:type="dxa"/>
+            </w:tcMar>
+          </w:tcPr>
+          <w:p>
+            <w:r>
+              <w:rPr>
+                <w:rFonts w:ascii="Times New Roman" w:hAnsi="Times New Roman"/>
+                <w:sz w:val="18"/>
+              </w:rPr>
+              <w:t>Domain pre-training PGN+Text</w:t>
+            </w:r>
+          </w:p>
+        </w:tc>
+        <w:tc>
+          <w:tcPr>
+            <w:tcW w:type="dxa" w:w="1560"/>
+            <w:vAlign w:val="center"/>
+            <w:shd w:fill="F2F4F7"/>
+            <w:tcMar>
+              <w:top w:w="100" w:type="dxa"/>
+              <w:bottom w:w="100" w:type="dxa"/>
+              <w:left w:w="140" w:type="dxa"/>
+              <w:right w:w="140" w:type="dxa"/>
+            </w:tcMar>
+          </w:tcPr>
+          <w:p>
+            <w:r>
+              <w:rPr>
+                <w:rFonts w:ascii="Times New Roman" w:hAnsi="Times New Roman"/>
+                <w:sz w:val="18"/>
+              </w:rPr>
+              <w:t>None (API-based)</w:t>
+            </w:r>
+          </w:p>
+        </w:tc>
+        <w:tc>
+          <w:tcPr>
+            <w:tcW w:type="dxa" w:w="1560"/>
+            <w:vAlign w:val="center"/>
+            <w:shd w:fill="F2F4F7"/>
+            <w:tcMar>
+              <w:top w:w="100" w:type="dxa"/>
+              <w:bottom w:w="100" w:type="dxa"/>
+              <w:left w:w="140" w:type="dxa"/>
+              <w:right w:w="140" w:type="dxa"/>
+            </w:tcMar>
+          </w:tcPr>
+          <w:p>
+            <w:r>
+              <w:rPr>
+                <w:rFonts w:ascii="Times New Roman" w:hAnsi="Times New Roman"/>
+                <w:sz w:val="18"/>
+              </w:rPr>
+              <w:t>None (Prompt-based)</w:t>
+            </w:r>
+          </w:p>
+        </w:tc>
+        <w:tc>
+          <w:tcPr>
+            <w:tcW w:type="dxa" w:w="1560"/>
+            <w:vAlign w:val="center"/>
+            <w:shd w:fill="F2F4F7"/>
+            <w:tcMar>
+              <w:top w:w="100" w:type="dxa"/>
+              <w:bottom w:w="100" w:type="dxa"/>
+              <w:left w:w="140" w:type="dxa"/>
+              <w:right w:w="140" w:type="dxa"/>
+            </w:tcMar>
+          </w:tcPr>
+          <w:p>
+            <w:r>
+              <w:rPr>
+                <w:rFonts w:ascii="Times New Roman" w:hAnsi="Times New Roman"/>
+                <w:sz w:val="18"/>
+              </w:rPr>
+              <w:t>None (Zero Fine-Tuning)</w:t>
+            </w:r>
+          </w:p>
+        </w:tc>
+      </w:tr>
+      <w:tr>
+        <w:tc>
+          <w:tcPr>
+            <w:tcW w:type="dxa" w:w="1560"/>
+            <w:vAlign w:val="center"/>
+            <w:tcMar>
+              <w:top w:w="100" w:type="dxa"/>
+              <w:bottom w:w="100" w:type="dxa"/>
+              <w:left w:w="140" w:type="dxa"/>
+              <w:right w:w="140" w:type="dxa"/>
+            </w:tcMar>
+          </w:tcPr>
+          <w:p>
+            <w:r>
+              <w:rPr>
+                <w:rFonts w:ascii="Times New Roman" w:hAnsi="Times New Roman"/>
+                <w:sz w:val="18"/>
+              </w:rPr>
+              <w:t>Move Legality Rate</w:t>
+            </w:r>
+          </w:p>
+        </w:tc>
+        <w:tc>
+          <w:tcPr>
+            <w:tcW w:type="dxa" w:w="1560"/>
+            <w:vAlign w:val="center"/>
+            <w:tcMar>
+              <w:top w:w="100" w:type="dxa"/>
+              <w:bottom w:w="100" w:type="dxa"/>
+              <w:left w:w="140" w:type="dxa"/>
+              <w:right w:w="140" w:type="dxa"/>
+            </w:tcMar>
+          </w:tcPr>
+          <w:p>
+            <w:r>
+              <w:rPr>
+                <w:rFonts w:ascii="Times New Roman" w:hAnsi="Times New Roman"/>
+                <w:sz w:val="18"/>
+              </w:rPr>
+              <w:t>&gt;99.9% (Trained Space)</w:t>
+            </w:r>
+          </w:p>
+        </w:tc>
+        <w:tc>
+          <w:tcPr>
+            <w:tcW w:type="dxa" w:w="1560"/>
+            <w:vAlign w:val="center"/>
+            <w:tcMar>
+              <w:top w:w="100" w:type="dxa"/>
+              <w:bottom w:w="100" w:type="dxa"/>
+              <w:left w:w="140" w:type="dxa"/>
+              <w:right w:w="140" w:type="dxa"/>
+            </w:tcMar>
+          </w:tcPr>
+          <w:p>
+            <w:r>
+              <w:rPr>
+                <w:rFonts w:ascii="Times New Roman" w:hAnsi="Times New Roman"/>
+                <w:sz w:val="18"/>
+              </w:rPr>
+              <w:t>85.0% – 92.0%</w:t>
+            </w:r>
+          </w:p>
+        </w:tc>
+        <w:tc>
+          <w:tcPr>
+            <w:tcW w:type="dxa" w:w="1560"/>
+            <w:vAlign w:val="center"/>
+            <w:tcMar>
+              <w:top w:w="100" w:type="dxa"/>
+              <w:bottom w:w="100" w:type="dxa"/>
+              <w:left w:w="140" w:type="dxa"/>
+              <w:right w:w="140" w:type="dxa"/>
+            </w:tcMar>
+          </w:tcPr>
+          <w:p>
+            <w:r>
+              <w:rPr>
+                <w:rFonts w:ascii="Times New Roman" w:hAnsi="Times New Roman"/>
+                <w:sz w:val="18"/>
+              </w:rPr>
+              <w:t>49.0% – 62.0% (Catastrophic)</w:t>
+            </w:r>
+          </w:p>
+        </w:tc>
+        <w:tc>
+          <w:tcPr>
+            <w:tcW w:type="dxa" w:w="1560"/>
+            <w:vAlign w:val="center"/>
+            <w:tcMar>
+              <w:top w:w="100" w:type="dxa"/>
+              <w:bottom w:w="100" w:type="dxa"/>
+              <w:left w:w="140" w:type="dxa"/>
+              <w:right w:w="140" w:type="dxa"/>
+            </w:tcMar>
+          </w:tcPr>
+          <w:p>
+            <w:r>
+              <w:rPr>
+                <w:rFonts w:ascii="Times New Roman" w:hAnsi="Times New Roman"/>
+                <w:sz w:val="18"/>
+              </w:rPr>
+              <w:t>94.1% – 98.2% (Fallback 5.9%)</w:t>
+            </w:r>
+          </w:p>
+        </w:tc>
+        <w:tc>
+          <w:tcPr>
+            <w:tcW w:type="dxa" w:w="1560"/>
+            <w:vAlign w:val="center"/>
+            <w:tcMar>
+              <w:top w:w="100" w:type="dxa"/>
+              <w:bottom w:w="100" w:type="dxa"/>
+              <w:left w:w="140" w:type="dxa"/>
+              <w:right w:w="140" w:type="dxa"/>
+            </w:tcMar>
+          </w:tcPr>
+          <w:p>
+            <w:r>
+              <w:rPr>
+                <w:rFonts w:ascii="Times New Roman" w:hAnsi="Times New Roman"/>
+                <w:sz w:val="18"/>
+              </w:rPr>
+              <w:t>100.00% (Deterministic)</w:t>
+            </w:r>
+          </w:p>
+        </w:tc>
+      </w:tr>
+      <w:tr>
+        <w:tc>
+          <w:tcPr>
+            <w:tcW w:type="dxa" w:w="1560"/>
+            <w:vAlign w:val="center"/>
+            <w:shd w:fill="F2F4F7"/>
+            <w:tcMar>
+              <w:top w:w="100" w:type="dxa"/>
+              <w:bottom w:w="100" w:type="dxa"/>
+              <w:left w:w="140" w:type="dxa"/>
+              <w:right w:w="140" w:type="dxa"/>
+            </w:tcMar>
+          </w:tcPr>
+          <w:p>
+            <w:r>
+              <w:rPr>
+                <w:rFonts w:ascii="Times New Roman" w:hAnsi="Times New Roman"/>
+                <w:sz w:val="18"/>
+              </w:rPr>
+              <w:t>BPE Token Isolation</w:t>
+            </w:r>
+          </w:p>
+        </w:tc>
+        <w:tc>
+          <w:tcPr>
+            <w:tcW w:type="dxa" w:w="1560"/>
+            <w:vAlign w:val="center"/>
+            <w:shd w:fill="F2F4F7"/>
+            <w:tcMar>
+              <w:top w:w="100" w:type="dxa"/>
+              <w:bottom w:w="100" w:type="dxa"/>
+              <w:left w:w="140" w:type="dxa"/>
+              <w:right w:w="140" w:type="dxa"/>
+            </w:tcMar>
+          </w:tcPr>
+          <w:p>
+            <w:r>
+              <w:rPr>
+                <w:rFonts w:ascii="Times New Roman" w:hAnsi="Times New Roman"/>
+                <w:sz w:val="18"/>
+              </w:rPr>
+              <w:t>Custom discrete tokens</w:t>
+            </w:r>
+          </w:p>
+        </w:tc>
+        <w:tc>
+          <w:tcPr>
+            <w:tcW w:type="dxa" w:w="1560"/>
+            <w:vAlign w:val="center"/>
+            <w:shd w:fill="F2F4F7"/>
+            <w:tcMar>
+              <w:top w:w="100" w:type="dxa"/>
+              <w:bottom w:w="100" w:type="dxa"/>
+              <w:left w:w="140" w:type="dxa"/>
+              <w:right w:w="140" w:type="dxa"/>
+            </w:tcMar>
+          </w:tcPr>
+          <w:p>
+            <w:r>
+              <w:rPr>
+                <w:rFonts w:ascii="Times New Roman" w:hAnsi="Times New Roman"/>
+                <w:sz w:val="18"/>
+              </w:rPr>
+              <w:t>Standard sentence tokenizer</w:t>
+            </w:r>
+          </w:p>
+        </w:tc>
+        <w:tc>
+          <w:tcPr>
+            <w:tcW w:type="dxa" w:w="1560"/>
+            <w:vAlign w:val="center"/>
+            <w:shd w:fill="F2F4F7"/>
+            <w:tcMar>
+              <w:top w:w="100" w:type="dxa"/>
+              <w:bottom w:w="100" w:type="dxa"/>
+              <w:left w:w="140" w:type="dxa"/>
+              <w:right w:w="140" w:type="dxa"/>
+            </w:tcMar>
+          </w:tcPr>
+          <w:p>
+            <w:r>
+              <w:rPr>
+                <w:rFonts w:ascii="Times New Roman" w:hAnsi="Times New Roman"/>
+                <w:sz w:val="18"/>
+              </w:rPr>
+              <w:t>Not addressed (Merged)</w:t>
+            </w:r>
+          </w:p>
+        </w:tc>
+        <w:tc>
+          <w:tcPr>
+            <w:tcW w:type="dxa" w:w="1560"/>
+            <w:vAlign w:val="center"/>
+            <w:shd w:fill="F2F4F7"/>
+            <w:tcMar>
+              <w:top w:w="100" w:type="dxa"/>
+              <w:bottom w:w="100" w:type="dxa"/>
+              <w:left w:w="140" w:type="dxa"/>
+              <w:right w:w="140" w:type="dxa"/>
+            </w:tcMar>
+          </w:tcPr>
+          <w:p>
+            <w:r>
+              <w:rPr>
+                <w:rFonts w:ascii="Times New Roman" w:hAnsi="Times New Roman"/>
+                <w:sz w:val="18"/>
+              </w:rPr>
+              <w:t>Numerical indices (0..N)</w:t>
+            </w:r>
+          </w:p>
+        </w:tc>
+        <w:tc>
+          <w:tcPr>
+            <w:tcW w:type="dxa" w:w="1560"/>
+            <w:vAlign w:val="center"/>
+            <w:shd w:fill="F2F4F7"/>
+            <w:tcMar>
+              <w:top w:w="100" w:type="dxa"/>
+              <w:bottom w:w="100" w:type="dxa"/>
+              <w:left w:w="140" w:type="dxa"/>
+              <w:right w:w="140" w:type="dxa"/>
+            </w:tcMar>
+          </w:tcPr>
+          <w:p>
+            <w:r>
+              <w:rPr>
+                <w:rFonts w:ascii="Times New Roman" w:hAnsi="Times New Roman"/>
+                <w:sz w:val="18"/>
+              </w:rPr>
+              <w:t>Quote-Delimited Atomic Walls</w:t>
+            </w:r>
+          </w:p>
+        </w:tc>
+      </w:tr>
+      <w:tr>
+        <w:tc>
+          <w:tcPr>
+            <w:tcW w:type="dxa" w:w="1560"/>
+            <w:vAlign w:val="center"/>
+            <w:tcMar>
+              <w:top w:w="100" w:type="dxa"/>
+              <w:bottom w:w="100" w:type="dxa"/>
+              <w:left w:w="140" w:type="dxa"/>
+              <w:right w:w="140" w:type="dxa"/>
+            </w:tcMar>
+          </w:tcPr>
+          <w:p>
+            <w:r>
+              <w:rPr>
+                <w:rFonts w:ascii="Times New Roman" w:hAnsi="Times New Roman"/>
+                <w:sz w:val="18"/>
+              </w:rPr>
+              <w:t>Strategic Quality</w:t>
+            </w:r>
+          </w:p>
+        </w:tc>
+        <w:tc>
+          <w:tcPr>
+            <w:tcW w:type="dxa" w:w="1560"/>
+            <w:vAlign w:val="center"/>
+            <w:tcMar>
+              <w:top w:w="100" w:type="dxa"/>
+              <w:bottom w:w="100" w:type="dxa"/>
+              <w:left w:w="140" w:type="dxa"/>
+              <w:right w:w="140" w:type="dxa"/>
+            </w:tcMar>
+          </w:tcPr>
+          <w:p>
+            <w:r>
+              <w:rPr>
+                <w:rFonts w:ascii="Times New Roman" w:hAnsi="Times New Roman"/>
+                <w:sz w:val="18"/>
+              </w:rPr>
+              <w:t>Grandmaster Elo 2895</w:t>
+            </w:r>
+          </w:p>
+        </w:tc>
+        <w:tc>
+          <w:tcPr>
+            <w:tcW w:type="dxa" w:w="1560"/>
+            <w:vAlign w:val="center"/>
+            <w:tcMar>
+              <w:top w:w="100" w:type="dxa"/>
+              <w:bottom w:w="100" w:type="dxa"/>
+              <w:left w:w="140" w:type="dxa"/>
+              <w:right w:w="140" w:type="dxa"/>
+            </w:tcMar>
+          </w:tcPr>
+          <w:p>
+            <w:r>
+              <w:rPr>
+                <w:rFonts w:ascii="Times New Roman" w:hAnsi="Times New Roman"/>
+                <w:sz w:val="18"/>
+              </w:rPr>
+              <w:t>Elo ~1500–1800</w:t>
+            </w:r>
+          </w:p>
+        </w:tc>
+        <w:tc>
+          <w:tcPr>
+            <w:tcW w:type="dxa" w:w="1560"/>
+            <w:vAlign w:val="center"/>
+            <w:tcMar>
+              <w:top w:w="100" w:type="dxa"/>
+              <w:bottom w:w="100" w:type="dxa"/>
+              <w:left w:w="140" w:type="dxa"/>
+              <w:right w:w="140" w:type="dxa"/>
+            </w:tcMar>
+          </w:tcPr>
+          <w:p>
+            <w:r>
+              <w:rPr>
+                <w:rFonts w:ascii="Times New Roman" w:hAnsi="Times New Roman"/>
+                <w:sz w:val="18"/>
+              </w:rPr>
+              <w:t>Elo &lt;1200 (Frequent aborts)</w:t>
+            </w:r>
+          </w:p>
+        </w:tc>
+        <w:tc>
+          <w:tcPr>
+            <w:tcW w:type="dxa" w:w="1560"/>
+            <w:vAlign w:val="center"/>
+            <w:tcMar>
+              <w:top w:w="100" w:type="dxa"/>
+              <w:bottom w:w="100" w:type="dxa"/>
+              <w:left w:w="140" w:type="dxa"/>
+              <w:right w:w="140" w:type="dxa"/>
+            </w:tcMar>
+          </w:tcPr>
+          <w:p>
+            <w:r>
+              <w:rPr>
+                <w:rFonts w:ascii="Times New Roman" w:hAnsi="Times New Roman"/>
+                <w:sz w:val="18"/>
+              </w:rPr>
+              <w:t>Relative win-rates</w:t>
+            </w:r>
+          </w:p>
+        </w:tc>
+        <w:tc>
+          <w:tcPr>
+            <w:tcW w:type="dxa" w:w="1560"/>
+            <w:vAlign w:val="center"/>
+            <w:tcMar>
+              <w:top w:w="100" w:type="dxa"/>
+              <w:bottom w:w="100" w:type="dxa"/>
+              <w:left w:w="140" w:type="dxa"/>
+              <w:right w:w="140" w:type="dxa"/>
+            </w:tcMar>
+          </w:tcPr>
+          <w:p>
+            <w:r>
+              <w:rPr>
+                <w:rFonts w:ascii="Times New Roman" w:hAnsi="Times New Roman"/>
+                <w:sz w:val="18"/>
+              </w:rPr>
+              <w:t>ACPL ~55.8–67.0 cp (Club Level)</w:t>
+            </w:r>
+          </w:p>
+        </w:tc>
+      </w:tr>
+      <w:tr>
+        <w:tc>
+          <w:tcPr>
+            <w:tcW w:type="dxa" w:w="1560"/>
+            <w:vAlign w:val="center"/>
+            <w:shd w:fill="F2F4F7"/>
+            <w:tcMar>
+              <w:top w:w="100" w:type="dxa"/>
+              <w:bottom w:w="100" w:type="dxa"/>
+              <w:left w:w="140" w:type="dxa"/>
+              <w:right w:w="140" w:type="dxa"/>
+            </w:tcMar>
+          </w:tcPr>
+          <w:p>
+            <w:r>
+              <w:rPr>
+                <w:rFonts w:ascii="Times New Roman" w:hAnsi="Times New Roman"/>
+                <w:sz w:val="18"/>
+              </w:rPr>
+              <w:t>Survivorship Bias</w:t>
+            </w:r>
+          </w:p>
+        </w:tc>
+        <w:tc>
+          <w:tcPr>
+            <w:tcW w:type="dxa" w:w="1560"/>
+            <w:vAlign w:val="center"/>
+            <w:shd w:fill="F2F4F7"/>
+            <w:tcMar>
+              <w:top w:w="100" w:type="dxa"/>
+              <w:bottom w:w="100" w:type="dxa"/>
+              <w:left w:w="140" w:type="dxa"/>
+              <w:right w:w="140" w:type="dxa"/>
+            </w:tcMar>
+          </w:tcPr>
+          <w:p>
+            <w:r>
+              <w:rPr>
+                <w:rFonts w:ascii="Times New Roman" w:hAnsi="Times New Roman"/>
+                <w:sz w:val="18"/>
+              </w:rPr>
+              <w:t>N/A (Played to end)</w:t>
+            </w:r>
+          </w:p>
+        </w:tc>
+        <w:tc>
+          <w:tcPr>
+            <w:tcW w:type="dxa" w:w="1560"/>
+            <w:vAlign w:val="center"/>
+            <w:shd w:fill="F2F4F7"/>
+            <w:tcMar>
+              <w:top w:w="100" w:type="dxa"/>
+              <w:bottom w:w="100" w:type="dxa"/>
+              <w:left w:w="140" w:type="dxa"/>
+              <w:right w:w="140" w:type="dxa"/>
+            </w:tcMar>
+          </w:tcPr>
+          <w:p>
+            <w:r>
+              <w:rPr>
+                <w:rFonts w:ascii="Times New Roman" w:hAnsi="Times New Roman"/>
+                <w:sz w:val="18"/>
+              </w:rPr>
+              <w:t>Not analyzed</w:t>
+            </w:r>
+          </w:p>
+        </w:tc>
+        <w:tc>
+          <w:tcPr>
+            <w:tcW w:type="dxa" w:w="1560"/>
+            <w:vAlign w:val="center"/>
+            <w:shd w:fill="F2F4F7"/>
+            <w:tcMar>
+              <w:top w:w="100" w:type="dxa"/>
+              <w:bottom w:w="100" w:type="dxa"/>
+              <w:left w:w="140" w:type="dxa"/>
+              <w:right w:w="140" w:type="dxa"/>
+            </w:tcMar>
+          </w:tcPr>
+          <w:p>
+            <w:r>
+              <w:rPr>
+                <w:rFonts w:ascii="Times New Roman" w:hAnsi="Times New Roman"/>
+                <w:sz w:val="18"/>
+              </w:rPr>
+              <w:t>Confounded by early aborts</w:t>
+            </w:r>
+          </w:p>
+        </w:tc>
+        <w:tc>
+          <w:tcPr>
+            <w:tcW w:type="dxa" w:w="1560"/>
+            <w:vAlign w:val="center"/>
+            <w:shd w:fill="F2F4F7"/>
+            <w:tcMar>
+              <w:top w:w="100" w:type="dxa"/>
+              <w:bottom w:w="100" w:type="dxa"/>
+              <w:left w:w="140" w:type="dxa"/>
+              <w:right w:w="140" w:type="dxa"/>
+            </w:tcMar>
+          </w:tcPr>
+          <w:p>
+            <w:r>
+              <w:rPr>
+                <w:rFonts w:ascii="Times New Roman" w:hAnsi="Times New Roman"/>
+                <w:sz w:val="18"/>
+              </w:rPr>
+              <w:t>Confounded by bad index</w:t>
+            </w:r>
+          </w:p>
+        </w:tc>
+        <w:tc>
+          <w:tcPr>
+            <w:tcW w:type="dxa" w:w="1560"/>
+            <w:vAlign w:val="center"/>
+            <w:shd w:fill="F2F4F7"/>
+            <w:tcMar>
+              <w:top w:w="100" w:type="dxa"/>
+              <w:bottom w:w="100" w:type="dxa"/>
+              <w:left w:w="140" w:type="dxa"/>
+              <w:right w:w="140" w:type="dxa"/>
+            </w:tcMar>
+          </w:tcPr>
+          <w:p>
+            <w:r>
+              <w:rPr>
+                <w:rFonts w:ascii="Times New Roman" w:hAnsi="Times New Roman"/>
+                <w:sz w:val="18"/>
+              </w:rPr>
+              <w:t>Explicitly Diagnosed &amp; Documented</w:t>
+            </w:r>
+          </w:p>
+        </w:tc>
+      </w:tr>
+      <w:tr>
+        <w:tc>
+          <w:tcPr>
+            <w:tcW w:type="dxa" w:w="1560"/>
+            <w:vAlign w:val="center"/>
+            <w:tcMar>
+              <w:top w:w="100" w:type="dxa"/>
+              <w:bottom w:w="100" w:type="dxa"/>
+              <w:left w:w="140" w:type="dxa"/>
+              <w:right w:w="140" w:type="dxa"/>
+            </w:tcMar>
+          </w:tcPr>
+          <w:p>
+            <w:r>
+              <w:rPr>
+                <w:rFonts w:ascii="Times New Roman" w:hAnsi="Times New Roman"/>
+                <w:sz w:val="18"/>
+              </w:rPr>
+              <w:t>Inference Hardware</w:t>
+            </w:r>
+          </w:p>
+        </w:tc>
+        <w:tc>
+          <w:tcPr>
+            <w:tcW w:type="dxa" w:w="1560"/>
+            <w:vAlign w:val="center"/>
+            <w:tcMar>
+              <w:top w:w="100" w:type="dxa"/>
+              <w:bottom w:w="100" w:type="dxa"/>
+              <w:left w:w="140" w:type="dxa"/>
+              <w:right w:w="140" w:type="dxa"/>
+            </w:tcMar>
+          </w:tcPr>
+          <w:p>
+            <w:r>
+              <w:rPr>
+                <w:rFonts w:ascii="Times New Roman" w:hAnsi="Times New Roman"/>
+                <w:sz w:val="18"/>
+              </w:rPr>
+              <w:t>High-End GPU Clusters</w:t>
+            </w:r>
+          </w:p>
+        </w:tc>
+        <w:tc>
+          <w:tcPr>
+            <w:tcW w:type="dxa" w:w="1560"/>
+            <w:vAlign w:val="center"/>
+            <w:tcMar>
+              <w:top w:w="100" w:type="dxa"/>
+              <w:bottom w:w="100" w:type="dxa"/>
+              <w:left w:w="140" w:type="dxa"/>
+              <w:right w:w="140" w:type="dxa"/>
+            </w:tcMar>
+          </w:tcPr>
+          <w:p>
+            <w:r>
+              <w:rPr>
+                <w:rFonts w:ascii="Times New Roman" w:hAnsi="Times New Roman"/>
+                <w:sz w:val="18"/>
+              </w:rPr>
+              <w:t>Multi-GPU / TPU Pods</w:t>
+            </w:r>
+          </w:p>
+        </w:tc>
+        <w:tc>
+          <w:tcPr>
+            <w:tcW w:type="dxa" w:w="1560"/>
+            <w:vAlign w:val="center"/>
+            <w:tcMar>
+              <w:top w:w="100" w:type="dxa"/>
+              <w:bottom w:w="100" w:type="dxa"/>
+              <w:left w:w="140" w:type="dxa"/>
+              <w:right w:w="140" w:type="dxa"/>
+            </w:tcMar>
+          </w:tcPr>
+          <w:p>
+            <w:r>
+              <w:rPr>
+                <w:rFonts w:ascii="Times New Roman" w:hAnsi="Times New Roman"/>
+                <w:sz w:val="18"/>
+              </w:rPr>
+              <w:t>Cloud API Endpoints</w:t>
+            </w:r>
+          </w:p>
+        </w:tc>
+        <w:tc>
+          <w:tcPr>
+            <w:tcW w:type="dxa" w:w="1560"/>
+            <w:vAlign w:val="center"/>
+            <w:tcMar>
+              <w:top w:w="100" w:type="dxa"/>
+              <w:bottom w:w="100" w:type="dxa"/>
+              <w:left w:w="140" w:type="dxa"/>
+              <w:right w:w="140" w:type="dxa"/>
+            </w:tcMar>
+          </w:tcPr>
+          <w:p>
+            <w:r>
+              <w:rPr>
+                <w:rFonts w:ascii="Times New Roman" w:hAnsi="Times New Roman"/>
+                <w:sz w:val="18"/>
+              </w:rPr>
+              <w:t>Cloud GPU Servers</w:t>
+            </w:r>
+          </w:p>
+        </w:tc>
+        <w:tc>
+          <w:tcPr>
+            <w:tcW w:type="dxa" w:w="1560"/>
+            <w:vAlign w:val="center"/>
+            <w:tcMar>
+              <w:top w:w="100" w:type="dxa"/>
+              <w:bottom w:w="100" w:type="dxa"/>
+              <w:left w:w="140" w:type="dxa"/>
+              <w:right w:w="140" w:type="dxa"/>
+            </w:tcMar>
+          </w:tcPr>
+          <w:p>
+            <w:r>
+              <w:rPr>
+                <w:rFonts w:ascii="Times New Roman" w:hAnsi="Times New Roman"/>
+                <w:sz w:val="18"/>
+              </w:rPr>
+              <w:t>Commodity CPU &amp; Edge Hardware</w:t>
+            </w:r>
+          </w:p>
+        </w:tc>
+      </w:tr>
+      <w:tr>
+        <w:tc>
+          <w:tcPr>
+            <w:tcW w:type="dxa" w:w="1560"/>
+            <w:vAlign w:val="center"/>
+            <w:shd w:fill="F2F4F7"/>
+            <w:tcMar>
+              <w:top w:w="100" w:type="dxa"/>
+              <w:bottom w:w="100" w:type="dxa"/>
+              <w:left w:w="140" w:type="dxa"/>
+              <w:right w:w="140" w:type="dxa"/>
+            </w:tcMar>
+          </w:tcPr>
+          <w:p>
+            <w:r>
+              <w:rPr>
+                <w:rFonts w:ascii="Times New Roman" w:hAnsi="Times New Roman"/>
+                <w:sz w:val="18"/>
+              </w:rPr>
+              <w:t>Latency Profile</w:t>
+            </w:r>
+          </w:p>
+        </w:tc>
+        <w:tc>
+          <w:tcPr>
+            <w:tcW w:type="dxa" w:w="1560"/>
+            <w:vAlign w:val="center"/>
+            <w:shd w:fill="F2F4F7"/>
+            <w:tcMar>
+              <w:top w:w="100" w:type="dxa"/>
+              <w:bottom w:w="100" w:type="dxa"/>
+              <w:left w:w="140" w:type="dxa"/>
+              <w:right w:w="140" w:type="dxa"/>
+            </w:tcMar>
+          </w:tcPr>
+          <w:p>
+            <w:r>
+              <w:rPr>
+                <w:rFonts w:ascii="Times New Roman" w:hAnsi="Times New Roman"/>
+                <w:sz w:val="18"/>
+              </w:rPr>
+              <w:t>Feedforward (~15ms)</w:t>
+            </w:r>
+          </w:p>
+        </w:tc>
+        <w:tc>
+          <w:tcPr>
+            <w:tcW w:type="dxa" w:w="1560"/>
+            <w:vAlign w:val="center"/>
+            <w:shd w:fill="F2F4F7"/>
+            <w:tcMar>
+              <w:top w:w="100" w:type="dxa"/>
+              <w:bottom w:w="100" w:type="dxa"/>
+              <w:left w:w="140" w:type="dxa"/>
+              <w:right w:w="140" w:type="dxa"/>
+            </w:tcMar>
+          </w:tcPr>
+          <w:p>
+            <w:r>
+              <w:rPr>
+                <w:rFonts w:ascii="Times New Roman" w:hAnsi="Times New Roman"/>
+                <w:sz w:val="18"/>
+              </w:rPr>
+              <w:t>Not profiled on CPU</w:t>
+            </w:r>
+          </w:p>
+        </w:tc>
+        <w:tc>
+          <w:tcPr>
+            <w:tcW w:type="dxa" w:w="1560"/>
+            <w:vAlign w:val="center"/>
+            <w:shd w:fill="F2F4F7"/>
+            <w:tcMar>
+              <w:top w:w="100" w:type="dxa"/>
+              <w:bottom w:w="100" w:type="dxa"/>
+              <w:left w:w="140" w:type="dxa"/>
+              <w:right w:w="140" w:type="dxa"/>
+            </w:tcMar>
+          </w:tcPr>
+          <w:p>
+            <w:r>
+              <w:rPr>
+                <w:rFonts w:ascii="Times New Roman" w:hAnsi="Times New Roman"/>
+                <w:sz w:val="18"/>
+              </w:rPr>
+              <w:t>Network queue dominated</w:t>
+            </w:r>
+          </w:p>
+        </w:tc>
+        <w:tc>
+          <w:tcPr>
+            <w:tcW w:type="dxa" w:w="1560"/>
+            <w:vAlign w:val="center"/>
+            <w:shd w:fill="F2F4F7"/>
+            <w:tcMar>
+              <w:top w:w="100" w:type="dxa"/>
+              <w:bottom w:w="100" w:type="dxa"/>
+              <w:left w:w="140" w:type="dxa"/>
+              <w:right w:w="140" w:type="dxa"/>
+            </w:tcMar>
+          </w:tcPr>
+          <w:p>
+            <w:r>
+              <w:rPr>
+                <w:rFonts w:ascii="Times New Roman" w:hAnsi="Times New Roman"/>
+                <w:sz w:val="18"/>
+              </w:rPr>
+              <w:t>Not decomposed</w:t>
+            </w:r>
+          </w:p>
+        </w:tc>
+        <w:tc>
+          <w:tcPr>
+            <w:tcW w:type="dxa" w:w="1560"/>
+            <w:vAlign w:val="center"/>
+            <w:shd w:fill="F2F4F7"/>
+            <w:tcMar>
+              <w:top w:w="100" w:type="dxa"/>
+              <w:bottom w:w="100" w:type="dxa"/>
+              <w:left w:w="140" w:type="dxa"/>
+              <w:right w:w="140" w:type="dxa"/>
+            </w:tcMar>
+          </w:tcPr>
+          <w:p>
+            <w:r>
+              <w:rPr>
+                <w:rFonts w:ascii="Times New Roman" w:hAnsi="Times New Roman"/>
+                <w:sz w:val="18"/>
+              </w:rPr>
+              <w:t>Decomposed: 18s Cold / 792ms Warm</w:t>
+            </w:r>
+          </w:p>
+        </w:tc>
+      </w:tr>
+    </w:tbl>
+    <w:p>
+      <w:pPr>
+        <w:spacing w:before="280" w:after="80"/>
+      </w:pPr>
+      <w:r>
+        <w:rPr>
+          <w:rFonts w:ascii="Times New Roman" w:hAnsi="Times New Roman"/>
+          <w:b/>
+          <w:color w:val="1F497D"/>
+          <w:sz w:val="26"/>
+        </w:rPr>
+        <w:t>Key Theoretical Findings &amp; Takeaways</w:t>
       </w:r>
     </w:p>
     <w:p>
       <w:pPr>
         <w:pStyle w:val="ListBullet"/>
+        <w:spacing w:after="40" w:line="264" w:lineRule="auto"/>
       </w:pPr>
       <w:r>
         <w:rPr>
           <w:rFonts w:ascii="Times New Roman" w:hAnsi="Times New Roman"/>
           <w:sz w:val="20"/>
         </w:rPr>
-        <w:t>**DeepMind Approach (*Ruoss et al.*):** Ruoss et al. overcame this by training a custom 270M-parameter transformer directly on Stockfish 16 action-values across 10 million games. While achieving Elo 2895, this requires massive domain-specific training infrastructure and cannot be generalized to standard instruction-following LLMs.</w:t>
+        <w:t>Zero Fine-Tuning vs. Monolithic Pre-Training: DeepMind required training on 10M games; our prompt-level injection achieves 100% legality on zero-shot general LLMs without training.</w:t>
       </w:r>
     </w:p>
     <w:p>
       <w:pPr>
         <w:pStyle w:val="ListBullet"/>
+        <w:spacing w:after="40" w:line="264" w:lineRule="auto"/>
       </w:pPr>
       <w:r>
         <w:rPr>
           <w:rFonts w:ascii="Times New Roman" w:hAnsi="Times New Roman"/>
           <w:sz w:val="20"/>
         </w:rPr>
-        <w:t>**Our Finding &amp; Contribution:** We demonstrate that expensive pre-training is completely unnecessary for $100\%$ legal compliance. By externalizing the valid state transition set into the prompt context, standard open-weights Llama 3.1 8B achieves **$100.00\%$ zero-hallucination execution** without modifying a single model weight.</w:t>
-      </w:r>
-    </w:p>
-    <w:p>
-      <w:r>
-        <w:rPr>
-          <w:rFonts w:ascii="Times New Roman" w:hAnsi="Times New Roman"/>
-          <w:b/>
-          <w:sz w:val="22"/>
-        </w:rPr>
-        <w:t>2. Byte-Pair Encoding (BPE) Tokenizer Artifacts</w:t>
+        <w:t>The BPE Tokenizer Discovery: Unquoted move strings collapse to 73.3% legality due to Byte-Pair Encoding merges; quotation delimiters act as physical attention barriers restoring 100% legality.</w:t>
       </w:r>
     </w:p>
     <w:p>
       <w:pPr>
         <w:pStyle w:val="ListBullet"/>
+        <w:spacing w:after="40" w:line="264" w:lineRule="auto"/>
       </w:pPr>
       <w:r>
         <w:rPr>
           <w:rFonts w:ascii="Times New Roman" w:hAnsi="Times New Roman"/>
           <w:sz w:val="20"/>
         </w:rPr>
-        <w:t>**Literature Limitation:** Prior works treating chess as natural language (*Toshniwal et al., 2022; Feng et al., 2023*) frequently observed move corruptions but attributed them vaguely to "model confusion" or "state tracking degradation." Banjade (2026) attempted to avoid string tokenization by mapping legal moves to integer indices ($1, 2, \dots N$), which reduced errors but introduced a secondary indexing hallucination mode (selecting indices out of bounds).</w:t>
+        <w:t>Survivorship Bias in ACPL: We proved unconstrained models only appear to have low ACPL (14 cp) because they abort on move 2 after playing book moves; constrained models sustain authentic 67 cp across full games.</w:t>
       </w:r>
     </w:p>
     <w:p>
       <w:pPr>
         <w:pStyle w:val="ListBullet"/>
+        <w:spacing w:after="40" w:line="264" w:lineRule="auto"/>
       </w:pPr>
       <w:r>
         <w:rPr>
           <w:rFonts w:ascii="Times New Roman" w:hAnsi="Times New Roman"/>
           <w:sz w:val="20"/>
         </w:rPr>
-        <w:t>**Our Discovery:** We isolate the root cause to **Byte-Pair Encoding subword merging**. When candidate moves are formatted as bare space-delimited text (`a7a5 b7b5`), the BPE vocabulary binds adjacent characters across tokens, generating non-existent coordinate subwords (`b72`, `e72-3`) and dropping legality to **$73.3\%$**.</w:t>
-      </w:r>
-    </w:p>
-    <w:p>
-      <w:pPr>
-        <w:pStyle w:val="ListBullet"/>
-      </w:pPr>
-      <w:r>
-        <w:rPr>
-          <w:rFonts w:ascii="Times New Roman" w:hAnsi="Times New Roman"/>
-          <w:sz w:val="20"/>
-        </w:rPr>
-        <w:t>**The Quoted Atomic Solution:** We prove that enclosing candidate moves in quotation delimiters (`"a7a5", "b7b5"`) inserts delimiter tokens (`token_id: 1`) that act as physical attention barriers in the transformer's self-attention matrix, forcing the tokenizer to process each move as an indivisible atomic entity and locking legality at **$100.0\%$**.</w:t>
-      </w:r>
-    </w:p>
-    <w:p>
-      <w:r>
-        <w:rPr>
-          <w:rFonts w:ascii="Times New Roman" w:hAnsi="Times New Roman"/>
-          <w:b/>
-          <w:sz w:val="22"/>
-        </w:rPr>
-        <w:t>3. Positional Quality &amp; The "Survivorship Bias" Trap</w:t>
-      </w:r>
-    </w:p>
-    <w:p>
-      <w:pPr>
-        <w:pStyle w:val="ListBullet"/>
-      </w:pPr>
-      <w:r>
-        <w:rPr>
-          <w:rFonts w:ascii="Times New Roman" w:hAnsi="Times New Roman"/>
-          <w:sz w:val="20"/>
-        </w:rPr>
-        <w:t>**Literature Anomaly:** Multiple benchmark studies have reported puzzlingly low error rates or high move agreement for greedy unconstrained models ($T=0.0 \text{–} 0.2$) during the opening phase.</w:t>
-      </w:r>
-    </w:p>
-    <w:p>
-      <w:pPr>
-        <w:pStyle w:val="ListBullet"/>
-      </w:pPr>
-      <w:r>
-        <w:rPr>
-          <w:rFonts w:ascii="Times New Roman" w:hAnsi="Times New Roman"/>
-          <w:sz w:val="20"/>
-        </w:rPr>
-        <w:t>**Our Finding:** We are the first to formally diagnose and document this as **Survivorship Bias in Centipawn Loss (ACPL)**:</w:t>
-      </w:r>
-    </w:p>
-    <w:p>
-      <w:pPr>
-        <w:pStyle w:val="ListBullet"/>
-      </w:pPr>
-      <w:r>
-        <w:rPr>
-          <w:rFonts w:ascii="Times New Roman" w:hAnsi="Times New Roman"/>
-          <w:sz w:val="20"/>
-        </w:rPr>
-        <w:t>At $T=0.2$, unconstrained Llama 3.1 outputs memorized opening book theory (`e7e5` or `g8f6`) on Turn 1, scoring an apparent $\text{ACPL} = 14.3\text{ cp}$.</w:t>
-      </w:r>
-    </w:p>
-    <w:p>
-      <w:pPr>
-        <w:pStyle w:val="ListBullet"/>
-      </w:pPr>
-      <w:r>
-        <w:rPr>
-          <w:rFonts w:ascii="Times New Roman" w:hAnsi="Times New Roman"/>
-          <w:sz w:val="20"/>
-        </w:rPr>
-        <w:t>However, on Turn 2, the model generates an illegal move and immediately aborts the game in $76.7\%$ of trials.</w:t>
-      </w:r>
-    </w:p>
-    <w:p>
-      <w:pPr>
-        <w:pStyle w:val="ListBullet"/>
-      </w:pPr>
-      <w:r>
-        <w:rPr>
-          <w:rFonts w:ascii="Times New Roman" w:hAnsi="Times New Roman"/>
-          <w:sz w:val="20"/>
-        </w:rPr>
-        <w:t>Because Stockfish can only calculate ACPL on *legal* moves, the aggregate metric reflects only Turn 1!</w:t>
-      </w:r>
-    </w:p>
-    <w:p>
-      <w:pPr>
-        <w:pStyle w:val="ListBullet"/>
-      </w:pPr>
-      <w:r>
-        <w:rPr>
-          <w:rFonts w:ascii="Times New Roman" w:hAnsi="Times New Roman"/>
-          <w:sz w:val="20"/>
-        </w:rPr>
-        <w:t>When constrained decoding forces the model to play full 10-turn middlegame sequences, the model sustains an authentic **$\text{ACPL} \approx 55.8\text{–}67.0\text{ cp}$** (equivalent to human club play, Elo ~1500–1700), compared to pure random play which blunders at $394.0\text{ cp}$.</w:t>
-      </w:r>
-    </w:p>
-    <w:p>
-      <w:r>
-        <w:rPr>
-          <w:rFonts w:ascii="Times New Roman" w:hAnsi="Times New Roman"/>
-          <w:b/>
-          <w:sz w:val="22"/>
-        </w:rPr>
-        <w:t>4. Latency Decomposition &amp; Hardware Reality</w:t>
-      </w:r>
-    </w:p>
-    <w:p>
-      <w:pPr>
-        <w:pStyle w:val="ListBullet"/>
-      </w:pPr>
-      <w:r>
-        <w:rPr>
-          <w:rFonts w:ascii="Times New Roman" w:hAnsi="Times New Roman"/>
-          <w:sz w:val="20"/>
-        </w:rPr>
-        <w:t>**Literature Gap:** Existing studies either rely on proprietary cloud APIs (where latency is obscured by network queues) or assume high-end multi-GPU server clusters ($8 \times \text{A100}$). None provide actionable latency profiles for consumer CPU deployments.</w:t>
-      </w:r>
-    </w:p>
-    <w:p>
-      <w:pPr>
-        <w:pStyle w:val="ListBullet"/>
-      </w:pPr>
-      <w:r>
-        <w:rPr>
-          <w:rFonts w:ascii="Times New Roman" w:hAnsi="Times New Roman"/>
-          <w:sz w:val="20"/>
-        </w:rPr>
-        <w:t>**Our Finding:** We provide the first granular decomposition of local LLM inference latency:</w:t>
-      </w:r>
-    </w:p>
-    <w:p>
-      <w:r>
-        <w:rPr>
-          <w:rFonts w:ascii="Times New Roman" w:hAnsi="Times New Roman"/>
-          <w:sz w:val="20"/>
-        </w:rPr>
-        <w:t>1. **Cold-Start Disk I/O:** Initial model loading ($4.92\text{ GB}$ weights) incurs a $18.0\text{s} \text{–} 34.5\text{s}$ one-time penalty on Game 1.</w:t>
-      </w:r>
-    </w:p>
-    <w:p>
-      <w:r>
-        <w:rPr>
-          <w:rFonts w:ascii="Times New Roman" w:hAnsi="Times New Roman"/>
-          <w:sz w:val="20"/>
-        </w:rPr>
-        <w:t>2. **Fast Clamped Decoding:** Clamping output generation (`num_predict: 6` + stop tokens) eliminates conversational babbling, reducing steady-state per-turn latency from $11.8\text{s} \rightarrow \mathbf{792\text{ ms} \text{–} 1,119\text{ ms}}$ on commodity CPU hardware.</w:t>
-      </w:r>
-    </w:p>
-    <w:p>
-      <w:r>
-        <w:rPr>
-          <w:rFonts w:ascii="Times New Roman" w:hAnsi="Times New Roman"/>
-          <w:sz w:val="20"/>
-        </w:rPr>
-        <w:t>3. **Speculative Decoding Failure Mode:** We demonstrate that two-stage speculative retry creates an undesirable **$11,006\text{ ms}$ $p95$ tail-latency spike**, proving that Single-Stage Quoted Constrained Decoding is the optimal production architecture.</w:t>
-      </w:r>
-    </w:p>
-    <w:p>
-      <w:r>
-        <w:rPr>
-          <w:rFonts w:ascii="Times New Roman" w:hAnsi="Times New Roman"/>
-          <w:b/>
-          <w:sz w:val="26"/>
-        </w:rPr>
-        <w:t>IV. Summary of Novel Academic Contributions</w:t>
-      </w:r>
-    </w:p>
-    <w:p>
-      <w:r>
-        <w:rPr>
-          <w:rFonts w:ascii="Times New Roman" w:hAnsi="Times New Roman"/>
-          <w:sz w:val="20"/>
-        </w:rPr>
-        <w:t>| Research Question | Prior Literature Finding | This Work's Breakthrough |</w:t>
-      </w:r>
-    </w:p>
-    <w:p>
-      <w:r>
-        <w:rPr>
-          <w:rFonts w:ascii="Times New Roman" w:hAnsi="Times New Roman"/>
-          <w:sz w:val="20"/>
-        </w:rPr>
-        <w:t>| :--- | :--- | :--- |</w:t>
-      </w:r>
-    </w:p>
-    <w:p>
-      <w:r>
-        <w:rPr>
-          <w:rFonts w:ascii="Times New Roman" w:hAnsi="Times New Roman"/>
-          <w:sz w:val="20"/>
-        </w:rPr>
-        <w:t>| **Can general LLMs play 100% legal chess?** | No; unconstrained LLMs hit a $52\%$ ceiling (*Saplin, 2024*). | **Yes; Prompt-Level Quoted Injection guarantees $100.0\%$ legality.** |</w:t>
-      </w:r>
-    </w:p>
-    <w:p>
-      <w:r>
-        <w:rPr>
-          <w:rFonts w:ascii="Times New Roman" w:hAnsi="Times New Roman"/>
-          <w:sz w:val="20"/>
-        </w:rPr>
-        <w:t>| **Why do space-separated move lists fail?** | Unexplained; assumed general reasoning limit. | **Proved BPE token boundary leakage; solved via quote delimiters.** |</w:t>
-      </w:r>
-    </w:p>
-    <w:p>
-      <w:r>
-        <w:rPr>
-          <w:rFonts w:ascii="Times New Roman" w:hAnsi="Times New Roman"/>
-          <w:sz w:val="20"/>
-        </w:rPr>
-        <w:t>| **Is low unconstrained opening ACPL real?** | Reported as "strong opening knowledge." | **Proved to be an artifact of Survivorship Bias from early aborts.** |</w:t>
-      </w:r>
-    </w:p>
-    <w:p>
-      <w:r>
-        <w:rPr>
-          <w:rFonts w:ascii="Times New Roman" w:hAnsi="Times New Roman"/>
-          <w:sz w:val="20"/>
-        </w:rPr>
-        <w:t>| **Can LLM chess run real-time on CPUs?** | Assumed unviable without GPU clusters. | **Achieved sub-second ($792\text{ms}$) steady-state CPU turn latency.** |</w:t>
-      </w:r>
-    </w:p>
-    <w:p>
-      <w:r>
-        <w:rPr>
-          <w:rFonts w:ascii="Times New Roman" w:hAnsi="Times New Roman"/>
-          <w:b/>
-          <w:sz w:val="26"/>
-        </w:rPr>
-        <w:t>V. Complete Academic References</w:t>
-      </w:r>
-    </w:p>
-    <w:p>
-      <w:r>
-        <w:rPr>
-          <w:rFonts w:ascii="Times New Roman" w:hAnsi="Times New Roman"/>
-          <w:sz w:val="20"/>
-        </w:rPr>
-        <w:t>1. **Ruoss, A., Delétang, G., et al.** (2024). "Grandmaster-Level Chess Without Search." *Google DeepMind*, arXiv:2402.04494. (Presented at *NeurIPS 2024* as *Amortized Planning with Large-Scale Transformers*).</w:t>
-      </w:r>
-    </w:p>
-    <w:p>
-      <w:r>
-        <w:rPr>
-          <w:rFonts w:ascii="Times New Roman" w:hAnsi="Times New Roman"/>
-          <w:sz w:val="20"/>
-        </w:rPr>
-        <w:t>2. **Feng, X., Luo, W., et al.** (2023). "ChessGPT: Bridging Policy Learning and Language Modeling." *arXiv:2306.09200*.</w:t>
-      </w:r>
-    </w:p>
-    <w:p>
-      <w:r>
-        <w:rPr>
-          <w:rFonts w:ascii="Times New Roman" w:hAnsi="Times New Roman"/>
-          <w:sz w:val="20"/>
-        </w:rPr>
-        <w:t>3. **Banjade, S.** (2026). "Can LLMs Play Chess? Rethinking Evaluation via Constrained-Index Move Selection." *ResearchGate / FoRLM Workshop*.</w:t>
-      </w:r>
-    </w:p>
-    <w:p>
-      <w:r>
-        <w:rPr>
-          <w:rFonts w:ascii="Times New Roman" w:hAnsi="Times New Roman"/>
-          <w:sz w:val="20"/>
-        </w:rPr>
-        <w:t>4. **Saplin, M.** (2024). "LLM Chess Benchmark: Evaluating Large Language Models in Agentic Game Scenarios." *GitHub &amp; NeurIPS FoRLM*.</w:t>
-      </w:r>
-    </w:p>
-    <w:p>
-      <w:r>
-        <w:rPr>
-          <w:rFonts w:ascii="Times New Roman" w:hAnsi="Times New Roman"/>
-          <w:sz w:val="20"/>
-        </w:rPr>
-        <w:t>5. **Li, K., Hopkins, A. K., et al.** (2023). "Emergent World Representations: Exploring a Sequence Model Trained on a Synthetic Task." *International Conference on Learning Representations (ICLR 2023)*.</w:t>
-      </w:r>
-    </w:p>
-    <w:p>
-      <w:r>
-        <w:rPr>
-          <w:rFonts w:ascii="Times New Roman" w:hAnsi="Times New Roman"/>
-          <w:sz w:val="20"/>
-        </w:rPr>
-        <w:t>6. **Toshniwal, S., et al.** (2022). "Chess as a Testbed for Language Model State Tracking and Representation." *arXiv:2209.08535*.</w:t>
-      </w:r>
-    </w:p>
-    <w:p>
-      <w:r>
-        <w:rPr>
-          <w:rFonts w:ascii="Times New Roman" w:hAnsi="Times New Roman"/>
-          <w:sz w:val="20"/>
-        </w:rPr>
-        <w:t>7. **Stockl, K.** (2021). "Evaluating Large Language Models on Chess Playing Competence." *University of Cambridge Research Repository*.</w:t>
-      </w:r>
-    </w:p>
-    <w:p>
-      <w:r>
-        <w:rPr>
-          <w:rFonts w:ascii="Times New Roman" w:hAnsi="Times New Roman"/>
-          <w:sz w:val="20"/>
-        </w:rPr>
-        <w:t>8. **Ugur, A., et al.** (2024). "SynCode: Grammar-Augmented LLM Generation via Syntactic LR Parsing." *arXiv:2403.01632*.</w:t>
-      </w:r>
-    </w:p>
-    <w:p>
-      <w:r>
-        <w:rPr>
-          <w:rFonts w:ascii="Times New Roman" w:hAnsi="Times New Roman"/>
-          <w:sz w:val="20"/>
-        </w:rPr>
-        <w:t>9. **Willard, B. T., &amp; Louf, R.** (2023). "Outlines: Fast and Deterministic Structured Generation." *dottxt Technical Report*.</w:t>
-      </w:r>
-    </w:p>
-    <w:p>
-      <w:r>
-        <w:rPr>
-          <w:rFonts w:ascii="Times New Roman" w:hAnsi="Times New Roman"/>
-          <w:sz w:val="20"/>
-        </w:rPr>
-        <w:t>10. **Allbert, R.** (2013). "VICE: Video Instructions Chess Engine." *Bluefever Software*.</w:t>
+        <w:t>Real-Time CPU Execution: By clamping generation (num_predict: 6), steady-state turn latency drops to 792 ms – 1,119 ms on commodity CPU hardware.</w:t>
       </w:r>
     </w:p>
     <w:sectPr>

</xml_diff>

<commit_message>
docs(docx): retain 100% complete verbatim text from Markdown files with native tables and embedded plots
- Full 9-section verbatim text preserved in docs/research_paper_ieee.docx (168 paragraphs)
- Formats all markdown tables into native Word tables with Navy Blue headers and alternating stripes
- Embeds 4 publication-grade 300-DPI plots at exact section locations
- Synchronized updated full-fidelity documents to Windows Desktop
</commit_message>
<xml_diff>
--- a/docs/comparative_literature_study.docx
+++ b/docs/comparative_literature_study.docx
@@ -4,6 +4,7 @@
   <w:body>
     <w:p>
       <w:pPr>
+        <w:spacing w:before="320" w:after="120"/>
         <w:jc w:val="center"/>
       </w:pPr>
       <w:r>
@@ -11,28 +12,89 @@
           <w:rFonts w:ascii="Times New Roman" w:hAnsi="Times New Roman"/>
           <w:b/>
           <w:color w:val="1F497D"/>
-          <w:sz w:val="32"/>
+          <w:sz w:val="34"/>
         </w:rPr>
         <w:t>Comparative Literature Study: LLM Decision-Making, Move Legality, and Constrained Generation in Formal Rule-Bound Domains</w:t>
       </w:r>
     </w:p>
     <w:p>
       <w:pPr>
+        <w:spacing w:after="100" w:line="276" w:lineRule="auto"/>
         <w:jc w:val="center"/>
       </w:pPr>
       <w:r>
         <w:rPr>
           <w:rFonts w:ascii="Times New Roman" w:hAnsi="Times New Roman"/>
-          <w:i/>
           <w:sz w:val="20"/>
         </w:rPr>
-        <w:t>Arpit Panigrahi</w:t>
-        <w:br/>
-        <w:t>School of Computer Science and Engineering</w:t>
-        <w:br/>
-        <w:t>Vellore Institute of Technology (VIT), Chennai, Tamil Nadu, India</w:t>
-        <w:br/>
-        <w:t>Email: arpitpanigrahi06@gmail.com</w:t>
+      </w:r>
+      <w:r>
+        <w:rPr>
+          <w:rFonts w:ascii="Times New Roman" w:hAnsi="Times New Roman"/>
+          <w:b/>
+          <w:sz w:val="20"/>
+        </w:rPr>
+        <w:t>Author:</w:t>
+      </w:r>
+      <w:r>
+        <w:rPr>
+          <w:rFonts w:ascii="Times New Roman" w:hAnsi="Times New Roman"/>
+          <w:sz w:val="20"/>
+        </w:rPr>
+        <w:t xml:space="preserve"> Arpit Panigrahi</w:t>
+      </w:r>
+    </w:p>
+    <w:p>
+      <w:pPr>
+        <w:spacing w:after="100" w:line="276" w:lineRule="auto"/>
+        <w:jc w:val="center"/>
+      </w:pPr>
+      <w:r>
+        <w:rPr>
+          <w:rFonts w:ascii="Times New Roman" w:hAnsi="Times New Roman"/>
+          <w:sz w:val="20"/>
+        </w:rPr>
+      </w:r>
+      <w:r>
+        <w:rPr>
+          <w:rFonts w:ascii="Times New Roman" w:hAnsi="Times New Roman"/>
+          <w:b/>
+          <w:sz w:val="20"/>
+        </w:rPr>
+        <w:t>Affiliation:</w:t>
+      </w:r>
+      <w:r>
+        <w:rPr>
+          <w:rFonts w:ascii="Times New Roman" w:hAnsi="Times New Roman"/>
+          <w:sz w:val="20"/>
+        </w:rPr>
+        <w:t xml:space="preserve"> School of Computer Science and Engineering, Vellore Institute of Technology (VIT), Chennai, Tamil Nadu, India</w:t>
+      </w:r>
+    </w:p>
+    <w:p>
+      <w:pPr>
+        <w:spacing w:after="100" w:line="276" w:lineRule="auto"/>
+      </w:pPr>
+      <w:r>
+        <w:rPr>
+          <w:rFonts w:ascii="Times New Roman" w:hAnsi="Times New Roman"/>
+          <w:sz w:val="20"/>
+        </w:rPr>
+      </w:r>
+      <w:r>
+        <w:rPr>
+          <w:rFonts w:ascii="Times New Roman" w:hAnsi="Times New Roman"/>
+          <w:b/>
+          <w:sz w:val="20"/>
+        </w:rPr>
+        <w:t>Target Submission:</w:t>
+      </w:r>
+      <w:r>
+        <w:rPr>
+          <w:rFonts w:ascii="Times New Roman" w:hAnsi="Times New Roman"/>
+          <w:sz w:val="20"/>
+        </w:rPr>
+        <w:t xml:space="preserve"> IEEE Transactions on Games / IEEE Conference on Games (CoG) / arXiv Repository</w:t>
       </w:r>
     </w:p>
     <w:p>
@@ -51,14 +113,290 @@
     </w:p>
     <w:p>
       <w:pPr>
-        <w:spacing w:after="80" w:line="276" w:lineRule="auto"/>
+        <w:spacing w:after="100" w:line="276" w:lineRule="auto"/>
       </w:pPr>
       <w:r>
         <w:rPr>
           <w:rFonts w:ascii="Times New Roman" w:hAnsi="Times New Roman"/>
           <w:sz w:val="20"/>
         </w:rPr>
-        <w:t>This comparative study presents a systematic literature survey benchmarking our proposed Prompt-Level Constrained Decoding &amp; Dynamic Move Compression (DMC) framework against seminal works in the field: Google DeepMind (Ruoss et al., NeurIPS 2024), ChessGPT (Feng et al., 2023), Emergent World Models (Li et al., ICLR 2023), and Constrained-Index protocols (Banjade, 2026).</w:t>
+        <w:t>The application of autoregressive Large Language Models (LLMs) to formal, rule-governed games has emerged as a premier benchmark for evaluating artificial reasoning, state tracking, and hallucination suppression. While classical game-playing systems rely on symbolic alpha-beta tree search or deep reinforcement learning value networks, general-purpose LLMs attempt to predict game transitions via tokenized textual representations.</w:t>
+      </w:r>
+    </w:p>
+    <w:p>
+      <w:pPr>
+        <w:spacing w:after="100" w:line="276" w:lineRule="auto"/>
+      </w:pPr>
+      <w:r>
+        <w:rPr>
+          <w:rFonts w:ascii="Times New Roman" w:hAnsi="Times New Roman"/>
+          <w:sz w:val="20"/>
+        </w:rPr>
+        <w:t xml:space="preserve">This comparative study presents a systematic literature survey benchmarking our proposed </w:t>
+      </w:r>
+      <w:r>
+        <w:rPr>
+          <w:rFonts w:ascii="Times New Roman" w:hAnsi="Times New Roman"/>
+          <w:b/>
+          <w:sz w:val="20"/>
+        </w:rPr>
+        <w:t>Prompt-Level Constrained Decoding &amp; Dynamic Move Compression (DMC)</w:t>
+      </w:r>
+      <w:r>
+        <w:rPr>
+          <w:rFonts w:ascii="Times New Roman" w:hAnsi="Times New Roman"/>
+          <w:sz w:val="20"/>
+        </w:rPr>
+        <w:t xml:space="preserve"> framework against seminal works in the field, including:</w:t>
+      </w:r>
+    </w:p>
+    <w:p>
+      <w:pPr>
+        <w:spacing w:after="60" w:line="276" w:lineRule="auto"/>
+      </w:pPr>
+      <w:r>
+        <w:rPr>
+          <w:rFonts w:ascii="Times New Roman" w:hAnsi="Times New Roman"/>
+          <w:sz w:val="20"/>
+        </w:rPr>
+        <w:t xml:space="preserve">1. </w:t>
+      </w:r>
+      <w:r>
+        <w:rPr>
+          <w:rFonts w:ascii="Times New Roman" w:hAnsi="Times New Roman"/>
+          <w:b/>
+          <w:sz w:val="20"/>
+        </w:rPr>
+        <w:t>Google DeepMind's Transformer Policy Networks</w:t>
+      </w:r>
+      <w:r>
+        <w:rPr>
+          <w:rFonts w:ascii="Times New Roman" w:hAnsi="Times New Roman"/>
+          <w:sz w:val="20"/>
+        </w:rPr>
+        <w:t xml:space="preserve"> (*Ruoss et al., 2024 / NeurIPS 2024*),</w:t>
+      </w:r>
+    </w:p>
+    <w:p>
+      <w:pPr>
+        <w:spacing w:after="60" w:line="276" w:lineRule="auto"/>
+      </w:pPr>
+      <w:r>
+        <w:rPr>
+          <w:rFonts w:ascii="Times New Roman" w:hAnsi="Times New Roman"/>
+          <w:sz w:val="20"/>
+        </w:rPr>
+        <w:t xml:space="preserve">2. </w:t>
+      </w:r>
+      <w:r>
+        <w:rPr>
+          <w:rFonts w:ascii="Times New Roman" w:hAnsi="Times New Roman"/>
+          <w:b/>
+          <w:sz w:val="20"/>
+        </w:rPr>
+        <w:t>ChessGPT Domain Pre-Training</w:t>
+      </w:r>
+      <w:r>
+        <w:rPr>
+          <w:rFonts w:ascii="Times New Roman" w:hAnsi="Times New Roman"/>
+          <w:sz w:val="20"/>
+        </w:rPr>
+        <w:t xml:space="preserve"> (*Feng et al., 2023*),</w:t>
+      </w:r>
+    </w:p>
+    <w:p>
+      <w:pPr>
+        <w:spacing w:after="60" w:line="276" w:lineRule="auto"/>
+      </w:pPr>
+      <w:r>
+        <w:rPr>
+          <w:rFonts w:ascii="Times New Roman" w:hAnsi="Times New Roman"/>
+          <w:sz w:val="20"/>
+        </w:rPr>
+        <w:t xml:space="preserve">3. </w:t>
+      </w:r>
+      <w:r>
+        <w:rPr>
+          <w:rFonts w:ascii="Times New Roman" w:hAnsi="Times New Roman"/>
+          <w:b/>
+          <w:sz w:val="20"/>
+        </w:rPr>
+        <w:t>Emergent World Representation Probing</w:t>
+      </w:r>
+      <w:r>
+        <w:rPr>
+          <w:rFonts w:ascii="Times New Roman" w:hAnsi="Times New Roman"/>
+          <w:sz w:val="20"/>
+        </w:rPr>
+        <w:t xml:space="preserve"> (*Li et al., ICLR 2023; Toshniwal et al., 2022*),</w:t>
+      </w:r>
+    </w:p>
+    <w:p>
+      <w:pPr>
+        <w:spacing w:after="60" w:line="276" w:lineRule="auto"/>
+      </w:pPr>
+      <w:r>
+        <w:rPr>
+          <w:rFonts w:ascii="Times New Roman" w:hAnsi="Times New Roman"/>
+          <w:sz w:val="20"/>
+        </w:rPr>
+        <w:t xml:space="preserve">4. </w:t>
+      </w:r>
+      <w:r>
+        <w:rPr>
+          <w:rFonts w:ascii="Times New Roman" w:hAnsi="Times New Roman"/>
+          <w:b/>
+          <w:sz w:val="20"/>
+        </w:rPr>
+        <w:t>Agentic LLM Chess Benchmarks</w:t>
+      </w:r>
+      <w:r>
+        <w:rPr>
+          <w:rFonts w:ascii="Times New Roman" w:hAnsi="Times New Roman"/>
+          <w:sz w:val="20"/>
+        </w:rPr>
+        <w:t xml:space="preserve"> (*Saplin et al., 2024; NeurIPS 2025 FoRLM*),</w:t>
+      </w:r>
+    </w:p>
+    <w:p>
+      <w:pPr>
+        <w:spacing w:after="60" w:line="276" w:lineRule="auto"/>
+      </w:pPr>
+      <w:r>
+        <w:rPr>
+          <w:rFonts w:ascii="Times New Roman" w:hAnsi="Times New Roman"/>
+          <w:sz w:val="20"/>
+        </w:rPr>
+        <w:t xml:space="preserve">5. </w:t>
+      </w:r>
+      <w:r>
+        <w:rPr>
+          <w:rFonts w:ascii="Times New Roman" w:hAnsi="Times New Roman"/>
+          <w:b/>
+          <w:sz w:val="20"/>
+        </w:rPr>
+        <w:t>Constrained-Index Move Selection Protocols</w:t>
+      </w:r>
+      <w:r>
+        <w:rPr>
+          <w:rFonts w:ascii="Times New Roman" w:hAnsi="Times New Roman"/>
+          <w:sz w:val="20"/>
+        </w:rPr>
+        <w:t xml:space="preserve"> (*Banjade, 2026*),</w:t>
+      </w:r>
+    </w:p>
+    <w:p>
+      <w:pPr>
+        <w:spacing w:after="100" w:line="276" w:lineRule="auto"/>
+      </w:pPr>
+      <w:r>
+        <w:rPr>
+          <w:rFonts w:ascii="Times New Roman" w:hAnsi="Times New Roman"/>
+          <w:sz w:val="20"/>
+        </w:rPr>
+        <w:t xml:space="preserve">6. </w:t>
+      </w:r>
+      <w:r>
+        <w:rPr>
+          <w:rFonts w:ascii="Times New Roman" w:hAnsi="Times New Roman"/>
+          <w:b/>
+          <w:sz w:val="20"/>
+        </w:rPr>
+        <w:t>Grammar-Guided Constrained Decoding Engines</w:t>
+      </w:r>
+      <w:r>
+        <w:rPr>
+          <w:rFonts w:ascii="Times New Roman" w:hAnsi="Times New Roman"/>
+          <w:sz w:val="20"/>
+        </w:rPr>
+        <w:t xml:space="preserve"> (</w:t>
+      </w:r>
+      <w:r>
+        <w:rPr>
+          <w:rFonts w:ascii="Times New Roman" w:hAnsi="Times New Roman"/>
+          <w:i/>
+          <w:sz w:val="20"/>
+        </w:rPr>
+        <w:t>SynCode, Ugur et al., 2024; Outlines, Willard &amp; Louf, 2023</w:t>
+      </w:r>
+      <w:r>
+        <w:rPr>
+          <w:rFonts w:ascii="Times New Roman" w:hAnsi="Times New Roman"/>
+          <w:sz w:val="20"/>
+        </w:rPr>
+        <w:t>).</w:t>
+      </w:r>
+    </w:p>
+    <w:p>
+      <w:pPr>
+        <w:spacing w:after="100" w:line="276" w:lineRule="auto"/>
+      </w:pPr>
+      <w:r>
+        <w:rPr>
+          <w:rFonts w:ascii="Times New Roman" w:hAnsi="Times New Roman"/>
+          <w:sz w:val="20"/>
+        </w:rPr>
+        <w:t xml:space="preserve">We analyze empirical discrepancies in </w:t>
+      </w:r>
+      <w:r>
+        <w:rPr>
+          <w:rFonts w:ascii="Times New Roman" w:hAnsi="Times New Roman"/>
+          <w:b/>
+          <w:sz w:val="20"/>
+        </w:rPr>
+        <w:t>legal move adherence</w:t>
+      </w:r>
+      <w:r>
+        <w:rPr>
+          <w:rFonts w:ascii="Times New Roman" w:hAnsi="Times New Roman"/>
+          <w:sz w:val="20"/>
+        </w:rPr>
+        <w:t xml:space="preserve">, </w:t>
+      </w:r>
+      <w:r>
+        <w:rPr>
+          <w:rFonts w:ascii="Times New Roman" w:hAnsi="Times New Roman"/>
+          <w:b/>
+          <w:sz w:val="20"/>
+        </w:rPr>
+        <w:t>Byte-Pair Encoding (BPE) subword boundary effects</w:t>
+      </w:r>
+      <w:r>
+        <w:rPr>
+          <w:rFonts w:ascii="Times New Roman" w:hAnsi="Times New Roman"/>
+          <w:sz w:val="20"/>
+        </w:rPr>
+        <w:t xml:space="preserve">, </w:t>
+      </w:r>
+      <w:r>
+        <w:rPr>
+          <w:rFonts w:ascii="Times New Roman" w:hAnsi="Times New Roman"/>
+          <w:b/>
+          <w:sz w:val="20"/>
+        </w:rPr>
+        <w:t>Stockfish Centipawn Loss (ACPL)</w:t>
+      </w:r>
+      <w:r>
+        <w:rPr>
+          <w:rFonts w:ascii="Times New Roman" w:hAnsi="Times New Roman"/>
+          <w:sz w:val="20"/>
+        </w:rPr>
+        <w:t xml:space="preserve">, and </w:t>
+      </w:r>
+      <w:r>
+        <w:rPr>
+          <w:rFonts w:ascii="Times New Roman" w:hAnsi="Times New Roman"/>
+          <w:b/>
+          <w:sz w:val="20"/>
+        </w:rPr>
+        <w:t>hardware latency profiles</w:t>
+      </w:r>
+      <w:r>
+        <w:rPr>
+          <w:rFonts w:ascii="Times New Roman" w:hAnsi="Times New Roman"/>
+          <w:sz w:val="20"/>
+        </w:rPr>
+        <w:t>, positioning our zero-shot prompt-level architecture within the broader academic landscape.</w:t>
       </w:r>
     </w:p>
     <w:p>
@@ -72,7 +410,255 @@
           <w:color w:val="1F497D"/>
           <w:sz w:val="26"/>
         </w:rPr>
-        <w:t>Master Comparative Literature Matrix</w:t>
+        <w:t>I. Taxonomy of Existing Literature</w:t>
+      </w:r>
+    </w:p>
+    <w:p>
+      <w:pPr>
+        <w:spacing w:after="100" w:line="276" w:lineRule="auto"/>
+      </w:pPr>
+      <w:r>
+        <w:rPr>
+          <w:rFonts w:ascii="Times New Roman" w:hAnsi="Times New Roman"/>
+          <w:sz w:val="20"/>
+        </w:rPr>
+        <w:t>Research investigating LLMs in chess and formal board games spans three fundamental paradigms:</w:t>
+      </w:r>
+    </w:p>
+    <w:p>
+      <w:pPr>
+        <w:spacing w:after="20"/>
+        <w:ind w:left="576"/>
+      </w:pPr>
+      <w:r>
+        <w:rPr>
+          <w:rFonts w:ascii="Courier New" w:hAnsi="Courier New"/>
+          <w:color w:val="3C3C3C"/>
+          <w:sz w:val="17"/>
+        </w:rPr>
+        <w:t xml:space="preserve">                                  ┌─────────────────────────────────────────────────────────┐</w:t>
+      </w:r>
+    </w:p>
+    <w:p>
+      <w:pPr>
+        <w:spacing w:after="20"/>
+        <w:ind w:left="576"/>
+      </w:pPr>
+      <w:r>
+        <w:rPr>
+          <w:rFonts w:ascii="Courier New" w:hAnsi="Courier New"/>
+          <w:color w:val="3C3C3C"/>
+          <w:sz w:val="17"/>
+        </w:rPr>
+        <w:t xml:space="preserve">                                  │           LLM REASONING IN FORMAL DOMAINS               │</w:t>
+      </w:r>
+    </w:p>
+    <w:p>
+      <w:pPr>
+        <w:spacing w:after="20"/>
+        <w:ind w:left="576"/>
+      </w:pPr>
+      <w:r>
+        <w:rPr>
+          <w:rFonts w:ascii="Courier New" w:hAnsi="Courier New"/>
+          <w:color w:val="3C3C3C"/>
+          <w:sz w:val="17"/>
+        </w:rPr>
+        <w:t xml:space="preserve">                                  └────────────────────────────┬────────────────────────────┘</w:t>
+      </w:r>
+    </w:p>
+    <w:p>
+      <w:pPr>
+        <w:spacing w:after="20"/>
+        <w:ind w:left="576"/>
+      </w:pPr>
+      <w:r>
+        <w:rPr>
+          <w:rFonts w:ascii="Courier New" w:hAnsi="Courier New"/>
+          <w:color w:val="3C3C3C"/>
+          <w:sz w:val="17"/>
+        </w:rPr>
+        <w:t xml:space="preserve">                                                               │</w:t>
+      </w:r>
+    </w:p>
+    <w:p>
+      <w:pPr>
+        <w:spacing w:after="20"/>
+        <w:ind w:left="576"/>
+      </w:pPr>
+      <w:r>
+        <w:rPr>
+          <w:rFonts w:ascii="Courier New" w:hAnsi="Courier New"/>
+          <w:color w:val="3C3C3C"/>
+          <w:sz w:val="17"/>
+        </w:rPr>
+        <w:t xml:space="preserve">         ┌─────────────────────────────────────────────────────┼─────────────────────────────────────────────────────┐</w:t>
+      </w:r>
+    </w:p>
+    <w:p>
+      <w:pPr>
+        <w:spacing w:after="20"/>
+        <w:ind w:left="576"/>
+      </w:pPr>
+      <w:r>
+        <w:rPr>
+          <w:rFonts w:ascii="Courier New" w:hAnsi="Courier New"/>
+          <w:color w:val="3C3C3C"/>
+          <w:sz w:val="17"/>
+        </w:rPr>
+        <w:t xml:space="preserve">         ▼                                                     ▼                                                     ▼</w:t>
+      </w:r>
+    </w:p>
+    <w:p>
+      <w:pPr>
+        <w:spacing w:after="20"/>
+        <w:ind w:left="576"/>
+      </w:pPr>
+      <w:r>
+        <w:rPr>
+          <w:rFonts w:ascii="Courier New" w:hAnsi="Courier New"/>
+          <w:color w:val="3C3C3C"/>
+          <w:sz w:val="17"/>
+        </w:rPr>
+        <w:t>┌───────────────────────────────────┐       ┌───────────────────────────────────┐       ┌───────────────────────────────────┐</w:t>
+      </w:r>
+    </w:p>
+    <w:p>
+      <w:pPr>
+        <w:spacing w:after="20"/>
+        <w:ind w:left="576"/>
+      </w:pPr>
+      <w:r>
+        <w:rPr>
+          <w:rFonts w:ascii="Courier New" w:hAnsi="Courier New"/>
+          <w:color w:val="3C3C3C"/>
+          <w:sz w:val="17"/>
+        </w:rPr>
+        <w:t>│   PARADIGM 1: DOMAIN FINE-TUNING  │       │   PARADIGM 2: UNCONSTRAINED LLMs  │       │   PARADIGM 3: CONSTRAINED DECODING│</w:t>
+      </w:r>
+    </w:p>
+    <w:p>
+      <w:pPr>
+        <w:spacing w:after="20"/>
+        <w:ind w:left="576"/>
+      </w:pPr>
+      <w:r>
+        <w:rPr>
+          <w:rFonts w:ascii="Courier New" w:hAnsi="Courier New"/>
+          <w:color w:val="3C3C3C"/>
+          <w:sz w:val="17"/>
+        </w:rPr>
+        <w:t>├───────────────────────────────────┤       ├───────────────────────────────────┤       ├───────────────────────────────────┤</w:t>
+      </w:r>
+    </w:p>
+    <w:p>
+      <w:pPr>
+        <w:spacing w:after="20"/>
+        <w:ind w:left="576"/>
+      </w:pPr>
+      <w:r>
+        <w:rPr>
+          <w:rFonts w:ascii="Courier New" w:hAnsi="Courier New"/>
+          <w:color w:val="3C3C3C"/>
+          <w:sz w:val="17"/>
+        </w:rPr>
+        <w:t>│ • Ruoss et al. (DeepMind, 2024)   │       │ • Saplin et al. (LLM Chess, 2024) │       │ • Banjade (Constrained-Index,2026)│</w:t>
+      </w:r>
+    </w:p>
+    <w:p>
+      <w:pPr>
+        <w:spacing w:after="20"/>
+        <w:ind w:left="576"/>
+      </w:pPr>
+      <w:r>
+        <w:rPr>
+          <w:rFonts w:ascii="Courier New" w:hAnsi="Courier New"/>
+          <w:color w:val="3C3C3C"/>
+          <w:sz w:val="17"/>
+        </w:rPr>
+        <w:t>│ • Feng et al. (ChessGPT, 2023)    │       │ • Stockl (2021) / Carlini (2023)  │       │ • Outlines / SynCode (2023-2024)  │</w:t>
+      </w:r>
+    </w:p>
+    <w:p>
+      <w:pPr>
+        <w:spacing w:after="20"/>
+        <w:ind w:left="576"/>
+      </w:pPr>
+      <w:r>
+        <w:rPr>
+          <w:rFonts w:ascii="Courier New" w:hAnsi="Courier New"/>
+          <w:color w:val="3C3C3C"/>
+          <w:sz w:val="17"/>
+        </w:rPr>
+        <w:t>│ • Toshniwal et al. (2022)         │       │ • Karvonen / Li et al. (ICLR 2023)│       │ • Proposed Prompt-Level DMC (Ours)│</w:t>
+      </w:r>
+    </w:p>
+    <w:p>
+      <w:pPr>
+        <w:spacing w:after="20"/>
+        <w:ind w:left="576"/>
+      </w:pPr>
+      <w:r>
+        <w:rPr>
+          <w:rFonts w:ascii="Courier New" w:hAnsi="Courier New"/>
+          <w:color w:val="3C3C3C"/>
+          <w:sz w:val="17"/>
+        </w:rPr>
+        <w:t>│ • Policy distillation on PGN data │       │ • Free-form PGN/UCI generation    │       │ • Externalized candidate injection│</w:t>
+      </w:r>
+    </w:p>
+    <w:p>
+      <w:pPr>
+        <w:spacing w:after="20"/>
+        <w:ind w:left="576"/>
+      </w:pPr>
+      <w:r>
+        <w:rPr>
+          <w:rFonts w:ascii="Courier New" w:hAnsi="Courier New"/>
+          <w:color w:val="3C3C3C"/>
+          <w:sz w:val="17"/>
+        </w:rPr>
+        <w:t>│ • 10M+ games required             │       │ • 40%–60% legality ceiling        │       │ • 100% legal, zero fine-tuning    │</w:t>
+      </w:r>
+    </w:p>
+    <w:p>
+      <w:pPr>
+        <w:spacing w:after="20"/>
+        <w:ind w:left="576"/>
+      </w:pPr>
+      <w:r>
+        <w:rPr>
+          <w:rFonts w:ascii="Courier New" w:hAnsi="Courier New"/>
+          <w:color w:val="3C3C3C"/>
+          <w:sz w:val="17"/>
+        </w:rPr>
+        <w:t>└───────────────────────────────────┘       └───────────────────────────────────┘       └───────────────────────────────────┘</w:t>
+      </w:r>
+    </w:p>
+    <w:p>
+      <w:pPr>
+        <w:spacing w:before="280" w:after="80"/>
+      </w:pPr>
+      <w:r>
+        <w:rPr>
+          <w:rFonts w:ascii="Times New Roman" w:hAnsi="Times New Roman"/>
+          <w:b/>
+          <w:color w:val="1F497D"/>
+          <w:sz w:val="26"/>
+        </w:rPr>
+        <w:t>II. Comprehensive Comparative Matrix</w:t>
+      </w:r>
+    </w:p>
+    <w:p>
+      <w:pPr>
+        <w:spacing w:after="100" w:line="276" w:lineRule="auto"/>
+      </w:pPr>
+      <w:r>
+        <w:rPr>
+          <w:rFonts w:ascii="Times New Roman" w:hAnsi="Times New Roman"/>
+          <w:sz w:val="20"/>
+        </w:rPr>
+        <w:t>The following master matrix contrasts our framework against representative state-of-the-art literature across eight core dimensions:</w:t>
       </w:r>
     </w:p>
     <w:tbl>
@@ -96,10 +682,10 @@
             <w:vAlign w:val="center"/>
             <w:shd w:fill="1F497D"/>
             <w:tcMar>
-              <w:top w:w="140" w:type="dxa"/>
-              <w:bottom w:w="140" w:type="dxa"/>
-              <w:left w:w="180" w:type="dxa"/>
-              <w:right w:w="180" w:type="dxa"/>
+              <w:top w:w="120" w:type="dxa"/>
+              <w:bottom w:w="120" w:type="dxa"/>
+              <w:left w:w="150" w:type="dxa"/>
+              <w:right w:w="150" w:type="dxa"/>
             </w:tcMar>
           </w:tcPr>
           <w:p>
@@ -111,9 +697,9 @@
                 <w:rFonts w:ascii="Times New Roman" w:hAnsi="Times New Roman"/>
                 <w:b/>
                 <w:color w:val="FFFFFF"/>
-                <w:sz w:val="19"/>
+                <w:sz w:val="18"/>
               </w:rPr>
-              <w:t>Dimension</w:t>
+              <w:t>Dimension / Capability</w:t>
             </w:r>
           </w:p>
         </w:tc>
@@ -123,10 +709,10 @@
             <w:vAlign w:val="center"/>
             <w:shd w:fill="1F497D"/>
             <w:tcMar>
-              <w:top w:w="140" w:type="dxa"/>
-              <w:bottom w:w="140" w:type="dxa"/>
-              <w:left w:w="180" w:type="dxa"/>
-              <w:right w:w="180" w:type="dxa"/>
+              <w:top w:w="120" w:type="dxa"/>
+              <w:bottom w:w="120" w:type="dxa"/>
+              <w:left w:w="150" w:type="dxa"/>
+              <w:right w:w="150" w:type="dxa"/>
             </w:tcMar>
           </w:tcPr>
           <w:p>
@@ -138,9 +724,9 @@
                 <w:rFonts w:ascii="Times New Roman" w:hAnsi="Times New Roman"/>
                 <w:b/>
                 <w:color w:val="FFFFFF"/>
-                <w:sz w:val="19"/>
+                <w:sz w:val="18"/>
               </w:rPr>
-              <w:t>DeepMind (Ruoss, 2024)</w:t>
+              <w:t>DeepMind (Ruoss et al., 2024)</w:t>
             </w:r>
           </w:p>
         </w:tc>
@@ -150,10 +736,10 @@
             <w:vAlign w:val="center"/>
             <w:shd w:fill="1F497D"/>
             <w:tcMar>
-              <w:top w:w="140" w:type="dxa"/>
-              <w:bottom w:w="140" w:type="dxa"/>
-              <w:left w:w="180" w:type="dxa"/>
-              <w:right w:w="180" w:type="dxa"/>
+              <w:top w:w="120" w:type="dxa"/>
+              <w:bottom w:w="120" w:type="dxa"/>
+              <w:left w:w="150" w:type="dxa"/>
+              <w:right w:w="150" w:type="dxa"/>
             </w:tcMar>
           </w:tcPr>
           <w:p>
@@ -165,9 +751,9 @@
                 <w:rFonts w:ascii="Times New Roman" w:hAnsi="Times New Roman"/>
                 <w:b/>
                 <w:color w:val="FFFFFF"/>
-                <w:sz w:val="19"/>
+                <w:sz w:val="18"/>
               </w:rPr>
-              <w:t>ChessGPT (Feng, 2023)</w:t>
+              <w:t>ChessGPT (Feng et al., 2023)</w:t>
             </w:r>
           </w:p>
         </w:tc>
@@ -177,10 +763,10 @@
             <w:vAlign w:val="center"/>
             <w:shd w:fill="1F497D"/>
             <w:tcMar>
-              <w:top w:w="140" w:type="dxa"/>
-              <w:bottom w:w="140" w:type="dxa"/>
-              <w:left w:w="180" w:type="dxa"/>
-              <w:right w:w="180" w:type="dxa"/>
+              <w:top w:w="120" w:type="dxa"/>
+              <w:bottom w:w="120" w:type="dxa"/>
+              <w:left w:w="150" w:type="dxa"/>
+              <w:right w:w="150" w:type="dxa"/>
             </w:tcMar>
           </w:tcPr>
           <w:p>
@@ -192,9 +778,9 @@
                 <w:rFonts w:ascii="Times New Roman" w:hAnsi="Times New Roman"/>
                 <w:b/>
                 <w:color w:val="FFFFFF"/>
-                <w:sz w:val="19"/>
+                <w:sz w:val="18"/>
               </w:rPr>
-              <w:t>LLM Chess (Saplin, 2024)</w:t>
+              <w:t>LLM Chess Benchmark (Saplin, 2024)</w:t>
             </w:r>
           </w:p>
         </w:tc>
@@ -204,10 +790,10 @@
             <w:vAlign w:val="center"/>
             <w:shd w:fill="1F497D"/>
             <w:tcMar>
-              <w:top w:w="140" w:type="dxa"/>
-              <w:bottom w:w="140" w:type="dxa"/>
-              <w:left w:w="180" w:type="dxa"/>
-              <w:right w:w="180" w:type="dxa"/>
+              <w:top w:w="120" w:type="dxa"/>
+              <w:bottom w:w="120" w:type="dxa"/>
+              <w:left w:w="150" w:type="dxa"/>
+              <w:right w:w="150" w:type="dxa"/>
             </w:tcMar>
           </w:tcPr>
           <w:p>
@@ -219,7 +805,7 @@
                 <w:rFonts w:ascii="Times New Roman" w:hAnsi="Times New Roman"/>
                 <w:b/>
                 <w:color w:val="FFFFFF"/>
-                <w:sz w:val="19"/>
+                <w:sz w:val="18"/>
               </w:rPr>
               <w:t>Constrained-Index (Banjade, 2026)</w:t>
             </w:r>
@@ -231,10 +817,10 @@
             <w:vAlign w:val="center"/>
             <w:shd w:fill="1F497D"/>
             <w:tcMar>
-              <w:top w:w="140" w:type="dxa"/>
-              <w:bottom w:w="140" w:type="dxa"/>
-              <w:left w:w="180" w:type="dxa"/>
-              <w:right w:w="180" w:type="dxa"/>
+              <w:top w:w="120" w:type="dxa"/>
+              <w:bottom w:w="120" w:type="dxa"/>
+              <w:left w:w="150" w:type="dxa"/>
+              <w:right w:w="150" w:type="dxa"/>
             </w:tcMar>
           </w:tcPr>
           <w:p>
@@ -246,9 +832,9 @@
                 <w:rFonts w:ascii="Times New Roman" w:hAnsi="Times New Roman"/>
                 <w:b/>
                 <w:color w:val="FFFFFF"/>
-                <w:sz w:val="19"/>
+                <w:sz w:val="18"/>
               </w:rPr>
-              <w:t>Proposed Architecture (Ours)</w:t>
+              <w:t>Proposed Architecture (This Work)</w:t>
             </w:r>
           </w:p>
         </w:tc>
@@ -259,17 +845,21 @@
             <w:tcW w:type="dxa" w:w="1560"/>
             <w:vAlign w:val="center"/>
             <w:tcMar>
-              <w:top w:w="100" w:type="dxa"/>
-              <w:bottom w:w="100" w:type="dxa"/>
-              <w:left w:w="140" w:type="dxa"/>
-              <w:right w:w="140" w:type="dxa"/>
+              <w:top w:w="80" w:type="dxa"/>
+              <w:bottom w:w="80" w:type="dxa"/>
+              <w:left w:w="120" w:type="dxa"/>
+              <w:right w:w="120" w:type="dxa"/>
             </w:tcMar>
           </w:tcPr>
           <w:p>
+            <w:pPr>
+              <w:jc w:val="center"/>
+            </w:pPr>
             <w:r>
               <w:rPr>
                 <w:rFonts w:ascii="Times New Roman" w:hAnsi="Times New Roman"/>
-                <w:sz w:val="18"/>
+                <w:b/>
+                <w:sz w:val="17"/>
               </w:rPr>
               <w:t>Model Category</w:t>
             </w:r>
@@ -280,19 +870,22 @@
             <w:tcW w:type="dxa" w:w="1560"/>
             <w:vAlign w:val="center"/>
             <w:tcMar>
-              <w:top w:w="100" w:type="dxa"/>
-              <w:bottom w:w="100" w:type="dxa"/>
-              <w:left w:w="140" w:type="dxa"/>
-              <w:right w:w="140" w:type="dxa"/>
+              <w:top w:w="80" w:type="dxa"/>
+              <w:bottom w:w="80" w:type="dxa"/>
+              <w:left w:w="120" w:type="dxa"/>
+              <w:right w:w="120" w:type="dxa"/>
             </w:tcMar>
           </w:tcPr>
           <w:p>
+            <w:pPr>
+              <w:jc w:val="left"/>
+            </w:pPr>
             <w:r>
               <w:rPr>
                 <w:rFonts w:ascii="Times New Roman" w:hAnsi="Times New Roman"/>
-                <w:sz w:val="18"/>
+                <w:sz w:val="17"/>
               </w:rPr>
-              <w:t>Domain-Specific Transformer (270M)</w:t>
+              <w:t>Domain-Specific Transformer ($270\text{M}$)</w:t>
             </w:r>
           </w:p>
         </w:tc>
@@ -301,19 +894,22 @@
             <w:tcW w:type="dxa" w:w="1560"/>
             <w:vAlign w:val="center"/>
             <w:tcMar>
-              <w:top w:w="100" w:type="dxa"/>
-              <w:bottom w:w="100" w:type="dxa"/>
-              <w:left w:w="140" w:type="dxa"/>
-              <w:right w:w="140" w:type="dxa"/>
+              <w:top w:w="80" w:type="dxa"/>
+              <w:bottom w:w="80" w:type="dxa"/>
+              <w:left w:w="120" w:type="dxa"/>
+              <w:right w:w="120" w:type="dxa"/>
             </w:tcMar>
           </w:tcPr>
           <w:p>
+            <w:pPr>
+              <w:jc w:val="left"/>
+            </w:pPr>
             <w:r>
               <w:rPr>
                 <w:rFonts w:ascii="Times New Roman" w:hAnsi="Times New Roman"/>
-                <w:sz w:val="18"/>
+                <w:sz w:val="17"/>
               </w:rPr>
-              <w:t>Hybrid Policy-LLM (3B–7B)</w:t>
+              <w:t>Hybrid Policy-LLM ($3\text{B}\text{–}7\text{B}$)</w:t>
             </w:r>
           </w:p>
         </w:tc>
@@ -322,19 +918,22 @@
             <w:tcW w:type="dxa" w:w="1560"/>
             <w:vAlign w:val="center"/>
             <w:tcMar>
-              <w:top w:w="100" w:type="dxa"/>
-              <w:bottom w:w="100" w:type="dxa"/>
-              <w:left w:w="140" w:type="dxa"/>
-              <w:right w:w="140" w:type="dxa"/>
+              <w:top w:w="80" w:type="dxa"/>
+              <w:bottom w:w="80" w:type="dxa"/>
+              <w:left w:w="120" w:type="dxa"/>
+              <w:right w:w="120" w:type="dxa"/>
             </w:tcMar>
           </w:tcPr>
           <w:p>
+            <w:pPr>
+              <w:jc w:val="left"/>
+            </w:pPr>
             <w:r>
               <w:rPr>
                 <w:rFonts w:ascii="Times New Roman" w:hAnsi="Times New Roman"/>
-                <w:sz w:val="18"/>
+                <w:sz w:val="17"/>
               </w:rPr>
-              <w:t>General LLMs (GPT-4, Claude)</w:t>
+              <w:t>General LLMs (GPT-4, Claude, Llama 3)</w:t>
             </w:r>
           </w:p>
         </w:tc>
@@ -343,19 +942,22 @@
             <w:tcW w:type="dxa" w:w="1560"/>
             <w:vAlign w:val="center"/>
             <w:tcMar>
-              <w:top w:w="100" w:type="dxa"/>
-              <w:bottom w:w="100" w:type="dxa"/>
-              <w:left w:w="140" w:type="dxa"/>
-              <w:right w:w="140" w:type="dxa"/>
+              <w:top w:w="80" w:type="dxa"/>
+              <w:bottom w:w="80" w:type="dxa"/>
+              <w:left w:w="120" w:type="dxa"/>
+              <w:right w:w="120" w:type="dxa"/>
             </w:tcMar>
           </w:tcPr>
           <w:p>
+            <w:pPr>
+              <w:jc w:val="left"/>
+            </w:pPr>
             <w:r>
               <w:rPr>
                 <w:rFonts w:ascii="Times New Roman" w:hAnsi="Times New Roman"/>
-                <w:sz w:val="18"/>
+                <w:sz w:val="17"/>
               </w:rPr>
-              <w:t>Open Weights (8B–70B)</w:t>
+              <w:t>Open Weights ($8\text{B}\text{–}70\text{B}$)</w:t>
             </w:r>
           </w:p>
         </w:tc>
@@ -364,19 +966,22 @@
             <w:tcW w:type="dxa" w:w="1560"/>
             <w:vAlign w:val="center"/>
             <w:tcMar>
-              <w:top w:w="100" w:type="dxa"/>
-              <w:bottom w:w="100" w:type="dxa"/>
-              <w:left w:w="140" w:type="dxa"/>
-              <w:right w:w="140" w:type="dxa"/>
+              <w:top w:w="80" w:type="dxa"/>
+              <w:bottom w:w="80" w:type="dxa"/>
+              <w:left w:w="120" w:type="dxa"/>
+              <w:right w:w="120" w:type="dxa"/>
             </w:tcMar>
           </w:tcPr>
           <w:p>
+            <w:pPr>
+              <w:jc w:val="left"/>
+            </w:pPr>
             <w:r>
               <w:rPr>
                 <w:rFonts w:ascii="Times New Roman" w:hAnsi="Times New Roman"/>
-                <w:sz w:val="18"/>
+                <w:sz w:val="17"/>
               </w:rPr>
-              <w:t>Zero-Shot Llama 3.1 (8B)</w:t>
+              <w:t>Zero-Shot Llama 3.1 ($8\text{B}$)</w:t>
             </w:r>
           </w:p>
         </w:tc>
@@ -388,19 +993,23 @@
             <w:vAlign w:val="center"/>
             <w:shd w:fill="F2F4F7"/>
             <w:tcMar>
-              <w:top w:w="100" w:type="dxa"/>
-              <w:bottom w:w="100" w:type="dxa"/>
-              <w:left w:w="140" w:type="dxa"/>
-              <w:right w:w="140" w:type="dxa"/>
+              <w:top w:w="80" w:type="dxa"/>
+              <w:bottom w:w="80" w:type="dxa"/>
+              <w:left w:w="120" w:type="dxa"/>
+              <w:right w:w="120" w:type="dxa"/>
             </w:tcMar>
           </w:tcPr>
           <w:p>
+            <w:pPr>
+              <w:jc w:val="left"/>
+            </w:pPr>
             <w:r>
               <w:rPr>
                 <w:rFonts w:ascii="Times New Roman" w:hAnsi="Times New Roman"/>
-                <w:sz w:val="18"/>
+                <w:b/>
+                <w:sz w:val="17"/>
               </w:rPr>
-              <w:t>Training Required</w:t>
+              <w:t>Training Requirement</w:t>
             </w:r>
           </w:p>
         </w:tc>
@@ -410,19 +1019,22 @@
             <w:vAlign w:val="center"/>
             <w:shd w:fill="F2F4F7"/>
             <w:tcMar>
-              <w:top w:w="100" w:type="dxa"/>
-              <w:bottom w:w="100" w:type="dxa"/>
-              <w:left w:w="140" w:type="dxa"/>
-              <w:right w:w="140" w:type="dxa"/>
+              <w:top w:w="80" w:type="dxa"/>
+              <w:bottom w:w="80" w:type="dxa"/>
+              <w:left w:w="120" w:type="dxa"/>
+              <w:right w:w="120" w:type="dxa"/>
             </w:tcMar>
           </w:tcPr>
           <w:p>
+            <w:pPr>
+              <w:jc w:val="left"/>
+            </w:pPr>
             <w:r>
               <w:rPr>
                 <w:rFonts w:ascii="Times New Roman" w:hAnsi="Times New Roman"/>
-                <w:sz w:val="18"/>
+                <w:sz w:val="17"/>
               </w:rPr>
-              <w:t>10M games (1.5B positions)</w:t>
+              <w:t>Supervised on $10\text{M}$ games ($1.5\text{B}$ states)</w:t>
             </w:r>
           </w:p>
         </w:tc>
@@ -432,19 +1044,22 @@
             <w:vAlign w:val="center"/>
             <w:shd w:fill="F2F4F7"/>
             <w:tcMar>
-              <w:top w:w="100" w:type="dxa"/>
-              <w:bottom w:w="100" w:type="dxa"/>
-              <w:left w:w="140" w:type="dxa"/>
-              <w:right w:w="140" w:type="dxa"/>
+              <w:top w:w="80" w:type="dxa"/>
+              <w:bottom w:w="80" w:type="dxa"/>
+              <w:left w:w="120" w:type="dxa"/>
+              <w:right w:w="120" w:type="dxa"/>
             </w:tcMar>
           </w:tcPr>
           <w:p>
+            <w:pPr>
+              <w:jc w:val="left"/>
+            </w:pPr>
             <w:r>
               <w:rPr>
                 <w:rFonts w:ascii="Times New Roman" w:hAnsi="Times New Roman"/>
-                <w:sz w:val="18"/>
+                <w:sz w:val="17"/>
               </w:rPr>
-              <w:t>Domain pre-training PGN+Text</w:t>
+              <w:t>Domain pre-training on PGN + Text</w:t>
             </w:r>
           </w:p>
         </w:tc>
@@ -454,19 +1069,22 @@
             <w:vAlign w:val="center"/>
             <w:shd w:fill="F2F4F7"/>
             <w:tcMar>
-              <w:top w:w="100" w:type="dxa"/>
-              <w:bottom w:w="100" w:type="dxa"/>
-              <w:left w:w="140" w:type="dxa"/>
-              <w:right w:w="140" w:type="dxa"/>
+              <w:top w:w="80" w:type="dxa"/>
+              <w:bottom w:w="80" w:type="dxa"/>
+              <w:left w:w="120" w:type="dxa"/>
+              <w:right w:w="120" w:type="dxa"/>
             </w:tcMar>
           </w:tcPr>
           <w:p>
+            <w:pPr>
+              <w:jc w:val="left"/>
+            </w:pPr>
             <w:r>
               <w:rPr>
                 <w:rFonts w:ascii="Times New Roman" w:hAnsi="Times New Roman"/>
-                <w:sz w:val="18"/>
+                <w:sz w:val="17"/>
               </w:rPr>
-              <w:t>None (API-based)</w:t>
+              <w:t>None (API-based zero-shot)</w:t>
             </w:r>
           </w:p>
         </w:tc>
@@ -476,17 +1094,20 @@
             <w:vAlign w:val="center"/>
             <w:shd w:fill="F2F4F7"/>
             <w:tcMar>
-              <w:top w:w="100" w:type="dxa"/>
-              <w:bottom w:w="100" w:type="dxa"/>
-              <w:left w:w="140" w:type="dxa"/>
-              <w:right w:w="140" w:type="dxa"/>
+              <w:top w:w="80" w:type="dxa"/>
+              <w:bottom w:w="80" w:type="dxa"/>
+              <w:left w:w="120" w:type="dxa"/>
+              <w:right w:w="120" w:type="dxa"/>
             </w:tcMar>
           </w:tcPr>
           <w:p>
+            <w:pPr>
+              <w:jc w:val="left"/>
+            </w:pPr>
             <w:r>
               <w:rPr>
                 <w:rFonts w:ascii="Times New Roman" w:hAnsi="Times New Roman"/>
-                <w:sz w:val="18"/>
+                <w:sz w:val="17"/>
               </w:rPr>
               <w:t>None (Prompt-based)</w:t>
             </w:r>
@@ -498,19 +1119,23 @@
             <w:vAlign w:val="center"/>
             <w:shd w:fill="F2F4F7"/>
             <w:tcMar>
-              <w:top w:w="100" w:type="dxa"/>
-              <w:bottom w:w="100" w:type="dxa"/>
-              <w:left w:w="140" w:type="dxa"/>
-              <w:right w:w="140" w:type="dxa"/>
+              <w:top w:w="80" w:type="dxa"/>
+              <w:bottom w:w="80" w:type="dxa"/>
+              <w:left w:w="120" w:type="dxa"/>
+              <w:right w:w="120" w:type="dxa"/>
             </w:tcMar>
           </w:tcPr>
           <w:p>
+            <w:pPr>
+              <w:jc w:val="left"/>
+            </w:pPr>
             <w:r>
               <w:rPr>
                 <w:rFonts w:ascii="Times New Roman" w:hAnsi="Times New Roman"/>
-                <w:sz w:val="18"/>
+                <w:b/>
+                <w:sz w:val="17"/>
               </w:rPr>
-              <w:t>None (Zero Fine-Tuning)</w:t>
+              <w:t>None (Zero Fine-Tuning Required)</w:t>
             </w:r>
           </w:p>
         </w:tc>
@@ -521,17 +1146,21 @@
             <w:tcW w:type="dxa" w:w="1560"/>
             <w:vAlign w:val="center"/>
             <w:tcMar>
-              <w:top w:w="100" w:type="dxa"/>
-              <w:bottom w:w="100" w:type="dxa"/>
-              <w:left w:w="140" w:type="dxa"/>
-              <w:right w:w="140" w:type="dxa"/>
+              <w:top w:w="80" w:type="dxa"/>
+              <w:bottom w:w="80" w:type="dxa"/>
+              <w:left w:w="120" w:type="dxa"/>
+              <w:right w:w="120" w:type="dxa"/>
             </w:tcMar>
           </w:tcPr>
           <w:p>
+            <w:pPr>
+              <w:jc w:val="left"/>
+            </w:pPr>
             <w:r>
               <w:rPr>
                 <w:rFonts w:ascii="Times New Roman" w:hAnsi="Times New Roman"/>
-                <w:sz w:val="18"/>
+                <w:b/>
+                <w:sz w:val="17"/>
               </w:rPr>
               <w:t>Move Legality Rate</w:t>
             </w:r>
@@ -542,19 +1171,22 @@
             <w:tcW w:type="dxa" w:w="1560"/>
             <w:vAlign w:val="center"/>
             <w:tcMar>
-              <w:top w:w="100" w:type="dxa"/>
-              <w:bottom w:w="100" w:type="dxa"/>
-              <w:left w:w="140" w:type="dxa"/>
-              <w:right w:w="140" w:type="dxa"/>
+              <w:top w:w="80" w:type="dxa"/>
+              <w:bottom w:w="80" w:type="dxa"/>
+              <w:left w:w="120" w:type="dxa"/>
+              <w:right w:w="120" w:type="dxa"/>
             </w:tcMar>
           </w:tcPr>
           <w:p>
+            <w:pPr>
+              <w:jc w:val="left"/>
+            </w:pPr>
             <w:r>
               <w:rPr>
                 <w:rFonts w:ascii="Times New Roman" w:hAnsi="Times New Roman"/>
-                <w:sz w:val="18"/>
+                <w:sz w:val="17"/>
               </w:rPr>
-              <w:t>&gt;99.9% (Trained Space)</w:t>
+              <w:t>$&gt;99.9\%$ (Trained Action Space)</w:t>
             </w:r>
           </w:p>
         </w:tc>
@@ -563,19 +1195,22 @@
             <w:tcW w:type="dxa" w:w="1560"/>
             <w:vAlign w:val="center"/>
             <w:tcMar>
-              <w:top w:w="100" w:type="dxa"/>
-              <w:bottom w:w="100" w:type="dxa"/>
-              <w:left w:w="140" w:type="dxa"/>
-              <w:right w:w="140" w:type="dxa"/>
+              <w:top w:w="80" w:type="dxa"/>
+              <w:bottom w:w="80" w:type="dxa"/>
+              <w:left w:w="120" w:type="dxa"/>
+              <w:right w:w="120" w:type="dxa"/>
             </w:tcMar>
           </w:tcPr>
           <w:p>
+            <w:pPr>
+              <w:jc w:val="left"/>
+            </w:pPr>
             <w:r>
               <w:rPr>
                 <w:rFonts w:ascii="Times New Roman" w:hAnsi="Times New Roman"/>
-                <w:sz w:val="18"/>
+                <w:sz w:val="17"/>
               </w:rPr>
-              <w:t>85.0% – 92.0%</w:t>
+              <w:t>$85.0\% \text{–} 92.0\%$</w:t>
             </w:r>
           </w:p>
         </w:tc>
@@ -584,19 +1219,22 @@
             <w:tcW w:type="dxa" w:w="1560"/>
             <w:vAlign w:val="center"/>
             <w:tcMar>
-              <w:top w:w="100" w:type="dxa"/>
-              <w:bottom w:w="100" w:type="dxa"/>
-              <w:left w:w="140" w:type="dxa"/>
-              <w:right w:w="140" w:type="dxa"/>
+              <w:top w:w="80" w:type="dxa"/>
+              <w:bottom w:w="80" w:type="dxa"/>
+              <w:left w:w="120" w:type="dxa"/>
+              <w:right w:w="120" w:type="dxa"/>
             </w:tcMar>
           </w:tcPr>
           <w:p>
+            <w:pPr>
+              <w:jc w:val="left"/>
+            </w:pPr>
             <w:r>
               <w:rPr>
                 <w:rFonts w:ascii="Times New Roman" w:hAnsi="Times New Roman"/>
-                <w:sz w:val="18"/>
+                <w:sz w:val="17"/>
               </w:rPr>
-              <w:t>49.0% – 62.0% (Catastrophic)</w:t>
+              <w:t>$49.0\% \text{–} 62.0\%$ (Catastrophic)</w:t>
             </w:r>
           </w:p>
         </w:tc>
@@ -605,19 +1243,22 @@
             <w:tcW w:type="dxa" w:w="1560"/>
             <w:vAlign w:val="center"/>
             <w:tcMar>
-              <w:top w:w="100" w:type="dxa"/>
-              <w:bottom w:w="100" w:type="dxa"/>
-              <w:left w:w="140" w:type="dxa"/>
-              <w:right w:w="140" w:type="dxa"/>
+              <w:top w:w="80" w:type="dxa"/>
+              <w:bottom w:w="80" w:type="dxa"/>
+              <w:left w:w="120" w:type="dxa"/>
+              <w:right w:w="120" w:type="dxa"/>
             </w:tcMar>
           </w:tcPr>
           <w:p>
+            <w:pPr>
+              <w:jc w:val="left"/>
+            </w:pPr>
             <w:r>
               <w:rPr>
                 <w:rFonts w:ascii="Times New Roman" w:hAnsi="Times New Roman"/>
-                <w:sz w:val="18"/>
+                <w:sz w:val="17"/>
               </w:rPr>
-              <w:t>94.1% – 98.2% (Fallback 5.9%)</w:t>
+              <w:t>$94.1\% \text{–} 98.2\%$ (Fallback rate $5.9\%$)</w:t>
             </w:r>
           </w:p>
         </w:tc>
@@ -626,19 +1267,23 @@
             <w:tcW w:type="dxa" w:w="1560"/>
             <w:vAlign w:val="center"/>
             <w:tcMar>
-              <w:top w:w="100" w:type="dxa"/>
-              <w:bottom w:w="100" w:type="dxa"/>
-              <w:left w:w="140" w:type="dxa"/>
-              <w:right w:w="140" w:type="dxa"/>
+              <w:top w:w="80" w:type="dxa"/>
+              <w:bottom w:w="80" w:type="dxa"/>
+              <w:left w:w="120" w:type="dxa"/>
+              <w:right w:w="120" w:type="dxa"/>
             </w:tcMar>
           </w:tcPr>
           <w:p>
+            <w:pPr>
+              <w:jc w:val="left"/>
+            </w:pPr>
             <w:r>
               <w:rPr>
                 <w:rFonts w:ascii="Times New Roman" w:hAnsi="Times New Roman"/>
-                <w:sz w:val="18"/>
+                <w:b/>
+                <w:sz w:val="17"/>
               </w:rPr>
-              <w:t>100.00% (Deterministic)</w:t>
+              <w:t>$100.00\%$ (Deterministic)</w:t>
             </w:r>
           </w:p>
         </w:tc>
@@ -650,19 +1295,23 @@
             <w:vAlign w:val="center"/>
             <w:shd w:fill="F2F4F7"/>
             <w:tcMar>
-              <w:top w:w="100" w:type="dxa"/>
-              <w:bottom w:w="100" w:type="dxa"/>
-              <w:left w:w="140" w:type="dxa"/>
-              <w:right w:w="140" w:type="dxa"/>
+              <w:top w:w="80" w:type="dxa"/>
+              <w:bottom w:w="80" w:type="dxa"/>
+              <w:left w:w="120" w:type="dxa"/>
+              <w:right w:w="120" w:type="dxa"/>
             </w:tcMar>
           </w:tcPr>
           <w:p>
+            <w:pPr>
+              <w:jc w:val="left"/>
+            </w:pPr>
             <w:r>
               <w:rPr>
                 <w:rFonts w:ascii="Times New Roman" w:hAnsi="Times New Roman"/>
-                <w:sz w:val="18"/>
+                <w:b/>
+                <w:sz w:val="17"/>
               </w:rPr>
-              <w:t>BPE Token Isolation</w:t>
+              <w:t>BPE Subword Isolation</w:t>
             </w:r>
           </w:p>
         </w:tc>
@@ -672,19 +1321,22 @@
             <w:vAlign w:val="center"/>
             <w:shd w:fill="F2F4F7"/>
             <w:tcMar>
-              <w:top w:w="100" w:type="dxa"/>
-              <w:bottom w:w="100" w:type="dxa"/>
-              <w:left w:w="140" w:type="dxa"/>
-              <w:right w:w="140" w:type="dxa"/>
+              <w:top w:w="80" w:type="dxa"/>
+              <w:bottom w:w="80" w:type="dxa"/>
+              <w:left w:w="120" w:type="dxa"/>
+              <w:right w:w="120" w:type="dxa"/>
             </w:tcMar>
           </w:tcPr>
           <w:p>
+            <w:pPr>
+              <w:jc w:val="left"/>
+            </w:pPr>
             <w:r>
               <w:rPr>
                 <w:rFonts w:ascii="Times New Roman" w:hAnsi="Times New Roman"/>
-                <w:sz w:val="18"/>
+                <w:sz w:val="17"/>
               </w:rPr>
-              <w:t>Custom discrete tokens</w:t>
+              <w:t>Custom discrete move tokens</w:t>
             </w:r>
           </w:p>
         </w:tc>
@@ -694,17 +1346,20 @@
             <w:vAlign w:val="center"/>
             <w:shd w:fill="F2F4F7"/>
             <w:tcMar>
-              <w:top w:w="100" w:type="dxa"/>
-              <w:bottom w:w="100" w:type="dxa"/>
-              <w:left w:w="140" w:type="dxa"/>
-              <w:right w:w="140" w:type="dxa"/>
+              <w:top w:w="80" w:type="dxa"/>
+              <w:bottom w:w="80" w:type="dxa"/>
+              <w:left w:w="120" w:type="dxa"/>
+              <w:right w:w="120" w:type="dxa"/>
             </w:tcMar>
           </w:tcPr>
           <w:p>
+            <w:pPr>
+              <w:jc w:val="left"/>
+            </w:pPr>
             <w:r>
               <w:rPr>
                 <w:rFonts w:ascii="Times New Roman" w:hAnsi="Times New Roman"/>
-                <w:sz w:val="18"/>
+                <w:sz w:val="17"/>
               </w:rPr>
               <w:t>Standard sentence tokenizer</w:t>
             </w:r>
@@ -716,19 +1371,22 @@
             <w:vAlign w:val="center"/>
             <w:shd w:fill="F2F4F7"/>
             <w:tcMar>
-              <w:top w:w="100" w:type="dxa"/>
-              <w:bottom w:w="100" w:type="dxa"/>
-              <w:left w:w="140" w:type="dxa"/>
-              <w:right w:w="140" w:type="dxa"/>
+              <w:top w:w="80" w:type="dxa"/>
+              <w:bottom w:w="80" w:type="dxa"/>
+              <w:left w:w="120" w:type="dxa"/>
+              <w:right w:w="120" w:type="dxa"/>
             </w:tcMar>
           </w:tcPr>
           <w:p>
+            <w:pPr>
+              <w:jc w:val="left"/>
+            </w:pPr>
             <w:r>
               <w:rPr>
                 <w:rFonts w:ascii="Times New Roman" w:hAnsi="Times New Roman"/>
-                <w:sz w:val="18"/>
+                <w:sz w:val="17"/>
               </w:rPr>
-              <w:t>Not addressed (Merged)</w:t>
+              <w:t>Not addressed (Frequent merges)</w:t>
             </w:r>
           </w:p>
         </w:tc>
@@ -738,19 +1396,22 @@
             <w:vAlign w:val="center"/>
             <w:shd w:fill="F2F4F7"/>
             <w:tcMar>
-              <w:top w:w="100" w:type="dxa"/>
-              <w:bottom w:w="100" w:type="dxa"/>
-              <w:left w:w="140" w:type="dxa"/>
-              <w:right w:w="140" w:type="dxa"/>
+              <w:top w:w="80" w:type="dxa"/>
+              <w:bottom w:w="80" w:type="dxa"/>
+              <w:left w:w="120" w:type="dxa"/>
+              <w:right w:w="120" w:type="dxa"/>
             </w:tcMar>
           </w:tcPr>
           <w:p>
+            <w:pPr>
+              <w:jc w:val="left"/>
+            </w:pPr>
             <w:r>
               <w:rPr>
                 <w:rFonts w:ascii="Times New Roman" w:hAnsi="Times New Roman"/>
-                <w:sz w:val="18"/>
+                <w:sz w:val="17"/>
               </w:rPr>
-              <w:t>Numerical indices (0..N)</w:t>
+              <w:t>Numerical indices ($0\dots N$)</w:t>
             </w:r>
           </w:p>
         </w:tc>
@@ -760,19 +1421,23 @@
             <w:vAlign w:val="center"/>
             <w:shd w:fill="F2F4F7"/>
             <w:tcMar>
-              <w:top w:w="100" w:type="dxa"/>
-              <w:bottom w:w="100" w:type="dxa"/>
-              <w:left w:w="140" w:type="dxa"/>
-              <w:right w:w="140" w:type="dxa"/>
+              <w:top w:w="80" w:type="dxa"/>
+              <w:bottom w:w="80" w:type="dxa"/>
+              <w:left w:w="120" w:type="dxa"/>
+              <w:right w:w="120" w:type="dxa"/>
             </w:tcMar>
           </w:tcPr>
           <w:p>
+            <w:pPr>
+              <w:jc w:val="left"/>
+            </w:pPr>
             <w:r>
               <w:rPr>
                 <w:rFonts w:ascii="Times New Roman" w:hAnsi="Times New Roman"/>
-                <w:sz w:val="18"/>
+                <w:b/>
+                <w:sz w:val="17"/>
               </w:rPr>
-              <w:t>Quote-Delimited Atomic Walls</w:t>
+              <w:t>Quote-Delimited Atomic Attention Barriers</w:t>
             </w:r>
           </w:p>
         </w:tc>
@@ -783,17 +1448,21 @@
             <w:tcW w:type="dxa" w:w="1560"/>
             <w:vAlign w:val="center"/>
             <w:tcMar>
-              <w:top w:w="100" w:type="dxa"/>
-              <w:bottom w:w="100" w:type="dxa"/>
-              <w:left w:w="140" w:type="dxa"/>
-              <w:right w:w="140" w:type="dxa"/>
+              <w:top w:w="80" w:type="dxa"/>
+              <w:bottom w:w="80" w:type="dxa"/>
+              <w:left w:w="120" w:type="dxa"/>
+              <w:right w:w="120" w:type="dxa"/>
             </w:tcMar>
           </w:tcPr>
           <w:p>
+            <w:pPr>
+              <w:jc w:val="left"/>
+            </w:pPr>
             <w:r>
               <w:rPr>
                 <w:rFonts w:ascii="Times New Roman" w:hAnsi="Times New Roman"/>
-                <w:sz w:val="18"/>
+                <w:b/>
+                <w:sz w:val="17"/>
               </w:rPr>
               <w:t>Strategic Quality</w:t>
             </w:r>
@@ -804,19 +1473,22 @@
             <w:tcW w:type="dxa" w:w="1560"/>
             <w:vAlign w:val="center"/>
             <w:tcMar>
-              <w:top w:w="100" w:type="dxa"/>
-              <w:bottom w:w="100" w:type="dxa"/>
-              <w:left w:w="140" w:type="dxa"/>
-              <w:right w:w="140" w:type="dxa"/>
+              <w:top w:w="80" w:type="dxa"/>
+              <w:bottom w:w="80" w:type="dxa"/>
+              <w:left w:w="120" w:type="dxa"/>
+              <w:right w:w="120" w:type="dxa"/>
             </w:tcMar>
           </w:tcPr>
           <w:p>
+            <w:pPr>
+              <w:jc w:val="left"/>
+            </w:pPr>
             <w:r>
               <w:rPr>
                 <w:rFonts w:ascii="Times New Roman" w:hAnsi="Times New Roman"/>
-                <w:sz w:val="18"/>
+                <w:sz w:val="17"/>
               </w:rPr>
-              <w:t>Grandmaster Elo 2895</w:t>
+              <w:t>Grandmaster Elo $2895$ (Lichess Blitz)</w:t>
             </w:r>
           </w:p>
         </w:tc>
@@ -825,19 +1497,22 @@
             <w:tcW w:type="dxa" w:w="1560"/>
             <w:vAlign w:val="center"/>
             <w:tcMar>
-              <w:top w:w="100" w:type="dxa"/>
-              <w:bottom w:w="100" w:type="dxa"/>
-              <w:left w:w="140" w:type="dxa"/>
-              <w:right w:w="140" w:type="dxa"/>
+              <w:top w:w="80" w:type="dxa"/>
+              <w:bottom w:w="80" w:type="dxa"/>
+              <w:left w:w="120" w:type="dxa"/>
+              <w:right w:w="120" w:type="dxa"/>
             </w:tcMar>
           </w:tcPr>
           <w:p>
+            <w:pPr>
+              <w:jc w:val="left"/>
+            </w:pPr>
             <w:r>
               <w:rPr>
                 <w:rFonts w:ascii="Times New Roman" w:hAnsi="Times New Roman"/>
-                <w:sz w:val="18"/>
+                <w:sz w:val="17"/>
               </w:rPr>
-              <w:t>Elo ~1500–1800</w:t>
+              <w:t>Elo $\approx 1500 \text{–} 1800$</w:t>
             </w:r>
           </w:p>
         </w:tc>
@@ -846,19 +1521,22 @@
             <w:tcW w:type="dxa" w:w="1560"/>
             <w:vAlign w:val="center"/>
             <w:tcMar>
-              <w:top w:w="100" w:type="dxa"/>
-              <w:bottom w:w="100" w:type="dxa"/>
-              <w:left w:w="140" w:type="dxa"/>
-              <w:right w:w="140" w:type="dxa"/>
+              <w:top w:w="80" w:type="dxa"/>
+              <w:bottom w:w="80" w:type="dxa"/>
+              <w:left w:w="120" w:type="dxa"/>
+              <w:right w:w="120" w:type="dxa"/>
             </w:tcMar>
           </w:tcPr>
           <w:p>
+            <w:pPr>
+              <w:jc w:val="left"/>
+            </w:pPr>
             <w:r>
               <w:rPr>
                 <w:rFonts w:ascii="Times New Roman" w:hAnsi="Times New Roman"/>
-                <w:sz w:val="18"/>
+                <w:sz w:val="17"/>
               </w:rPr>
-              <w:t>Elo &lt;1200 (Frequent aborts)</w:t>
+              <w:t>Elo $&lt;1200$ (Frequent aborts)</w:t>
             </w:r>
           </w:p>
         </w:tc>
@@ -867,19 +1545,22 @@
             <w:tcW w:type="dxa" w:w="1560"/>
             <w:vAlign w:val="center"/>
             <w:tcMar>
-              <w:top w:w="100" w:type="dxa"/>
-              <w:bottom w:w="100" w:type="dxa"/>
-              <w:left w:w="140" w:type="dxa"/>
-              <w:right w:w="140" w:type="dxa"/>
+              <w:top w:w="80" w:type="dxa"/>
+              <w:bottom w:w="80" w:type="dxa"/>
+              <w:left w:w="120" w:type="dxa"/>
+              <w:right w:w="120" w:type="dxa"/>
             </w:tcMar>
           </w:tcPr>
           <w:p>
+            <w:pPr>
+              <w:jc w:val="left"/>
+            </w:pPr>
             <w:r>
               <w:rPr>
                 <w:rFonts w:ascii="Times New Roman" w:hAnsi="Times New Roman"/>
-                <w:sz w:val="18"/>
+                <w:sz w:val="17"/>
               </w:rPr>
-              <w:t>Relative win-rates</w:t>
+              <w:t>Relative win-rates reported</w:t>
             </w:r>
           </w:p>
         </w:tc>
@@ -888,19 +1569,23 @@
             <w:tcW w:type="dxa" w:w="1560"/>
             <w:vAlign w:val="center"/>
             <w:tcMar>
-              <w:top w:w="100" w:type="dxa"/>
-              <w:bottom w:w="100" w:type="dxa"/>
-              <w:left w:w="140" w:type="dxa"/>
-              <w:right w:w="140" w:type="dxa"/>
+              <w:top w:w="80" w:type="dxa"/>
+              <w:bottom w:w="80" w:type="dxa"/>
+              <w:left w:w="120" w:type="dxa"/>
+              <w:right w:w="120" w:type="dxa"/>
             </w:tcMar>
           </w:tcPr>
           <w:p>
+            <w:pPr>
+              <w:jc w:val="left"/>
+            </w:pPr>
             <w:r>
               <w:rPr>
                 <w:rFonts w:ascii="Times New Roman" w:hAnsi="Times New Roman"/>
-                <w:sz w:val="18"/>
+                <w:b/>
+                <w:sz w:val="17"/>
               </w:rPr>
-              <w:t>ACPL ~55.8–67.0 cp (Club Level)</w:t>
+              <w:t>$\text{ACPL} \approx 55.8\text{–}67.0\text{ cp}$ (Club Level)</w:t>
             </w:r>
           </w:p>
         </w:tc>
@@ -912,19 +1597,23 @@
             <w:vAlign w:val="center"/>
             <w:shd w:fill="F2F4F7"/>
             <w:tcMar>
-              <w:top w:w="100" w:type="dxa"/>
-              <w:bottom w:w="100" w:type="dxa"/>
-              <w:left w:w="140" w:type="dxa"/>
-              <w:right w:w="140" w:type="dxa"/>
+              <w:top w:w="80" w:type="dxa"/>
+              <w:bottom w:w="80" w:type="dxa"/>
+              <w:left w:w="120" w:type="dxa"/>
+              <w:right w:w="120" w:type="dxa"/>
             </w:tcMar>
           </w:tcPr>
           <w:p>
+            <w:pPr>
+              <w:jc w:val="left"/>
+            </w:pPr>
             <w:r>
               <w:rPr>
                 <w:rFonts w:ascii="Times New Roman" w:hAnsi="Times New Roman"/>
-                <w:sz w:val="18"/>
+                <w:b/>
+                <w:sz w:val="17"/>
               </w:rPr>
-              <w:t>Survivorship Bias</w:t>
+              <w:t>Survivorship Bias Audit</w:t>
             </w:r>
           </w:p>
         </w:tc>
@@ -934,19 +1623,22 @@
             <w:vAlign w:val="center"/>
             <w:shd w:fill="F2F4F7"/>
             <w:tcMar>
-              <w:top w:w="100" w:type="dxa"/>
-              <w:bottom w:w="100" w:type="dxa"/>
-              <w:left w:w="140" w:type="dxa"/>
-              <w:right w:w="140" w:type="dxa"/>
+              <w:top w:w="80" w:type="dxa"/>
+              <w:bottom w:w="80" w:type="dxa"/>
+              <w:left w:w="120" w:type="dxa"/>
+              <w:right w:w="120" w:type="dxa"/>
             </w:tcMar>
           </w:tcPr>
           <w:p>
+            <w:pPr>
+              <w:jc w:val="left"/>
+            </w:pPr>
             <w:r>
               <w:rPr>
                 <w:rFonts w:ascii="Times New Roman" w:hAnsi="Times New Roman"/>
-                <w:sz w:val="18"/>
+                <w:sz w:val="17"/>
               </w:rPr>
-              <w:t>N/A (Played to end)</w:t>
+              <w:t>N/A (Games evaluated to end)</w:t>
             </w:r>
           </w:p>
         </w:tc>
@@ -956,17 +1648,20 @@
             <w:vAlign w:val="center"/>
             <w:shd w:fill="F2F4F7"/>
             <w:tcMar>
-              <w:top w:w="100" w:type="dxa"/>
-              <w:bottom w:w="100" w:type="dxa"/>
-              <w:left w:w="140" w:type="dxa"/>
-              <w:right w:w="140" w:type="dxa"/>
+              <w:top w:w="80" w:type="dxa"/>
+              <w:bottom w:w="80" w:type="dxa"/>
+              <w:left w:w="120" w:type="dxa"/>
+              <w:right w:w="120" w:type="dxa"/>
             </w:tcMar>
           </w:tcPr>
           <w:p>
+            <w:pPr>
+              <w:jc w:val="center"/>
+            </w:pPr>
             <w:r>
               <w:rPr>
                 <w:rFonts w:ascii="Times New Roman" w:hAnsi="Times New Roman"/>
-                <w:sz w:val="18"/>
+                <w:sz w:val="17"/>
               </w:rPr>
               <w:t>Not analyzed</w:t>
             </w:r>
@@ -978,19 +1673,22 @@
             <w:vAlign w:val="center"/>
             <w:shd w:fill="F2F4F7"/>
             <w:tcMar>
-              <w:top w:w="100" w:type="dxa"/>
-              <w:bottom w:w="100" w:type="dxa"/>
-              <w:left w:w="140" w:type="dxa"/>
-              <w:right w:w="140" w:type="dxa"/>
+              <w:top w:w="80" w:type="dxa"/>
+              <w:bottom w:w="80" w:type="dxa"/>
+              <w:left w:w="120" w:type="dxa"/>
+              <w:right w:w="120" w:type="dxa"/>
             </w:tcMar>
           </w:tcPr>
           <w:p>
+            <w:pPr>
+              <w:jc w:val="left"/>
+            </w:pPr>
             <w:r>
               <w:rPr>
                 <w:rFonts w:ascii="Times New Roman" w:hAnsi="Times New Roman"/>
-                <w:sz w:val="18"/>
+                <w:sz w:val="17"/>
               </w:rPr>
-              <w:t>Confounded by early aborts</w:t>
+              <w:t>Confounded by early game aborts</w:t>
             </w:r>
           </w:p>
         </w:tc>
@@ -1000,19 +1698,22 @@
             <w:vAlign w:val="center"/>
             <w:shd w:fill="F2F4F7"/>
             <w:tcMar>
-              <w:top w:w="100" w:type="dxa"/>
-              <w:bottom w:w="100" w:type="dxa"/>
-              <w:left w:w="140" w:type="dxa"/>
-              <w:right w:w="140" w:type="dxa"/>
+              <w:top w:w="80" w:type="dxa"/>
+              <w:bottom w:w="80" w:type="dxa"/>
+              <w:left w:w="120" w:type="dxa"/>
+              <w:right w:w="120" w:type="dxa"/>
             </w:tcMar>
           </w:tcPr>
           <w:p>
+            <w:pPr>
+              <w:jc w:val="left"/>
+            </w:pPr>
             <w:r>
               <w:rPr>
                 <w:rFonts w:ascii="Times New Roman" w:hAnsi="Times New Roman"/>
-                <w:sz w:val="18"/>
+                <w:sz w:val="17"/>
               </w:rPr>
-              <w:t>Confounded by bad index</w:t>
+              <w:t>Confounded by invalid selections</w:t>
             </w:r>
           </w:p>
         </w:tc>
@@ -1022,17 +1723,21 @@
             <w:vAlign w:val="center"/>
             <w:shd w:fill="F2F4F7"/>
             <w:tcMar>
-              <w:top w:w="100" w:type="dxa"/>
-              <w:bottom w:w="100" w:type="dxa"/>
-              <w:left w:w="140" w:type="dxa"/>
-              <w:right w:w="140" w:type="dxa"/>
+              <w:top w:w="80" w:type="dxa"/>
+              <w:bottom w:w="80" w:type="dxa"/>
+              <w:left w:w="120" w:type="dxa"/>
+              <w:right w:w="120" w:type="dxa"/>
             </w:tcMar>
           </w:tcPr>
           <w:p>
+            <w:pPr>
+              <w:jc w:val="left"/>
+            </w:pPr>
             <w:r>
               <w:rPr>
                 <w:rFonts w:ascii="Times New Roman" w:hAnsi="Times New Roman"/>
-                <w:sz w:val="18"/>
+                <w:b/>
+                <w:sz w:val="17"/>
               </w:rPr>
               <w:t>Explicitly Diagnosed &amp; Documented</w:t>
             </w:r>
@@ -1045,17 +1750,21 @@
             <w:tcW w:type="dxa" w:w="1560"/>
             <w:vAlign w:val="center"/>
             <w:tcMar>
-              <w:top w:w="100" w:type="dxa"/>
-              <w:bottom w:w="100" w:type="dxa"/>
-              <w:left w:w="140" w:type="dxa"/>
-              <w:right w:w="140" w:type="dxa"/>
+              <w:top w:w="80" w:type="dxa"/>
+              <w:bottom w:w="80" w:type="dxa"/>
+              <w:left w:w="120" w:type="dxa"/>
+              <w:right w:w="120" w:type="dxa"/>
             </w:tcMar>
           </w:tcPr>
           <w:p>
+            <w:pPr>
+              <w:jc w:val="left"/>
+            </w:pPr>
             <w:r>
               <w:rPr>
                 <w:rFonts w:ascii="Times New Roman" w:hAnsi="Times New Roman"/>
-                <w:sz w:val="18"/>
+                <w:b/>
+                <w:sz w:val="17"/>
               </w:rPr>
               <w:t>Inference Hardware</w:t>
             </w:r>
@@ -1066,19 +1775,22 @@
             <w:tcW w:type="dxa" w:w="1560"/>
             <w:vAlign w:val="center"/>
             <w:tcMar>
-              <w:top w:w="100" w:type="dxa"/>
-              <w:bottom w:w="100" w:type="dxa"/>
-              <w:left w:w="140" w:type="dxa"/>
-              <w:right w:w="140" w:type="dxa"/>
+              <w:top w:w="80" w:type="dxa"/>
+              <w:bottom w:w="80" w:type="dxa"/>
+              <w:left w:w="120" w:type="dxa"/>
+              <w:right w:w="120" w:type="dxa"/>
             </w:tcMar>
           </w:tcPr>
           <w:p>
+            <w:pPr>
+              <w:jc w:val="left"/>
+            </w:pPr>
             <w:r>
               <w:rPr>
                 <w:rFonts w:ascii="Times New Roman" w:hAnsi="Times New Roman"/>
-                <w:sz w:val="18"/>
+                <w:sz w:val="17"/>
               </w:rPr>
-              <w:t>High-End GPU Clusters</w:t>
+              <w:t>High-end GPU Clusters</w:t>
             </w:r>
           </w:p>
         </w:tc>
@@ -1087,17 +1799,20 @@
             <w:tcW w:type="dxa" w:w="1560"/>
             <w:vAlign w:val="center"/>
             <w:tcMar>
-              <w:top w:w="100" w:type="dxa"/>
-              <w:bottom w:w="100" w:type="dxa"/>
-              <w:left w:w="140" w:type="dxa"/>
-              <w:right w:w="140" w:type="dxa"/>
+              <w:top w:w="80" w:type="dxa"/>
+              <w:bottom w:w="80" w:type="dxa"/>
+              <w:left w:w="120" w:type="dxa"/>
+              <w:right w:w="120" w:type="dxa"/>
             </w:tcMar>
           </w:tcPr>
           <w:p>
+            <w:pPr>
+              <w:jc w:val="left"/>
+            </w:pPr>
             <w:r>
               <w:rPr>
                 <w:rFonts w:ascii="Times New Roman" w:hAnsi="Times New Roman"/>
-                <w:sz w:val="18"/>
+                <w:sz w:val="17"/>
               </w:rPr>
               <w:t>Multi-GPU / TPU Pods</w:t>
             </w:r>
@@ -1108,17 +1823,20 @@
             <w:tcW w:type="dxa" w:w="1560"/>
             <w:vAlign w:val="center"/>
             <w:tcMar>
-              <w:top w:w="100" w:type="dxa"/>
-              <w:bottom w:w="100" w:type="dxa"/>
-              <w:left w:w="140" w:type="dxa"/>
-              <w:right w:w="140" w:type="dxa"/>
+              <w:top w:w="80" w:type="dxa"/>
+              <w:bottom w:w="80" w:type="dxa"/>
+              <w:left w:w="120" w:type="dxa"/>
+              <w:right w:w="120" w:type="dxa"/>
             </w:tcMar>
           </w:tcPr>
           <w:p>
+            <w:pPr>
+              <w:jc w:val="left"/>
+            </w:pPr>
             <w:r>
               <w:rPr>
                 <w:rFonts w:ascii="Times New Roman" w:hAnsi="Times New Roman"/>
-                <w:sz w:val="18"/>
+                <w:sz w:val="17"/>
               </w:rPr>
               <w:t>Cloud API Endpoints</w:t>
             </w:r>
@@ -1129,17 +1847,20 @@
             <w:tcW w:type="dxa" w:w="1560"/>
             <w:vAlign w:val="center"/>
             <w:tcMar>
-              <w:top w:w="100" w:type="dxa"/>
-              <w:bottom w:w="100" w:type="dxa"/>
-              <w:left w:w="140" w:type="dxa"/>
-              <w:right w:w="140" w:type="dxa"/>
+              <w:top w:w="80" w:type="dxa"/>
+              <w:bottom w:w="80" w:type="dxa"/>
+              <w:left w:w="120" w:type="dxa"/>
+              <w:right w:w="120" w:type="dxa"/>
             </w:tcMar>
           </w:tcPr>
           <w:p>
+            <w:pPr>
+              <w:jc w:val="left"/>
+            </w:pPr>
             <w:r>
               <w:rPr>
                 <w:rFonts w:ascii="Times New Roman" w:hAnsi="Times New Roman"/>
-                <w:sz w:val="18"/>
+                <w:sz w:val="17"/>
               </w:rPr>
               <w:t>Cloud GPU Servers</w:t>
             </w:r>
@@ -1150,17 +1871,21 @@
             <w:tcW w:type="dxa" w:w="1560"/>
             <w:vAlign w:val="center"/>
             <w:tcMar>
-              <w:top w:w="100" w:type="dxa"/>
-              <w:bottom w:w="100" w:type="dxa"/>
-              <w:left w:w="140" w:type="dxa"/>
-              <w:right w:w="140" w:type="dxa"/>
+              <w:top w:w="80" w:type="dxa"/>
+              <w:bottom w:w="80" w:type="dxa"/>
+              <w:left w:w="120" w:type="dxa"/>
+              <w:right w:w="120" w:type="dxa"/>
             </w:tcMar>
           </w:tcPr>
           <w:p>
+            <w:pPr>
+              <w:jc w:val="left"/>
+            </w:pPr>
             <w:r>
               <w:rPr>
                 <w:rFonts w:ascii="Times New Roman" w:hAnsi="Times New Roman"/>
-                <w:sz w:val="18"/>
+                <w:b/>
+                <w:sz w:val="17"/>
               </w:rPr>
               <w:t>Commodity CPU &amp; Edge Hardware</w:t>
             </w:r>
@@ -1174,19 +1899,23 @@
             <w:vAlign w:val="center"/>
             <w:shd w:fill="F2F4F7"/>
             <w:tcMar>
-              <w:top w:w="100" w:type="dxa"/>
-              <w:bottom w:w="100" w:type="dxa"/>
-              <w:left w:w="140" w:type="dxa"/>
-              <w:right w:w="140" w:type="dxa"/>
+              <w:top w:w="80" w:type="dxa"/>
+              <w:bottom w:w="80" w:type="dxa"/>
+              <w:left w:w="120" w:type="dxa"/>
+              <w:right w:w="120" w:type="dxa"/>
             </w:tcMar>
           </w:tcPr>
           <w:p>
+            <w:pPr>
+              <w:jc w:val="left"/>
+            </w:pPr>
             <w:r>
               <w:rPr>
                 <w:rFonts w:ascii="Times New Roman" w:hAnsi="Times New Roman"/>
-                <w:sz w:val="18"/>
+                <w:b/>
+                <w:sz w:val="17"/>
               </w:rPr>
-              <w:t>Latency Profile</w:t>
+              <w:t>Latency Profiling</w:t>
             </w:r>
           </w:p>
         </w:tc>
@@ -1196,19 +1925,22 @@
             <w:vAlign w:val="center"/>
             <w:shd w:fill="F2F4F7"/>
             <w:tcMar>
-              <w:top w:w="100" w:type="dxa"/>
-              <w:bottom w:w="100" w:type="dxa"/>
-              <w:left w:w="140" w:type="dxa"/>
-              <w:right w:w="140" w:type="dxa"/>
+              <w:top w:w="80" w:type="dxa"/>
+              <w:bottom w:w="80" w:type="dxa"/>
+              <w:left w:w="120" w:type="dxa"/>
+              <w:right w:w="120" w:type="dxa"/>
             </w:tcMar>
           </w:tcPr>
           <w:p>
+            <w:pPr>
+              <w:jc w:val="left"/>
+            </w:pPr>
             <w:r>
               <w:rPr>
                 <w:rFonts w:ascii="Times New Roman" w:hAnsi="Times New Roman"/>
-                <w:sz w:val="18"/>
+                <w:sz w:val="17"/>
               </w:rPr>
-              <w:t>Feedforward (~15ms)</w:t>
+              <w:t>$O(1)$ Feedforward ($\approx 15\text{ms}$)</w:t>
             </w:r>
           </w:p>
         </w:tc>
@@ -1218,17 +1950,20 @@
             <w:vAlign w:val="center"/>
             <w:shd w:fill="F2F4F7"/>
             <w:tcMar>
-              <w:top w:w="100" w:type="dxa"/>
-              <w:bottom w:w="100" w:type="dxa"/>
-              <w:left w:w="140" w:type="dxa"/>
-              <w:right w:w="140" w:type="dxa"/>
+              <w:top w:w="80" w:type="dxa"/>
+              <w:bottom w:w="80" w:type="dxa"/>
+              <w:left w:w="120" w:type="dxa"/>
+              <w:right w:w="120" w:type="dxa"/>
             </w:tcMar>
           </w:tcPr>
           <w:p>
+            <w:pPr>
+              <w:jc w:val="left"/>
+            </w:pPr>
             <w:r>
               <w:rPr>
                 <w:rFonts w:ascii="Times New Roman" w:hAnsi="Times New Roman"/>
-                <w:sz w:val="18"/>
+                <w:sz w:val="17"/>
               </w:rPr>
               <w:t>Not profiled on CPU</w:t>
             </w:r>
@@ -1240,19 +1975,22 @@
             <w:vAlign w:val="center"/>
             <w:shd w:fill="F2F4F7"/>
             <w:tcMar>
-              <w:top w:w="100" w:type="dxa"/>
-              <w:bottom w:w="100" w:type="dxa"/>
-              <w:left w:w="140" w:type="dxa"/>
-              <w:right w:w="140" w:type="dxa"/>
+              <w:top w:w="80" w:type="dxa"/>
+              <w:bottom w:w="80" w:type="dxa"/>
+              <w:left w:w="120" w:type="dxa"/>
+              <w:right w:w="120" w:type="dxa"/>
             </w:tcMar>
           </w:tcPr>
           <w:p>
+            <w:pPr>
+              <w:jc w:val="left"/>
+            </w:pPr>
             <w:r>
               <w:rPr>
                 <w:rFonts w:ascii="Times New Roman" w:hAnsi="Times New Roman"/>
-                <w:sz w:val="18"/>
+                <w:sz w:val="17"/>
               </w:rPr>
-              <w:t>Network queue dominated</w:t>
+              <w:t>Network round-trip dominated</w:t>
             </w:r>
           </w:p>
         </w:tc>
@@ -1262,17 +2000,20 @@
             <w:vAlign w:val="center"/>
             <w:shd w:fill="F2F4F7"/>
             <w:tcMar>
-              <w:top w:w="100" w:type="dxa"/>
-              <w:bottom w:w="100" w:type="dxa"/>
-              <w:left w:w="140" w:type="dxa"/>
-              <w:right w:w="140" w:type="dxa"/>
+              <w:top w:w="80" w:type="dxa"/>
+              <w:bottom w:w="80" w:type="dxa"/>
+              <w:left w:w="120" w:type="dxa"/>
+              <w:right w:w="120" w:type="dxa"/>
             </w:tcMar>
           </w:tcPr>
           <w:p>
+            <w:pPr>
+              <w:jc w:val="center"/>
+            </w:pPr>
             <w:r>
               <w:rPr>
                 <w:rFonts w:ascii="Times New Roman" w:hAnsi="Times New Roman"/>
-                <w:sz w:val="18"/>
+                <w:sz w:val="17"/>
               </w:rPr>
               <w:t>Not decomposed</w:t>
             </w:r>
@@ -1284,24 +2025,33 @@
             <w:vAlign w:val="center"/>
             <w:shd w:fill="F2F4F7"/>
             <w:tcMar>
-              <w:top w:w="100" w:type="dxa"/>
-              <w:bottom w:w="100" w:type="dxa"/>
-              <w:left w:w="140" w:type="dxa"/>
-              <w:right w:w="140" w:type="dxa"/>
+              <w:top w:w="80" w:type="dxa"/>
+              <w:bottom w:w="80" w:type="dxa"/>
+              <w:left w:w="120" w:type="dxa"/>
+              <w:right w:w="120" w:type="dxa"/>
             </w:tcMar>
           </w:tcPr>
           <w:p>
+            <w:pPr>
+              <w:jc w:val="left"/>
+            </w:pPr>
             <w:r>
               <w:rPr>
                 <w:rFonts w:ascii="Times New Roman" w:hAnsi="Times New Roman"/>
-                <w:sz w:val="18"/>
+                <w:b/>
+                <w:sz w:val="17"/>
               </w:rPr>
-              <w:t>Decomposed: 18s Cold / 792ms Warm</w:t>
+              <w:t>Decomposed: $18\text{s}$ Cold vs $792\text{ms}$ Warm</w:t>
             </w:r>
           </w:p>
         </w:tc>
       </w:tr>
     </w:tbl>
+    <w:p>
+      <w:pPr>
+        <w:spacing w:after="120"/>
+      </w:pPr>
+    </w:p>
     <w:p>
       <w:pPr>
         <w:spacing w:before="280" w:after="80"/>
@@ -1313,59 +2063,1354 @@
           <w:color w:val="1F497D"/>
           <w:sz w:val="26"/>
         </w:rPr>
-        <w:t>Key Theoretical Findings &amp; Takeaways</w:t>
+        <w:t>III. Deep-Dive Dimension-by-Dimension Analysis</w:t>
+      </w:r>
+    </w:p>
+    <w:p>
+      <w:pPr>
+        <w:spacing w:before="200" w:after="60"/>
+      </w:pPr>
+      <w:r>
+        <w:rPr>
+          <w:rFonts w:ascii="Times New Roman" w:hAnsi="Times New Roman"/>
+          <w:b/>
+          <w:color w:val="282828"/>
+          <w:sz w:val="22"/>
+        </w:rPr>
+        <w:t>1. Move Legality &amp; The Hallucination Problem</w:t>
       </w:r>
     </w:p>
     <w:p>
       <w:pPr>
         <w:pStyle w:val="ListBullet"/>
-        <w:spacing w:after="40" w:line="264" w:lineRule="auto"/>
+        <w:spacing w:after="40" w:line="276" w:lineRule="auto"/>
       </w:pPr>
       <w:r>
         <w:rPr>
           <w:rFonts w:ascii="Times New Roman" w:hAnsi="Times New Roman"/>
           <w:sz w:val="20"/>
         </w:rPr>
-        <w:t>Zero Fine-Tuning vs. Monolithic Pre-Training: DeepMind required training on 10M games; our prompt-level injection achieves 100% legality on zero-shot general LLMs without training.</w:t>
+      </w:r>
+      <w:r>
+        <w:rPr>
+          <w:rFonts w:ascii="Times New Roman" w:hAnsi="Times New Roman"/>
+          <w:b/>
+          <w:sz w:val="20"/>
+        </w:rPr>
+        <w:t>Literature Consensus:</w:t>
+      </w:r>
+      <w:r>
+        <w:rPr>
+          <w:rFonts w:ascii="Times New Roman" w:hAnsi="Times New Roman"/>
+          <w:sz w:val="20"/>
+        </w:rPr>
+        <w:t xml:space="preserve"> General-purpose autoregressive models (GPT-3.5, GPT-4, Llama 2, Llama 3) evaluated in free-form generation hit an impenetrable legality ceiling between $49.0\%$ and $62.0\%$ (*Stockl, 2021; Saplin, 2024*). Without external constraints, $100\%$ of unconstrained games abort within 1 to 3 turns due to physical rule violations (e.g. bishops moving through pawns).</w:t>
       </w:r>
     </w:p>
     <w:p>
       <w:pPr>
         <w:pStyle w:val="ListBullet"/>
-        <w:spacing w:after="40" w:line="264" w:lineRule="auto"/>
+        <w:spacing w:after="40" w:line="276" w:lineRule="auto"/>
       </w:pPr>
       <w:r>
         <w:rPr>
           <w:rFonts w:ascii="Times New Roman" w:hAnsi="Times New Roman"/>
           <w:sz w:val="20"/>
         </w:rPr>
-        <w:t>The BPE Tokenizer Discovery: Unquoted move strings collapse to 73.3% legality due to Byte-Pair Encoding merges; quotation delimiters act as physical attention barriers restoring 100% legality.</w:t>
+      </w:r>
+      <w:r>
+        <w:rPr>
+          <w:rFonts w:ascii="Times New Roman" w:hAnsi="Times New Roman"/>
+          <w:b/>
+          <w:sz w:val="20"/>
+        </w:rPr>
+        <w:t>DeepMind Approach (*Ruoss et al.*):</w:t>
+      </w:r>
+      <w:r>
+        <w:rPr>
+          <w:rFonts w:ascii="Times New Roman" w:hAnsi="Times New Roman"/>
+          <w:sz w:val="20"/>
+        </w:rPr>
+        <w:t xml:space="preserve"> Ruoss et al. overcame this by training a custom 270M-parameter transformer directly on Stockfish 16 action-values across 10 million games. While achieving Elo 2895, this requires massive domain-specific training infrastructure and cannot be generalized to standard instruction-following LLMs.</w:t>
       </w:r>
     </w:p>
     <w:p>
       <w:pPr>
         <w:pStyle w:val="ListBullet"/>
-        <w:spacing w:after="40" w:line="264" w:lineRule="auto"/>
+        <w:spacing w:after="40" w:line="276" w:lineRule="auto"/>
       </w:pPr>
       <w:r>
         <w:rPr>
           <w:rFonts w:ascii="Times New Roman" w:hAnsi="Times New Roman"/>
           <w:sz w:val="20"/>
         </w:rPr>
-        <w:t>Survivorship Bias in ACPL: We proved unconstrained models only appear to have low ACPL (14 cp) because they abort on move 2 after playing book moves; constrained models sustain authentic 67 cp across full games.</w:t>
+      </w:r>
+      <w:r>
+        <w:rPr>
+          <w:rFonts w:ascii="Times New Roman" w:hAnsi="Times New Roman"/>
+          <w:b/>
+          <w:sz w:val="20"/>
+        </w:rPr>
+        <w:t>Our Finding &amp; Contribution:</w:t>
+      </w:r>
+      <w:r>
+        <w:rPr>
+          <w:rFonts w:ascii="Times New Roman" w:hAnsi="Times New Roman"/>
+          <w:sz w:val="20"/>
+        </w:rPr>
+        <w:t xml:space="preserve"> We demonstrate that expensive pre-training is completely unnecessary for $100\%$ legal compliance. By externalizing the valid state transition set into the prompt context, standard open-weights Llama 3.1 8B achieves </w:t>
+      </w:r>
+      <w:r>
+        <w:rPr>
+          <w:rFonts w:ascii="Times New Roman" w:hAnsi="Times New Roman"/>
+          <w:b/>
+          <w:sz w:val="20"/>
+        </w:rPr>
+        <w:t>$100.00\%$ zero-hallucination execution</w:t>
+      </w:r>
+      <w:r>
+        <w:rPr>
+          <w:rFonts w:ascii="Times New Roman" w:hAnsi="Times New Roman"/>
+          <w:sz w:val="20"/>
+        </w:rPr>
+        <w:t xml:space="preserve"> without modifying a single model weight.</w:t>
+      </w:r>
+    </w:p>
+    <w:p>
+      <w:pPr>
+        <w:spacing w:before="200" w:after="60"/>
+      </w:pPr>
+      <w:r>
+        <w:rPr>
+          <w:rFonts w:ascii="Times New Roman" w:hAnsi="Times New Roman"/>
+          <w:b/>
+          <w:color w:val="282828"/>
+          <w:sz w:val="22"/>
+        </w:rPr>
+        <w:t>2. Byte-Pair Encoding (BPE) Tokenizer Artifacts</w:t>
       </w:r>
     </w:p>
     <w:p>
       <w:pPr>
         <w:pStyle w:val="ListBullet"/>
-        <w:spacing w:after="40" w:line="264" w:lineRule="auto"/>
+        <w:spacing w:after="40" w:line="276" w:lineRule="auto"/>
       </w:pPr>
       <w:r>
         <w:rPr>
           <w:rFonts w:ascii="Times New Roman" w:hAnsi="Times New Roman"/>
           <w:sz w:val="20"/>
         </w:rPr>
-        <w:t>Real-Time CPU Execution: By clamping generation (num_predict: 6), steady-state turn latency drops to 792 ms – 1,119 ms on commodity CPU hardware.</w:t>
+      </w:r>
+      <w:r>
+        <w:rPr>
+          <w:rFonts w:ascii="Times New Roman" w:hAnsi="Times New Roman"/>
+          <w:b/>
+          <w:sz w:val="20"/>
+        </w:rPr>
+        <w:t>Literature Limitation:</w:t>
+      </w:r>
+      <w:r>
+        <w:rPr>
+          <w:rFonts w:ascii="Times New Roman" w:hAnsi="Times New Roman"/>
+          <w:sz w:val="20"/>
+        </w:rPr>
+        <w:t xml:space="preserve"> Prior works treating chess as natural language (*Toshniwal et al., 2022; Feng et al., 2023*) frequently observed move corruptions but attributed them vaguely to "model confusion" or "state tracking degradation." Banjade (2026) attempted to avoid string tokenization by mapping legal moves to integer indices ($1, 2, \dots N$), which reduced errors but introduced a secondary indexing hallucination mode (selecting indices out of bounds).</w:t>
+      </w:r>
+    </w:p>
+    <w:p>
+      <w:pPr>
+        <w:pStyle w:val="ListBullet"/>
+        <w:spacing w:after="40" w:line="276" w:lineRule="auto"/>
+      </w:pPr>
+      <w:r>
+        <w:rPr>
+          <w:rFonts w:ascii="Times New Roman" w:hAnsi="Times New Roman"/>
+          <w:sz w:val="20"/>
+        </w:rPr>
+      </w:r>
+      <w:r>
+        <w:rPr>
+          <w:rFonts w:ascii="Times New Roman" w:hAnsi="Times New Roman"/>
+          <w:b/>
+          <w:sz w:val="20"/>
+        </w:rPr>
+        <w:t>Our Discovery:</w:t>
+      </w:r>
+      <w:r>
+        <w:rPr>
+          <w:rFonts w:ascii="Times New Roman" w:hAnsi="Times New Roman"/>
+          <w:sz w:val="20"/>
+        </w:rPr>
+        <w:t xml:space="preserve"> We isolate the root cause to </w:t>
+      </w:r>
+      <w:r>
+        <w:rPr>
+          <w:rFonts w:ascii="Times New Roman" w:hAnsi="Times New Roman"/>
+          <w:b/>
+          <w:sz w:val="20"/>
+        </w:rPr>
+        <w:t>Byte-Pair Encoding subword merging</w:t>
+      </w:r>
+      <w:r>
+        <w:rPr>
+          <w:rFonts w:ascii="Times New Roman" w:hAnsi="Times New Roman"/>
+          <w:sz w:val="20"/>
+        </w:rPr>
+        <w:t xml:space="preserve">. When candidate moves are formatted as bare space-delimited text (`a7a5 b7b5`), the BPE vocabulary binds adjacent characters across tokens, generating non-existent coordinate subwords (`b72`, `e72-3`) and dropping legality to </w:t>
+      </w:r>
+      <w:r>
+        <w:rPr>
+          <w:rFonts w:ascii="Times New Roman" w:hAnsi="Times New Roman"/>
+          <w:b/>
+          <w:sz w:val="20"/>
+        </w:rPr>
+        <w:t>$73.3\%$</w:t>
+      </w:r>
+      <w:r>
+        <w:rPr>
+          <w:rFonts w:ascii="Times New Roman" w:hAnsi="Times New Roman"/>
+          <w:sz w:val="20"/>
+        </w:rPr>
+        <w:t>.</w:t>
+      </w:r>
+    </w:p>
+    <w:p>
+      <w:pPr>
+        <w:pStyle w:val="ListBullet"/>
+        <w:spacing w:after="40" w:line="276" w:lineRule="auto"/>
+      </w:pPr>
+      <w:r>
+        <w:rPr>
+          <w:rFonts w:ascii="Times New Roman" w:hAnsi="Times New Roman"/>
+          <w:sz w:val="20"/>
+        </w:rPr>
+      </w:r>
+      <w:r>
+        <w:rPr>
+          <w:rFonts w:ascii="Times New Roman" w:hAnsi="Times New Roman"/>
+          <w:b/>
+          <w:sz w:val="20"/>
+        </w:rPr>
+        <w:t>The Quoted Atomic Solution:</w:t>
+      </w:r>
+      <w:r>
+        <w:rPr>
+          <w:rFonts w:ascii="Times New Roman" w:hAnsi="Times New Roman"/>
+          <w:sz w:val="20"/>
+        </w:rPr>
+        <w:t xml:space="preserve"> We prove that enclosing candidate moves in quotation delimiters (`"a7a5", "b7b5"`) inserts delimiter tokens (`token_id: 1`) that act as physical attention barriers in the transformer's self-attention matrix, forcing the tokenizer to process each move as an indivisible atomic entity and locking legality at </w:t>
+      </w:r>
+      <w:r>
+        <w:rPr>
+          <w:rFonts w:ascii="Times New Roman" w:hAnsi="Times New Roman"/>
+          <w:b/>
+          <w:sz w:val="20"/>
+        </w:rPr>
+        <w:t>$100.0\%$</w:t>
+      </w:r>
+      <w:r>
+        <w:rPr>
+          <w:rFonts w:ascii="Times New Roman" w:hAnsi="Times New Roman"/>
+          <w:sz w:val="20"/>
+        </w:rPr>
+        <w:t>.</w:t>
+      </w:r>
+    </w:p>
+    <w:p>
+      <w:pPr>
+        <w:spacing w:before="200" w:after="60"/>
+      </w:pPr>
+      <w:r>
+        <w:rPr>
+          <w:rFonts w:ascii="Times New Roman" w:hAnsi="Times New Roman"/>
+          <w:b/>
+          <w:color w:val="282828"/>
+          <w:sz w:val="22"/>
+        </w:rPr>
+        <w:t>3. Positional Quality &amp; The "Survivorship Bias" Trap</w:t>
+      </w:r>
+    </w:p>
+    <w:p>
+      <w:pPr>
+        <w:pStyle w:val="ListBullet"/>
+        <w:spacing w:after="40" w:line="276" w:lineRule="auto"/>
+      </w:pPr>
+      <w:r>
+        <w:rPr>
+          <w:rFonts w:ascii="Times New Roman" w:hAnsi="Times New Roman"/>
+          <w:sz w:val="20"/>
+        </w:rPr>
+      </w:r>
+      <w:r>
+        <w:rPr>
+          <w:rFonts w:ascii="Times New Roman" w:hAnsi="Times New Roman"/>
+          <w:b/>
+          <w:sz w:val="20"/>
+        </w:rPr>
+        <w:t>Literature Anomaly:</w:t>
+      </w:r>
+      <w:r>
+        <w:rPr>
+          <w:rFonts w:ascii="Times New Roman" w:hAnsi="Times New Roman"/>
+          <w:sz w:val="20"/>
+        </w:rPr>
+        <w:t xml:space="preserve"> Multiple benchmark studies have reported puzzlingly low error rates or high move agreement for greedy unconstrained models ($T=0.0 \text{–} 0.2$) during the opening phase.</w:t>
+      </w:r>
+    </w:p>
+    <w:p>
+      <w:pPr>
+        <w:pStyle w:val="ListBullet"/>
+        <w:spacing w:after="40" w:line="276" w:lineRule="auto"/>
+      </w:pPr>
+      <w:r>
+        <w:rPr>
+          <w:rFonts w:ascii="Times New Roman" w:hAnsi="Times New Roman"/>
+          <w:sz w:val="20"/>
+        </w:rPr>
+      </w:r>
+      <w:r>
+        <w:rPr>
+          <w:rFonts w:ascii="Times New Roman" w:hAnsi="Times New Roman"/>
+          <w:b/>
+          <w:sz w:val="20"/>
+        </w:rPr>
+        <w:t>Our Finding:</w:t>
+      </w:r>
+      <w:r>
+        <w:rPr>
+          <w:rFonts w:ascii="Times New Roman" w:hAnsi="Times New Roman"/>
+          <w:sz w:val="20"/>
+        </w:rPr>
+        <w:t xml:space="preserve"> We are the first to formally diagnose and document this as </w:t>
+      </w:r>
+      <w:r>
+        <w:rPr>
+          <w:rFonts w:ascii="Times New Roman" w:hAnsi="Times New Roman"/>
+          <w:b/>
+          <w:sz w:val="20"/>
+        </w:rPr>
+        <w:t>Survivorship Bias in Centipawn Loss (ACPL)</w:t>
+      </w:r>
+      <w:r>
+        <w:rPr>
+          <w:rFonts w:ascii="Times New Roman" w:hAnsi="Times New Roman"/>
+          <w:sz w:val="20"/>
+        </w:rPr>
+        <w:t>:</w:t>
+      </w:r>
+    </w:p>
+    <w:p>
+      <w:pPr>
+        <w:pStyle w:val="ListBullet"/>
+        <w:spacing w:after="40" w:line="276" w:lineRule="auto"/>
+      </w:pPr>
+      <w:r>
+        <w:rPr>
+          <w:rFonts w:ascii="Times New Roman" w:hAnsi="Times New Roman"/>
+          <w:sz w:val="20"/>
+        </w:rPr>
+        <w:t>At $T=0.2$, unconstrained Llama 3.1 outputs memorized opening book theory (`e7e5` or `g8f6`) on Turn 1, scoring an apparent $\text{ACPL} = 14.3\text{ cp}$.</w:t>
+      </w:r>
+    </w:p>
+    <w:p>
+      <w:pPr>
+        <w:pStyle w:val="ListBullet"/>
+        <w:spacing w:after="40" w:line="276" w:lineRule="auto"/>
+      </w:pPr>
+      <w:r>
+        <w:rPr>
+          <w:rFonts w:ascii="Times New Roman" w:hAnsi="Times New Roman"/>
+          <w:sz w:val="20"/>
+        </w:rPr>
+        <w:t>However, on Turn 2, the model generates an illegal move and immediately aborts the game in $76.7\%$ of trials.</w:t>
+      </w:r>
+    </w:p>
+    <w:p>
+      <w:pPr>
+        <w:pStyle w:val="ListBullet"/>
+        <w:spacing w:after="40" w:line="276" w:lineRule="auto"/>
+      </w:pPr>
+      <w:r>
+        <w:rPr>
+          <w:rFonts w:ascii="Times New Roman" w:hAnsi="Times New Roman"/>
+          <w:sz w:val="20"/>
+        </w:rPr>
+        <w:t>Because Stockfish can only calculate ACPL on *legal* moves, the aggregate metric reflects only Turn 1!</w:t>
+      </w:r>
+    </w:p>
+    <w:p>
+      <w:pPr>
+        <w:pStyle w:val="ListBullet"/>
+        <w:spacing w:after="40" w:line="276" w:lineRule="auto"/>
+      </w:pPr>
+      <w:r>
+        <w:rPr>
+          <w:rFonts w:ascii="Times New Roman" w:hAnsi="Times New Roman"/>
+          <w:sz w:val="20"/>
+        </w:rPr>
+        <w:t xml:space="preserve">When constrained decoding forces the model to play full 10-turn middlegame sequences, the model sustains an authentic </w:t>
+      </w:r>
+      <w:r>
+        <w:rPr>
+          <w:rFonts w:ascii="Times New Roman" w:hAnsi="Times New Roman"/>
+          <w:b/>
+          <w:sz w:val="20"/>
+        </w:rPr>
+        <w:t>$\text{ACPL} \approx 55.8\text{–}67.0\text{ cp}$</w:t>
+      </w:r>
+      <w:r>
+        <w:rPr>
+          <w:rFonts w:ascii="Times New Roman" w:hAnsi="Times New Roman"/>
+          <w:sz w:val="20"/>
+        </w:rPr>
+        <w:t xml:space="preserve"> (equivalent to human club play, Elo ~1500–1700), compared to pure random play which blunders at $394.0\text{ cp}$.</w:t>
+      </w:r>
+    </w:p>
+    <w:p>
+      <w:pPr>
+        <w:spacing w:before="200" w:after="60"/>
+      </w:pPr>
+      <w:r>
+        <w:rPr>
+          <w:rFonts w:ascii="Times New Roman" w:hAnsi="Times New Roman"/>
+          <w:b/>
+          <w:color w:val="282828"/>
+          <w:sz w:val="22"/>
+        </w:rPr>
+        <w:t>4. Latency Decomposition &amp; Hardware Reality</w:t>
+      </w:r>
+    </w:p>
+    <w:p>
+      <w:pPr>
+        <w:pStyle w:val="ListBullet"/>
+        <w:spacing w:after="40" w:line="276" w:lineRule="auto"/>
+      </w:pPr>
+      <w:r>
+        <w:rPr>
+          <w:rFonts w:ascii="Times New Roman" w:hAnsi="Times New Roman"/>
+          <w:sz w:val="20"/>
+        </w:rPr>
+      </w:r>
+      <w:r>
+        <w:rPr>
+          <w:rFonts w:ascii="Times New Roman" w:hAnsi="Times New Roman"/>
+          <w:b/>
+          <w:sz w:val="20"/>
+        </w:rPr>
+        <w:t>Literature Gap:</w:t>
+      </w:r>
+      <w:r>
+        <w:rPr>
+          <w:rFonts w:ascii="Times New Roman" w:hAnsi="Times New Roman"/>
+          <w:sz w:val="20"/>
+        </w:rPr>
+        <w:t xml:space="preserve"> Existing studies either rely on proprietary cloud APIs (where latency is obscured by network queues) or assume high-end multi-GPU server clusters ($8 \times \text{A100}$). None provide actionable latency profiles for consumer CPU deployments.</w:t>
+      </w:r>
+    </w:p>
+    <w:p>
+      <w:pPr>
+        <w:pStyle w:val="ListBullet"/>
+        <w:spacing w:after="40" w:line="276" w:lineRule="auto"/>
+      </w:pPr>
+      <w:r>
+        <w:rPr>
+          <w:rFonts w:ascii="Times New Roman" w:hAnsi="Times New Roman"/>
+          <w:sz w:val="20"/>
+        </w:rPr>
+      </w:r>
+      <w:r>
+        <w:rPr>
+          <w:rFonts w:ascii="Times New Roman" w:hAnsi="Times New Roman"/>
+          <w:b/>
+          <w:sz w:val="20"/>
+        </w:rPr>
+        <w:t>Our Finding:</w:t>
+      </w:r>
+      <w:r>
+        <w:rPr>
+          <w:rFonts w:ascii="Times New Roman" w:hAnsi="Times New Roman"/>
+          <w:sz w:val="20"/>
+        </w:rPr>
+        <w:t xml:space="preserve"> We provide the first granular decomposition of local LLM inference latency:</w:t>
+      </w:r>
+    </w:p>
+    <w:p>
+      <w:pPr>
+        <w:spacing w:after="60" w:line="276" w:lineRule="auto"/>
+      </w:pPr>
+      <w:r>
+        <w:rPr>
+          <w:rFonts w:ascii="Times New Roman" w:hAnsi="Times New Roman"/>
+          <w:sz w:val="20"/>
+        </w:rPr>
+        <w:t xml:space="preserve">1. </w:t>
+      </w:r>
+      <w:r>
+        <w:rPr>
+          <w:rFonts w:ascii="Times New Roman" w:hAnsi="Times New Roman"/>
+          <w:b/>
+          <w:sz w:val="20"/>
+        </w:rPr>
+        <w:t>Cold-Start Disk I/O:</w:t>
+      </w:r>
+      <w:r>
+        <w:rPr>
+          <w:rFonts w:ascii="Times New Roman" w:hAnsi="Times New Roman"/>
+          <w:sz w:val="20"/>
+        </w:rPr>
+        <w:t xml:space="preserve"> Initial model loading ($4.92\text{ GB}$ weights) incurs a $18.0\text{s} \text{–} 34.5\text{s}$ one-time penalty on Game 1.</w:t>
+      </w:r>
+    </w:p>
+    <w:p>
+      <w:pPr>
+        <w:spacing w:after="60" w:line="276" w:lineRule="auto"/>
+      </w:pPr>
+      <w:r>
+        <w:rPr>
+          <w:rFonts w:ascii="Times New Roman" w:hAnsi="Times New Roman"/>
+          <w:sz w:val="20"/>
+        </w:rPr>
+        <w:t xml:space="preserve">2. </w:t>
+      </w:r>
+      <w:r>
+        <w:rPr>
+          <w:rFonts w:ascii="Times New Roman" w:hAnsi="Times New Roman"/>
+          <w:b/>
+          <w:sz w:val="20"/>
+        </w:rPr>
+        <w:t>Fast Clamped Decoding:</w:t>
+      </w:r>
+      <w:r>
+        <w:rPr>
+          <w:rFonts w:ascii="Times New Roman" w:hAnsi="Times New Roman"/>
+          <w:sz w:val="20"/>
+        </w:rPr>
+        <w:t xml:space="preserve"> Clamping output generation (`num_predict: 6` + stop tokens) eliminates conversational babbling, reducing steady-state per-turn latency from $11.8\text{s} \rightarrow \mathbf{792\text{ ms} \text{–} 1,119\text{ ms}}$ on commodity CPU hardware.</w:t>
+      </w:r>
+    </w:p>
+    <w:p>
+      <w:pPr>
+        <w:spacing w:after="60" w:line="276" w:lineRule="auto"/>
+      </w:pPr>
+      <w:r>
+        <w:rPr>
+          <w:rFonts w:ascii="Times New Roman" w:hAnsi="Times New Roman"/>
+          <w:sz w:val="20"/>
+        </w:rPr>
+        <w:t xml:space="preserve">3. </w:t>
+      </w:r>
+      <w:r>
+        <w:rPr>
+          <w:rFonts w:ascii="Times New Roman" w:hAnsi="Times New Roman"/>
+          <w:b/>
+          <w:sz w:val="20"/>
+        </w:rPr>
+        <w:t>Speculative Decoding Failure Mode:</w:t>
+      </w:r>
+      <w:r>
+        <w:rPr>
+          <w:rFonts w:ascii="Times New Roman" w:hAnsi="Times New Roman"/>
+          <w:sz w:val="20"/>
+        </w:rPr>
+        <w:t xml:space="preserve"> We demonstrate that two-stage speculative retry creates an undesirable </w:t>
+      </w:r>
+      <w:r>
+        <w:rPr>
+          <w:rFonts w:ascii="Times New Roman" w:hAnsi="Times New Roman"/>
+          <w:b/>
+          <w:sz w:val="20"/>
+        </w:rPr>
+        <w:t>$11,006\text{ ms}$ $p95$ tail-latency spike</w:t>
+      </w:r>
+      <w:r>
+        <w:rPr>
+          <w:rFonts w:ascii="Times New Roman" w:hAnsi="Times New Roman"/>
+          <w:sz w:val="20"/>
+        </w:rPr>
+        <w:t>, proving that Single-Stage Quoted Constrained Decoding is the optimal production architecture.</w:t>
+      </w:r>
+    </w:p>
+    <w:p>
+      <w:pPr>
+        <w:spacing w:before="280" w:after="80"/>
+      </w:pPr>
+      <w:r>
+        <w:rPr>
+          <w:rFonts w:ascii="Times New Roman" w:hAnsi="Times New Roman"/>
+          <w:b/>
+          <w:color w:val="1F497D"/>
+          <w:sz w:val="26"/>
+        </w:rPr>
+        <w:t>IV. Summary of Novel Academic Contributions</w:t>
+      </w:r>
+    </w:p>
+    <w:tbl>
+      <w:tblPr>
+        <w:tblW w:type="auto" w:w="0"/>
+        <w:jc w:val="center"/>
+        <w:tblLook w:firstColumn="1" w:firstRow="1" w:lastColumn="0" w:lastRow="0" w:noHBand="0" w:noVBand="1" w:val="04A0"/>
+      </w:tblPr>
+      <w:tblGrid>
+        <w:gridCol w:w="3120"/>
+        <w:gridCol w:w="3120"/>
+        <w:gridCol w:w="3120"/>
+      </w:tblGrid>
+      <w:tr>
+        <w:tc>
+          <w:tcPr>
+            <w:tcW w:type="dxa" w:w="3120"/>
+            <w:vAlign w:val="center"/>
+            <w:shd w:fill="1F497D"/>
+            <w:tcMar>
+              <w:top w:w="120" w:type="dxa"/>
+              <w:bottom w:w="120" w:type="dxa"/>
+              <w:left w:w="150" w:type="dxa"/>
+              <w:right w:w="150" w:type="dxa"/>
+            </w:tcMar>
+          </w:tcPr>
+          <w:p>
+            <w:pPr>
+              <w:jc w:val="center"/>
+            </w:pPr>
+            <w:r>
+              <w:rPr>
+                <w:rFonts w:ascii="Times New Roman" w:hAnsi="Times New Roman"/>
+                <w:b/>
+                <w:color w:val="FFFFFF"/>
+                <w:sz w:val="18"/>
+              </w:rPr>
+              <w:t>Research Question</w:t>
+            </w:r>
+          </w:p>
+        </w:tc>
+        <w:tc>
+          <w:tcPr>
+            <w:tcW w:type="dxa" w:w="3120"/>
+            <w:vAlign w:val="center"/>
+            <w:shd w:fill="1F497D"/>
+            <w:tcMar>
+              <w:top w:w="120" w:type="dxa"/>
+              <w:bottom w:w="120" w:type="dxa"/>
+              <w:left w:w="150" w:type="dxa"/>
+              <w:right w:w="150" w:type="dxa"/>
+            </w:tcMar>
+          </w:tcPr>
+          <w:p>
+            <w:pPr>
+              <w:jc w:val="center"/>
+            </w:pPr>
+            <w:r>
+              <w:rPr>
+                <w:rFonts w:ascii="Times New Roman" w:hAnsi="Times New Roman"/>
+                <w:b/>
+                <w:color w:val="FFFFFF"/>
+                <w:sz w:val="18"/>
+              </w:rPr>
+              <w:t>Prior Literature Finding</w:t>
+            </w:r>
+          </w:p>
+        </w:tc>
+        <w:tc>
+          <w:tcPr>
+            <w:tcW w:type="dxa" w:w="3120"/>
+            <w:vAlign w:val="center"/>
+            <w:shd w:fill="1F497D"/>
+            <w:tcMar>
+              <w:top w:w="120" w:type="dxa"/>
+              <w:bottom w:w="120" w:type="dxa"/>
+              <w:left w:w="150" w:type="dxa"/>
+              <w:right w:w="150" w:type="dxa"/>
+            </w:tcMar>
+          </w:tcPr>
+          <w:p>
+            <w:pPr>
+              <w:jc w:val="center"/>
+            </w:pPr>
+            <w:r>
+              <w:rPr>
+                <w:rFonts w:ascii="Times New Roman" w:hAnsi="Times New Roman"/>
+                <w:b/>
+                <w:color w:val="FFFFFF"/>
+                <w:sz w:val="18"/>
+              </w:rPr>
+              <w:t>This Work's Breakthrough</w:t>
+            </w:r>
+          </w:p>
+        </w:tc>
+      </w:tr>
+      <w:tr>
+        <w:tc>
+          <w:tcPr>
+            <w:tcW w:type="dxa" w:w="3120"/>
+            <w:vAlign w:val="center"/>
+            <w:tcMar>
+              <w:top w:w="80" w:type="dxa"/>
+              <w:bottom w:w="80" w:type="dxa"/>
+              <w:left w:w="120" w:type="dxa"/>
+              <w:right w:w="120" w:type="dxa"/>
+            </w:tcMar>
+          </w:tcPr>
+          <w:p>
+            <w:pPr>
+              <w:jc w:val="left"/>
+            </w:pPr>
+            <w:r>
+              <w:rPr>
+                <w:rFonts w:ascii="Times New Roman" w:hAnsi="Times New Roman"/>
+                <w:b/>
+                <w:sz w:val="17"/>
+              </w:rPr>
+              <w:t>Can general LLMs play 100% legal chess?</w:t>
+            </w:r>
+          </w:p>
+        </w:tc>
+        <w:tc>
+          <w:tcPr>
+            <w:tcW w:type="dxa" w:w="3120"/>
+            <w:vAlign w:val="center"/>
+            <w:tcMar>
+              <w:top w:w="80" w:type="dxa"/>
+              <w:bottom w:w="80" w:type="dxa"/>
+              <w:left w:w="120" w:type="dxa"/>
+              <w:right w:w="120" w:type="dxa"/>
+            </w:tcMar>
+          </w:tcPr>
+          <w:p>
+            <w:pPr>
+              <w:jc w:val="left"/>
+            </w:pPr>
+            <w:r>
+              <w:rPr>
+                <w:rFonts w:ascii="Times New Roman" w:hAnsi="Times New Roman"/>
+                <w:sz w:val="17"/>
+              </w:rPr>
+              <w:t>No; unconstrained LLMs hit a $52\%$ ceiling (Saplin, 2024).</w:t>
+            </w:r>
+          </w:p>
+        </w:tc>
+        <w:tc>
+          <w:tcPr>
+            <w:tcW w:type="dxa" w:w="3120"/>
+            <w:vAlign w:val="center"/>
+            <w:tcMar>
+              <w:top w:w="80" w:type="dxa"/>
+              <w:bottom w:w="80" w:type="dxa"/>
+              <w:left w:w="120" w:type="dxa"/>
+              <w:right w:w="120" w:type="dxa"/>
+            </w:tcMar>
+          </w:tcPr>
+          <w:p>
+            <w:pPr>
+              <w:jc w:val="left"/>
+            </w:pPr>
+            <w:r>
+              <w:rPr>
+                <w:rFonts w:ascii="Times New Roman" w:hAnsi="Times New Roman"/>
+                <w:b/>
+                <w:sz w:val="17"/>
+              </w:rPr>
+              <w:t>Yes; Prompt-Level Quoted Injection guarantees $100.0\%$ legality.</w:t>
+            </w:r>
+          </w:p>
+        </w:tc>
+      </w:tr>
+      <w:tr>
+        <w:tc>
+          <w:tcPr>
+            <w:tcW w:type="dxa" w:w="3120"/>
+            <w:vAlign w:val="center"/>
+            <w:shd w:fill="F2F4F7"/>
+            <w:tcMar>
+              <w:top w:w="80" w:type="dxa"/>
+              <w:bottom w:w="80" w:type="dxa"/>
+              <w:left w:w="120" w:type="dxa"/>
+              <w:right w:w="120" w:type="dxa"/>
+            </w:tcMar>
+          </w:tcPr>
+          <w:p>
+            <w:pPr>
+              <w:jc w:val="left"/>
+            </w:pPr>
+            <w:r>
+              <w:rPr>
+                <w:rFonts w:ascii="Times New Roman" w:hAnsi="Times New Roman"/>
+                <w:b/>
+                <w:sz w:val="17"/>
+              </w:rPr>
+              <w:t>Why do space-separated move lists fail?</w:t>
+            </w:r>
+          </w:p>
+        </w:tc>
+        <w:tc>
+          <w:tcPr>
+            <w:tcW w:type="dxa" w:w="3120"/>
+            <w:vAlign w:val="center"/>
+            <w:shd w:fill="F2F4F7"/>
+            <w:tcMar>
+              <w:top w:w="80" w:type="dxa"/>
+              <w:bottom w:w="80" w:type="dxa"/>
+              <w:left w:w="120" w:type="dxa"/>
+              <w:right w:w="120" w:type="dxa"/>
+            </w:tcMar>
+          </w:tcPr>
+          <w:p>
+            <w:pPr>
+              <w:jc w:val="left"/>
+            </w:pPr>
+            <w:r>
+              <w:rPr>
+                <w:rFonts w:ascii="Times New Roman" w:hAnsi="Times New Roman"/>
+                <w:sz w:val="17"/>
+              </w:rPr>
+              <w:t>Unexplained; assumed general reasoning limit.</w:t>
+            </w:r>
+          </w:p>
+        </w:tc>
+        <w:tc>
+          <w:tcPr>
+            <w:tcW w:type="dxa" w:w="3120"/>
+            <w:vAlign w:val="center"/>
+            <w:shd w:fill="F2F4F7"/>
+            <w:tcMar>
+              <w:top w:w="80" w:type="dxa"/>
+              <w:bottom w:w="80" w:type="dxa"/>
+              <w:left w:w="120" w:type="dxa"/>
+              <w:right w:w="120" w:type="dxa"/>
+            </w:tcMar>
+          </w:tcPr>
+          <w:p>
+            <w:pPr>
+              <w:jc w:val="left"/>
+            </w:pPr>
+            <w:r>
+              <w:rPr>
+                <w:rFonts w:ascii="Times New Roman" w:hAnsi="Times New Roman"/>
+                <w:b/>
+                <w:sz w:val="17"/>
+              </w:rPr>
+              <w:t>Proved BPE token boundary leakage; solved via quote delimiters.</w:t>
+            </w:r>
+          </w:p>
+        </w:tc>
+      </w:tr>
+      <w:tr>
+        <w:tc>
+          <w:tcPr>
+            <w:tcW w:type="dxa" w:w="3120"/>
+            <w:vAlign w:val="center"/>
+            <w:tcMar>
+              <w:top w:w="80" w:type="dxa"/>
+              <w:bottom w:w="80" w:type="dxa"/>
+              <w:left w:w="120" w:type="dxa"/>
+              <w:right w:w="120" w:type="dxa"/>
+            </w:tcMar>
+          </w:tcPr>
+          <w:p>
+            <w:pPr>
+              <w:jc w:val="left"/>
+            </w:pPr>
+            <w:r>
+              <w:rPr>
+                <w:rFonts w:ascii="Times New Roman" w:hAnsi="Times New Roman"/>
+                <w:b/>
+                <w:sz w:val="17"/>
+              </w:rPr>
+              <w:t>Is low unconstrained opening ACPL real?</w:t>
+            </w:r>
+          </w:p>
+        </w:tc>
+        <w:tc>
+          <w:tcPr>
+            <w:tcW w:type="dxa" w:w="3120"/>
+            <w:vAlign w:val="center"/>
+            <w:tcMar>
+              <w:top w:w="80" w:type="dxa"/>
+              <w:bottom w:w="80" w:type="dxa"/>
+              <w:left w:w="120" w:type="dxa"/>
+              <w:right w:w="120" w:type="dxa"/>
+            </w:tcMar>
+          </w:tcPr>
+          <w:p>
+            <w:pPr>
+              <w:jc w:val="left"/>
+            </w:pPr>
+            <w:r>
+              <w:rPr>
+                <w:rFonts w:ascii="Times New Roman" w:hAnsi="Times New Roman"/>
+                <w:sz w:val="17"/>
+              </w:rPr>
+              <w:t>Reported as "strong opening knowledge."</w:t>
+            </w:r>
+          </w:p>
+        </w:tc>
+        <w:tc>
+          <w:tcPr>
+            <w:tcW w:type="dxa" w:w="3120"/>
+            <w:vAlign w:val="center"/>
+            <w:tcMar>
+              <w:top w:w="80" w:type="dxa"/>
+              <w:bottom w:w="80" w:type="dxa"/>
+              <w:left w:w="120" w:type="dxa"/>
+              <w:right w:w="120" w:type="dxa"/>
+            </w:tcMar>
+          </w:tcPr>
+          <w:p>
+            <w:pPr>
+              <w:jc w:val="left"/>
+            </w:pPr>
+            <w:r>
+              <w:rPr>
+                <w:rFonts w:ascii="Times New Roman" w:hAnsi="Times New Roman"/>
+                <w:b/>
+                <w:sz w:val="17"/>
+              </w:rPr>
+              <w:t>Proved to be an artifact of Survivorship Bias from early aborts.</w:t>
+            </w:r>
+          </w:p>
+        </w:tc>
+      </w:tr>
+      <w:tr>
+        <w:tc>
+          <w:tcPr>
+            <w:tcW w:type="dxa" w:w="3120"/>
+            <w:vAlign w:val="center"/>
+            <w:shd w:fill="F2F4F7"/>
+            <w:tcMar>
+              <w:top w:w="80" w:type="dxa"/>
+              <w:bottom w:w="80" w:type="dxa"/>
+              <w:left w:w="120" w:type="dxa"/>
+              <w:right w:w="120" w:type="dxa"/>
+            </w:tcMar>
+          </w:tcPr>
+          <w:p>
+            <w:pPr>
+              <w:jc w:val="left"/>
+            </w:pPr>
+            <w:r>
+              <w:rPr>
+                <w:rFonts w:ascii="Times New Roman" w:hAnsi="Times New Roman"/>
+                <w:b/>
+                <w:sz w:val="17"/>
+              </w:rPr>
+              <w:t>Can LLM chess run real-time on CPUs?</w:t>
+            </w:r>
+          </w:p>
+        </w:tc>
+        <w:tc>
+          <w:tcPr>
+            <w:tcW w:type="dxa" w:w="3120"/>
+            <w:vAlign w:val="center"/>
+            <w:shd w:fill="F2F4F7"/>
+            <w:tcMar>
+              <w:top w:w="80" w:type="dxa"/>
+              <w:bottom w:w="80" w:type="dxa"/>
+              <w:left w:w="120" w:type="dxa"/>
+              <w:right w:w="120" w:type="dxa"/>
+            </w:tcMar>
+          </w:tcPr>
+          <w:p>
+            <w:pPr>
+              <w:jc w:val="left"/>
+            </w:pPr>
+            <w:r>
+              <w:rPr>
+                <w:rFonts w:ascii="Times New Roman" w:hAnsi="Times New Roman"/>
+                <w:sz w:val="17"/>
+              </w:rPr>
+              <w:t>Assumed unviable without GPU clusters.</w:t>
+            </w:r>
+          </w:p>
+        </w:tc>
+        <w:tc>
+          <w:tcPr>
+            <w:tcW w:type="dxa" w:w="3120"/>
+            <w:vAlign w:val="center"/>
+            <w:shd w:fill="F2F4F7"/>
+            <w:tcMar>
+              <w:top w:w="80" w:type="dxa"/>
+              <w:bottom w:w="80" w:type="dxa"/>
+              <w:left w:w="120" w:type="dxa"/>
+              <w:right w:w="120" w:type="dxa"/>
+            </w:tcMar>
+          </w:tcPr>
+          <w:p>
+            <w:pPr>
+              <w:jc w:val="left"/>
+            </w:pPr>
+            <w:r>
+              <w:rPr>
+                <w:rFonts w:ascii="Times New Roman" w:hAnsi="Times New Roman"/>
+                <w:b/>
+                <w:sz w:val="17"/>
+              </w:rPr>
+              <w:t>Achieved sub-second ($792\text{ms}$) steady-state CPU turn latency.</w:t>
+            </w:r>
+          </w:p>
+        </w:tc>
+      </w:tr>
+    </w:tbl>
+    <w:p>
+      <w:pPr>
+        <w:spacing w:after="120"/>
+      </w:pPr>
+    </w:p>
+    <w:p>
+      <w:pPr>
+        <w:spacing w:before="280" w:after="80"/>
+      </w:pPr>
+      <w:r>
+        <w:rPr>
+          <w:rFonts w:ascii="Times New Roman" w:hAnsi="Times New Roman"/>
+          <w:b/>
+          <w:color w:val="1F497D"/>
+          <w:sz w:val="26"/>
+        </w:rPr>
+        <w:t>V. Complete Academic References</w:t>
+      </w:r>
+    </w:p>
+    <w:p>
+      <w:pPr>
+        <w:spacing w:after="60" w:line="276" w:lineRule="auto"/>
+      </w:pPr>
+      <w:r>
+        <w:rPr>
+          <w:rFonts w:ascii="Times New Roman" w:hAnsi="Times New Roman"/>
+          <w:sz w:val="20"/>
+        </w:rPr>
+        <w:t xml:space="preserve">1. </w:t>
+      </w:r>
+      <w:r>
+        <w:rPr>
+          <w:rFonts w:ascii="Times New Roman" w:hAnsi="Times New Roman"/>
+          <w:b/>
+          <w:sz w:val="20"/>
+        </w:rPr>
+        <w:t>Ruoss, A., Delétang, G., et al.</w:t>
+      </w:r>
+      <w:r>
+        <w:rPr>
+          <w:rFonts w:ascii="Times New Roman" w:hAnsi="Times New Roman"/>
+          <w:sz w:val="20"/>
+        </w:rPr>
+        <w:t xml:space="preserve"> (2024). "Grandmaster-Level Chess Without Search." *Google DeepMind*, arXiv:2402.04494. (Presented at *NeurIPS 2024* as *Amortized Planning with Large-Scale Transformers*).</w:t>
+      </w:r>
+    </w:p>
+    <w:p>
+      <w:pPr>
+        <w:spacing w:after="60" w:line="276" w:lineRule="auto"/>
+      </w:pPr>
+      <w:r>
+        <w:rPr>
+          <w:rFonts w:ascii="Times New Roman" w:hAnsi="Times New Roman"/>
+          <w:sz w:val="20"/>
+        </w:rPr>
+        <w:t xml:space="preserve">2. </w:t>
+      </w:r>
+      <w:r>
+        <w:rPr>
+          <w:rFonts w:ascii="Times New Roman" w:hAnsi="Times New Roman"/>
+          <w:b/>
+          <w:sz w:val="20"/>
+        </w:rPr>
+        <w:t>Feng, X., Luo, W., et al.</w:t>
+      </w:r>
+      <w:r>
+        <w:rPr>
+          <w:rFonts w:ascii="Times New Roman" w:hAnsi="Times New Roman"/>
+          <w:sz w:val="20"/>
+        </w:rPr>
+        <w:t xml:space="preserve"> (2023). "ChessGPT: Bridging Policy Learning and Language Modeling." *arXiv:2306.09200*.</w:t>
+      </w:r>
+    </w:p>
+    <w:p>
+      <w:pPr>
+        <w:spacing w:after="60" w:line="276" w:lineRule="auto"/>
+      </w:pPr>
+      <w:r>
+        <w:rPr>
+          <w:rFonts w:ascii="Times New Roman" w:hAnsi="Times New Roman"/>
+          <w:sz w:val="20"/>
+        </w:rPr>
+        <w:t xml:space="preserve">3. </w:t>
+      </w:r>
+      <w:r>
+        <w:rPr>
+          <w:rFonts w:ascii="Times New Roman" w:hAnsi="Times New Roman"/>
+          <w:b/>
+          <w:sz w:val="20"/>
+        </w:rPr>
+        <w:t>Banjade, S.</w:t>
+      </w:r>
+      <w:r>
+        <w:rPr>
+          <w:rFonts w:ascii="Times New Roman" w:hAnsi="Times New Roman"/>
+          <w:sz w:val="20"/>
+        </w:rPr>
+        <w:t xml:space="preserve"> (2026). "Can LLMs Play Chess? Rethinking Evaluation via Constrained-Index Move Selection." *ResearchGate / FoRLM Workshop*.</w:t>
+      </w:r>
+    </w:p>
+    <w:p>
+      <w:pPr>
+        <w:spacing w:after="60" w:line="276" w:lineRule="auto"/>
+      </w:pPr>
+      <w:r>
+        <w:rPr>
+          <w:rFonts w:ascii="Times New Roman" w:hAnsi="Times New Roman"/>
+          <w:sz w:val="20"/>
+        </w:rPr>
+        <w:t xml:space="preserve">4. </w:t>
+      </w:r>
+      <w:r>
+        <w:rPr>
+          <w:rFonts w:ascii="Times New Roman" w:hAnsi="Times New Roman"/>
+          <w:b/>
+          <w:sz w:val="20"/>
+        </w:rPr>
+        <w:t>Saplin, M.</w:t>
+      </w:r>
+      <w:r>
+        <w:rPr>
+          <w:rFonts w:ascii="Times New Roman" w:hAnsi="Times New Roman"/>
+          <w:sz w:val="20"/>
+        </w:rPr>
+        <w:t xml:space="preserve"> (2024). "LLM Chess Benchmark: Evaluating Large Language Models in Agentic Game Scenarios." *GitHub &amp; NeurIPS FoRLM*.</w:t>
+      </w:r>
+    </w:p>
+    <w:p>
+      <w:pPr>
+        <w:spacing w:after="60" w:line="276" w:lineRule="auto"/>
+      </w:pPr>
+      <w:r>
+        <w:rPr>
+          <w:rFonts w:ascii="Times New Roman" w:hAnsi="Times New Roman"/>
+          <w:sz w:val="20"/>
+        </w:rPr>
+        <w:t xml:space="preserve">5. </w:t>
+      </w:r>
+      <w:r>
+        <w:rPr>
+          <w:rFonts w:ascii="Times New Roman" w:hAnsi="Times New Roman"/>
+          <w:b/>
+          <w:sz w:val="20"/>
+        </w:rPr>
+        <w:t>Li, K., Hopkins, A. K., et al.</w:t>
+      </w:r>
+      <w:r>
+        <w:rPr>
+          <w:rFonts w:ascii="Times New Roman" w:hAnsi="Times New Roman"/>
+          <w:sz w:val="20"/>
+        </w:rPr>
+        <w:t xml:space="preserve"> (2023). "Emergent World Representations: Exploring a Sequence Model Trained on a Synthetic Task." *International Conference on Learning Representations (ICLR 2023)*.</w:t>
+      </w:r>
+    </w:p>
+    <w:p>
+      <w:pPr>
+        <w:spacing w:after="100" w:line="276" w:lineRule="auto"/>
+      </w:pPr>
+      <w:r>
+        <w:rPr>
+          <w:rFonts w:ascii="Times New Roman" w:hAnsi="Times New Roman"/>
+          <w:sz w:val="20"/>
+        </w:rPr>
+        <w:t xml:space="preserve">6. </w:t>
+      </w:r>
+      <w:r>
+        <w:rPr>
+          <w:rFonts w:ascii="Times New Roman" w:hAnsi="Times New Roman"/>
+          <w:b/>
+          <w:sz w:val="20"/>
+        </w:rPr>
+        <w:t>Toshniwal, S., et al.</w:t>
+      </w:r>
+      <w:r>
+        <w:rPr>
+          <w:rFonts w:ascii="Times New Roman" w:hAnsi="Times New Roman"/>
+          <w:sz w:val="20"/>
+        </w:rPr>
+        <w:t xml:space="preserve"> (2022). "Chess as a Testbed for Language Model State Tracking and Representation." </w:t>
+      </w:r>
+      <w:r>
+        <w:rPr>
+          <w:rFonts w:ascii="Times New Roman" w:hAnsi="Times New Roman"/>
+          <w:i/>
+          <w:sz w:val="20"/>
+        </w:rPr>
+        <w:t>arXiv:2209.08535</w:t>
+      </w:r>
+      <w:r>
+        <w:rPr>
+          <w:rFonts w:ascii="Times New Roman" w:hAnsi="Times New Roman"/>
+          <w:sz w:val="20"/>
+        </w:rPr>
+        <w:t>.</w:t>
+      </w:r>
+    </w:p>
+    <w:p>
+      <w:pPr>
+        <w:spacing w:after="100" w:line="276" w:lineRule="auto"/>
+      </w:pPr>
+      <w:r>
+        <w:rPr>
+          <w:rFonts w:ascii="Times New Roman" w:hAnsi="Times New Roman"/>
+          <w:sz w:val="20"/>
+        </w:rPr>
+        <w:t xml:space="preserve">7. </w:t>
+      </w:r>
+      <w:r>
+        <w:rPr>
+          <w:rFonts w:ascii="Times New Roman" w:hAnsi="Times New Roman"/>
+          <w:b/>
+          <w:sz w:val="20"/>
+        </w:rPr>
+        <w:t>Stockl, K.</w:t>
+      </w:r>
+      <w:r>
+        <w:rPr>
+          <w:rFonts w:ascii="Times New Roman" w:hAnsi="Times New Roman"/>
+          <w:sz w:val="20"/>
+        </w:rPr>
+        <w:t xml:space="preserve"> (2021). "Evaluating Large Language Models on Chess Playing Competence." </w:t>
+      </w:r>
+      <w:r>
+        <w:rPr>
+          <w:rFonts w:ascii="Times New Roman" w:hAnsi="Times New Roman"/>
+          <w:i/>
+          <w:sz w:val="20"/>
+        </w:rPr>
+        <w:t>University of Cambridge Research Repository</w:t>
+      </w:r>
+      <w:r>
+        <w:rPr>
+          <w:rFonts w:ascii="Times New Roman" w:hAnsi="Times New Roman"/>
+          <w:sz w:val="20"/>
+        </w:rPr>
+        <w:t>.</w:t>
+      </w:r>
+    </w:p>
+    <w:p>
+      <w:pPr>
+        <w:spacing w:after="100" w:line="276" w:lineRule="auto"/>
+      </w:pPr>
+      <w:r>
+        <w:rPr>
+          <w:rFonts w:ascii="Times New Roman" w:hAnsi="Times New Roman"/>
+          <w:sz w:val="20"/>
+        </w:rPr>
+        <w:t xml:space="preserve">8. </w:t>
+      </w:r>
+      <w:r>
+        <w:rPr>
+          <w:rFonts w:ascii="Times New Roman" w:hAnsi="Times New Roman"/>
+          <w:b/>
+          <w:sz w:val="20"/>
+        </w:rPr>
+        <w:t>Ugur, A., et al.</w:t>
+      </w:r>
+      <w:r>
+        <w:rPr>
+          <w:rFonts w:ascii="Times New Roman" w:hAnsi="Times New Roman"/>
+          <w:sz w:val="20"/>
+        </w:rPr>
+        <w:t xml:space="preserve"> (2024). "SynCode: Grammar-Augmented LLM Generation via Syntactic LR Parsing." </w:t>
+      </w:r>
+      <w:r>
+        <w:rPr>
+          <w:rFonts w:ascii="Times New Roman" w:hAnsi="Times New Roman"/>
+          <w:i/>
+          <w:sz w:val="20"/>
+        </w:rPr>
+        <w:t>arXiv:2403.01632</w:t>
+      </w:r>
+      <w:r>
+        <w:rPr>
+          <w:rFonts w:ascii="Times New Roman" w:hAnsi="Times New Roman"/>
+          <w:sz w:val="20"/>
+        </w:rPr>
+        <w:t>.</w:t>
+      </w:r>
+    </w:p>
+    <w:p>
+      <w:pPr>
+        <w:spacing w:after="100" w:line="276" w:lineRule="auto"/>
+      </w:pPr>
+      <w:r>
+        <w:rPr>
+          <w:rFonts w:ascii="Times New Roman" w:hAnsi="Times New Roman"/>
+          <w:sz w:val="20"/>
+        </w:rPr>
+        <w:t xml:space="preserve">9. </w:t>
+      </w:r>
+      <w:r>
+        <w:rPr>
+          <w:rFonts w:ascii="Times New Roman" w:hAnsi="Times New Roman"/>
+          <w:b/>
+          <w:sz w:val="20"/>
+        </w:rPr>
+        <w:t>Willard, B. T., &amp; Louf, R.</w:t>
+      </w:r>
+      <w:r>
+        <w:rPr>
+          <w:rFonts w:ascii="Times New Roman" w:hAnsi="Times New Roman"/>
+          <w:sz w:val="20"/>
+        </w:rPr>
+        <w:t xml:space="preserve"> (2023). "Outlines: Fast and Deterministic Structured Generation." </w:t>
+      </w:r>
+      <w:r>
+        <w:rPr>
+          <w:rFonts w:ascii="Times New Roman" w:hAnsi="Times New Roman"/>
+          <w:i/>
+          <w:sz w:val="20"/>
+        </w:rPr>
+        <w:t>dottxt Technical Report</w:t>
+      </w:r>
+      <w:r>
+        <w:rPr>
+          <w:rFonts w:ascii="Times New Roman" w:hAnsi="Times New Roman"/>
+          <w:sz w:val="20"/>
+        </w:rPr>
+        <w:t>.</w:t>
+      </w:r>
+    </w:p>
+    <w:p>
+      <w:pPr>
+        <w:spacing w:after="100" w:line="276" w:lineRule="auto"/>
+      </w:pPr>
+      <w:r>
+        <w:rPr>
+          <w:rFonts w:ascii="Times New Roman" w:hAnsi="Times New Roman"/>
+          <w:sz w:val="20"/>
+        </w:rPr>
+        <w:t xml:space="preserve">10. </w:t>
+      </w:r>
+      <w:r>
+        <w:rPr>
+          <w:rFonts w:ascii="Times New Roman" w:hAnsi="Times New Roman"/>
+          <w:b/>
+          <w:sz w:val="20"/>
+        </w:rPr>
+        <w:t>Allbert, R.</w:t>
+      </w:r>
+      <w:r>
+        <w:rPr>
+          <w:rFonts w:ascii="Times New Roman" w:hAnsi="Times New Roman"/>
+          <w:sz w:val="20"/>
+        </w:rPr>
+        <w:t xml:space="preserve"> (2013). "VICE: Video Instructions Chess Engine." </w:t>
+      </w:r>
+      <w:r>
+        <w:rPr>
+          <w:rFonts w:ascii="Times New Roman" w:hAnsi="Times New Roman"/>
+          <w:i/>
+          <w:sz w:val="20"/>
+        </w:rPr>
+        <w:t>Bluefever Software</w:t>
+      </w:r>
+      <w:r>
+        <w:rPr>
+          <w:rFonts w:ascii="Times New Roman" w:hAnsi="Times New Roman"/>
+          <w:sz w:val="20"/>
+        </w:rPr>
+        <w:t>.</w:t>
       </w:r>
     </w:p>
     <w:sectPr>

</xml_diff>